<commit_message>
feat: template v2 - KCS tables and description loops parameterized
</commit_message>
<xml_diff>
--- a/apps/web/templates/operat-szablon.docx
+++ b/apps/web/templates/operat-szablon.docx
@@ -13827,7 +13827,7 @@
           <w:sz w:val="20"/>
           <w:szCs w:val="20"/>
         </w:rPr>
-        <w:t>12 061,94</w:t>
+        <w:t xml:space="preserve">{cena_min}</w:t>
       </w:r>
       <w:r>
         <w:rPr>
@@ -13851,7 +13851,7 @@
           <w:sz w:val="20"/>
           <w:szCs w:val="20"/>
         </w:rPr>
-        <w:t>14 852,90</w:t>
+        <w:t xml:space="preserve">{cena_max}</w:t>
       </w:r>
       <w:r>
         <w:rPr>
@@ -13884,7 +13884,7 @@
           <w:sz w:val="20"/>
           <w:szCs w:val="20"/>
         </w:rPr>
-        <w:t>13 123,60</w:t>
+        <w:t xml:space="preserve">{cena_sr}</w:t>
       </w:r>
       <w:r>
         <w:rPr>
@@ -15833,7 +15833,7 @@
       </w:tr>
       <w:tr>
         <w:trPr>
-          <w:trHeight w:val="269"/>
+          <w:trHeight w:val="256" w:hRule="atLeast"/>
         </w:trPr>
         <w:tc>
           <w:tcPr>
@@ -16132,7 +16132,7 @@
                 <w:sz w:val="18"/>
                 <w:szCs w:val="18"/>
               </w:rPr>
-              <w:t>12 061,94</w:t>
+              <w:t xml:space="preserve">{cena_min}</w:t>
             </w:r>
           </w:p>
         </w:tc>
@@ -16206,7 +16206,7 @@
                 <w:sz w:val="18"/>
                 <w:szCs w:val="18"/>
               </w:rPr>
-              <w:t>14 852,90</w:t>
+              <w:t xml:space="preserve">{cena_max}</w:t>
             </w:r>
           </w:p>
         </w:tc>
@@ -16280,7 +16280,7 @@
                 <w:sz w:val="18"/>
                 <w:szCs w:val="18"/>
               </w:rPr>
-              <w:t>13 123,60</w:t>
+              <w:t xml:space="preserve">{cena_sr}</w:t>
             </w:r>
           </w:p>
         </w:tc>
@@ -16337,7 +16337,7 @@
                 <w:sz w:val="18"/>
                 <w:szCs w:val="18"/>
               </w:rPr>
-              <w:t>0,380</w:t>
+              <w:t xml:space="preserve">{polozenie_sr}</w:t>
             </w:r>
           </w:p>
         </w:tc>
@@ -16440,7 +16440,7 @@
                 <w:sz w:val="18"/>
                 <w:szCs w:val="18"/>
               </w:rPr>
-              <w:t>0,9</w:t>
+              <w:t xml:space="preserve">{vmin}</w:t>
             </w:r>
             <w:r>
               <w:rPr>
@@ -16449,7 +16449,7 @@
                 <w:sz w:val="18"/>
                 <w:szCs w:val="18"/>
               </w:rPr>
-              <w:t>20</w:t>
+              <w:t/>
             </w:r>
           </w:p>
         </w:tc>
@@ -16552,7 +16552,7 @@
                 <w:sz w:val="18"/>
                 <w:szCs w:val="18"/>
               </w:rPr>
-              <w:t>1,132</w:t>
+              <w:t xml:space="preserve">{vmax}</w:t>
             </w:r>
           </w:p>
         </w:tc>
@@ -16688,7 +16688,12 @@
           <w:sz w:val="20"/>
           <w:szCs w:val="20"/>
         </w:rPr>
-        <w:t xml:space="preserve">Lokal mieszkalny położony jest pod adresem: {adres}.</w:t>
+        <w:t xml:space="preserve">Lokal mieszkalny położony jest w analizowanym obszarze rynku.</w:t>
+      </w:r>
+    </w:p>
+    <w:p>
+      <w:r>
+        <w:t xml:space="preserve">{#opis_cmax}</w:t>
       </w:r>
     </w:p>
     <w:p>
@@ -16711,7 +16716,74 @@
           <w:sz w:val="20"/>
           <w:szCs w:val="20"/>
         </w:rPr>
-        <w:t>standard wykończenia – wartość najwyższa cechy,</w:t>
+        <w:t xml:space="preserve">{.}</w:t>
+      </w:r>
+    </w:p>
+    <w:p>
+      <w:r>
+        <w:t xml:space="preserve">{/opis_cmax}</w:t>
+      </w:r>
+    </w:p>
+    <w:p>
+      <w:pPr>
+        <w:spacing w:line="276" w:lineRule="auto"/>
+        <w:ind w:left="727"/>
+        <w:jc w:val="both"/>
+        <w:rPr>
+          <w:rFonts w:ascii="Segoe UI" w:hAnsi="Segoe UI" w:cs="Segoe UI"/>
+          <w:sz w:val="20"/>
+          <w:szCs w:val="20"/>
+        </w:rPr>
+      </w:pPr>
+    </w:p>
+    <w:p>
+      <w:pPr>
+        <w:pStyle w:val="Tekstpodstawowy"/>
+        <w:spacing w:after="0" w:line="276" w:lineRule="auto"/>
+        <w:jc w:val="both"/>
+        <w:rPr>
+          <w:rFonts w:ascii="Segoe UI" w:hAnsi="Segoe UI" w:cs="Segoe UI"/>
+          <w:b/>
+          <w:bCs/>
+          <w:sz w:val="20"/>
+          <w:szCs w:val="20"/>
+          <w:u w:val="single"/>
+        </w:rPr>
+      </w:pPr>
+      <w:r>
+        <w:rPr>
+          <w:rFonts w:ascii="Segoe UI" w:hAnsi="Segoe UI" w:cs="Segoe UI"/>
+          <w:b/>
+          <w:bCs/>
+          <w:sz w:val="20"/>
+          <w:szCs w:val="20"/>
+          <w:u w:val="single"/>
+        </w:rPr>
+        <w:t>Opis lokalu o jednostkowej cenie najniższej w zbiorze lokali podobnych</w:t>
+      </w:r>
+    </w:p>
+    <w:p>
+      <w:pPr>
+        <w:spacing w:line="276" w:lineRule="auto"/>
+        <w:jc w:val="both"/>
+        <w:rPr>
+          <w:rFonts w:ascii="Segoe UI" w:hAnsi="Segoe UI" w:cs="Segoe UI"/>
+          <w:sz w:val="20"/>
+          <w:szCs w:val="20"/>
+        </w:rPr>
+      </w:pPr>
+      <w:r>
+        <w:rPr>
+          <w:rFonts w:ascii="Segoe UI" w:hAnsi="Segoe UI" w:cs="Segoe UI"/>
+          <w:sz w:val="20"/>
+          <w:szCs w:val="20"/>
+        </w:rPr>
+        <w:t xml:space="preserve">Lokal mieszkalny położony jest w analizowanym obszarze rynku.</w:t>
+      </w:r>
+    </w:p>
+    <w:p>
+      <w:r>
+        <w:t xml:space="preserve">{#opis_cmin}</w:t>
       </w:r>
     </w:p>
     <w:p>
@@ -16734,12 +16806,92 @@
           <w:sz w:val="20"/>
           <w:szCs w:val="20"/>
         </w:rPr>
-        <w:t>powierzchnia użytkowa – wartość najniższa cechy,</w:t>
-      </w:r>
-    </w:p>
-    <w:p>
-      <w:pPr>
-        <w:pStyle w:val="Akapitzlist"/>
+        <w:t xml:space="preserve">{.}</w:t>
+      </w:r>
+      <w:r>
+        <w:rPr>
+          <w:rFonts w:ascii="Segoe UI" w:hAnsi="Segoe UI" w:cs="Segoe UI"/>
+          <w:sz w:val="20"/>
+          <w:szCs w:val="20"/>
+        </w:rPr>
+        <w:t/>
+      </w:r>
+      <w:r>
+        <w:rPr>
+          <w:rFonts w:ascii="Segoe UI" w:hAnsi="Segoe UI" w:cs="Segoe UI"/>
+          <w:sz w:val="20"/>
+          <w:szCs w:val="20"/>
+        </w:rPr>
+        <w:t xml:space="preserve"/>
+      </w:r>
+    </w:p>
+    <w:p>
+      <w:r>
+        <w:t xml:space="preserve">{/opis_cmin}</w:t>
+      </w:r>
+    </w:p>
+    <w:p>
+      <w:pPr>
+        <w:spacing w:line="276" w:lineRule="auto"/>
+        <w:ind w:left="727"/>
+        <w:jc w:val="both"/>
+        <w:rPr>
+          <w:rFonts w:ascii="Segoe UI" w:hAnsi="Segoe UI" w:cs="Segoe UI"/>
+          <w:sz w:val="20"/>
+          <w:szCs w:val="20"/>
+        </w:rPr>
+      </w:pPr>
+    </w:p>
+    <w:p>
+      <w:pPr>
+        <w:spacing w:line="276" w:lineRule="auto"/>
+        <w:rPr>
+          <w:rFonts w:ascii="Segoe UI" w:hAnsi="Segoe UI" w:cs="Segoe UI"/>
+          <w:b/>
+          <w:bCs/>
+          <w:sz w:val="20"/>
+          <w:szCs w:val="20"/>
+          <w:u w:val="single"/>
+        </w:rPr>
+      </w:pPr>
+      <w:r>
+        <w:rPr>
+          <w:rFonts w:ascii="Segoe UI" w:hAnsi="Segoe UI" w:cs="Segoe UI"/>
+          <w:b/>
+          <w:bCs/>
+          <w:sz w:val="20"/>
+          <w:szCs w:val="20"/>
+          <w:u w:val="single"/>
+        </w:rPr>
+        <w:t>Opis lokalu będącego przedmiotem wyceny pod względem cech rynkowych</w:t>
+      </w:r>
+    </w:p>
+    <w:p>
+      <w:pPr>
+        <w:spacing w:line="276" w:lineRule="auto"/>
+        <w:jc w:val="both"/>
+        <w:rPr>
+          <w:rFonts w:ascii="Segoe UI" w:hAnsi="Segoe UI" w:cs="Segoe UI"/>
+          <w:sz w:val="20"/>
+          <w:szCs w:val="20"/>
+        </w:rPr>
+      </w:pPr>
+      <w:r>
+        <w:rPr>
+          <w:rFonts w:ascii="Segoe UI" w:hAnsi="Segoe UI" w:cs="Segoe UI"/>
+          <w:sz w:val="20"/>
+          <w:szCs w:val="20"/>
+        </w:rPr>
+        <w:t xml:space="preserve">Lokal mieszkalny położony jest w analizowanym obszarze rynku.</w:t>
+      </w:r>
+    </w:p>
+    <w:p>
+      <w:r>
+        <w:t xml:space="preserve">{#opis_przedmiot}</w:t>
+      </w:r>
+    </w:p>
+    <w:p>
+      <w:pPr>
         <w:numPr>
           <w:ilvl w:val="0"/>
           <w:numId w:val="14"/>
@@ -16758,512 +16910,12 @@
           <w:sz w:val="20"/>
           <w:szCs w:val="20"/>
         </w:rPr>
-        <w:t xml:space="preserve">położenie na piętrze – wartość </w:t>
-      </w:r>
-      <w:r>
-        <w:rPr>
-          <w:rFonts w:ascii="Segoe UI" w:hAnsi="Segoe UI" w:cs="Segoe UI"/>
-          <w:sz w:val="20"/>
-          <w:szCs w:val="20"/>
-        </w:rPr>
-        <w:t>pośrednia</w:t>
-      </w:r>
-      <w:r>
-        <w:rPr>
-          <w:rFonts w:ascii="Segoe UI" w:hAnsi="Segoe UI" w:cs="Segoe UI"/>
-          <w:sz w:val="20"/>
-          <w:szCs w:val="20"/>
-        </w:rPr>
-        <w:t xml:space="preserve"> cechy, </w:t>
-      </w:r>
-    </w:p>
-    <w:p>
-      <w:pPr>
-        <w:pStyle w:val="Akapitzlist"/>
-        <w:numPr>
-          <w:ilvl w:val="0"/>
-          <w:numId w:val="14"/>
-        </w:numPr>
-        <w:spacing w:line="276" w:lineRule="auto"/>
-        <w:jc w:val="both"/>
-        <w:rPr>
-          <w:rFonts w:ascii="Segoe UI" w:hAnsi="Segoe UI" w:cs="Segoe UI"/>
-          <w:sz w:val="20"/>
-          <w:szCs w:val="20"/>
-        </w:rPr>
-      </w:pPr>
-      <w:r>
-        <w:rPr>
-          <w:rFonts w:ascii="Segoe UI" w:hAnsi="Segoe UI" w:cs="Segoe UI"/>
-          <w:sz w:val="20"/>
-          <w:szCs w:val="20"/>
-        </w:rPr>
-        <w:t>dodatkowe</w:t>
-      </w:r>
-      <w:r>
-        <w:rPr>
-          <w:rFonts w:ascii="Segoe UI" w:hAnsi="Segoe UI" w:cs="Segoe UI"/>
-          <w:sz w:val="20"/>
-          <w:szCs w:val="20"/>
-        </w:rPr>
-        <w:t xml:space="preserve"> – wartość najwyższa cechy</w:t>
-      </w:r>
-      <w:r>
-        <w:rPr>
-          <w:rFonts w:ascii="Segoe UI" w:hAnsi="Segoe UI" w:cs="Segoe UI"/>
-          <w:sz w:val="20"/>
-          <w:szCs w:val="20"/>
-        </w:rPr>
-        <w:t>,</w:t>
-      </w:r>
-    </w:p>
-    <w:p>
-      <w:pPr>
-        <w:numPr>
-          <w:ilvl w:val="0"/>
-          <w:numId w:val="14"/>
-        </w:numPr>
-        <w:spacing w:line="276" w:lineRule="auto"/>
-        <w:jc w:val="both"/>
-        <w:rPr>
-          <w:rFonts w:ascii="Segoe UI" w:hAnsi="Segoe UI" w:cs="Segoe UI"/>
-          <w:sz w:val="20"/>
-          <w:szCs w:val="20"/>
-        </w:rPr>
-      </w:pPr>
-      <w:r>
-        <w:rPr>
-          <w:rFonts w:ascii="Segoe UI" w:hAnsi="Segoe UI" w:cs="Segoe UI"/>
-          <w:sz w:val="20"/>
-          <w:szCs w:val="20"/>
-        </w:rPr>
-        <w:t>lokalizacja szczegółowa – wartość najwyższa cechy</w:t>
-      </w:r>
-      <w:r>
-        <w:rPr>
-          <w:rFonts w:ascii="Segoe UI" w:hAnsi="Segoe UI" w:cs="Segoe UI"/>
-          <w:sz w:val="20"/>
-          <w:szCs w:val="20"/>
-        </w:rPr>
-        <w:t>.</w:t>
-      </w:r>
-      <w:r>
-        <w:rPr>
-          <w:rFonts w:ascii="Segoe UI" w:hAnsi="Segoe UI" w:cs="Segoe UI"/>
-          <w:sz w:val="20"/>
-          <w:szCs w:val="20"/>
-        </w:rPr>
-        <w:t xml:space="preserve"> </w:t>
-      </w:r>
-    </w:p>
-    <w:p>
-      <w:pPr>
-        <w:spacing w:line="276" w:lineRule="auto"/>
-        <w:ind w:left="727"/>
-        <w:jc w:val="both"/>
-        <w:rPr>
-          <w:rFonts w:ascii="Segoe UI" w:hAnsi="Segoe UI" w:cs="Segoe UI"/>
-          <w:sz w:val="20"/>
-          <w:szCs w:val="20"/>
-        </w:rPr>
-      </w:pPr>
-    </w:p>
-    <w:p>
-      <w:pPr>
-        <w:pStyle w:val="Tekstpodstawowy"/>
-        <w:spacing w:after="0" w:line="276" w:lineRule="auto"/>
-        <w:jc w:val="both"/>
-        <w:rPr>
-          <w:rFonts w:ascii="Segoe UI" w:hAnsi="Segoe UI" w:cs="Segoe UI"/>
-          <w:b/>
-          <w:bCs/>
-          <w:sz w:val="20"/>
-          <w:szCs w:val="20"/>
-          <w:u w:val="single"/>
-        </w:rPr>
-      </w:pPr>
-      <w:r>
-        <w:rPr>
-          <w:rFonts w:ascii="Segoe UI" w:hAnsi="Segoe UI" w:cs="Segoe UI"/>
-          <w:b/>
-          <w:bCs/>
-          <w:sz w:val="20"/>
-          <w:szCs w:val="20"/>
-          <w:u w:val="single"/>
-        </w:rPr>
-        <w:t>Opis lokalu o jednostkowej cenie najniższej w zbiorze lokali podobnych</w:t>
-      </w:r>
-    </w:p>
-    <w:p>
-      <w:pPr>
-        <w:spacing w:line="276" w:lineRule="auto"/>
-        <w:jc w:val="both"/>
-        <w:rPr>
-          <w:rFonts w:ascii="Segoe UI" w:hAnsi="Segoe UI" w:cs="Segoe UI"/>
-          <w:sz w:val="20"/>
-          <w:szCs w:val="20"/>
-        </w:rPr>
-      </w:pPr>
-      <w:r>
-        <w:rPr>
-          <w:rFonts w:ascii="Segoe UI" w:hAnsi="Segoe UI" w:cs="Segoe UI"/>
-          <w:sz w:val="20"/>
-          <w:szCs w:val="20"/>
-        </w:rPr>
-        <w:t xml:space="preserve">Lokal mieszkalny położony jest pod adresem: {adres}.</w:t>
-      </w:r>
-    </w:p>
-    <w:p>
-      <w:pPr>
-        <w:numPr>
-          <w:ilvl w:val="0"/>
-          <w:numId w:val="14"/>
-        </w:numPr>
-        <w:spacing w:line="276" w:lineRule="auto"/>
-        <w:jc w:val="both"/>
-        <w:rPr>
-          <w:rFonts w:ascii="Segoe UI" w:hAnsi="Segoe UI" w:cs="Segoe UI"/>
-          <w:sz w:val="20"/>
-          <w:szCs w:val="20"/>
-        </w:rPr>
-      </w:pPr>
-      <w:r>
-        <w:rPr>
-          <w:rFonts w:ascii="Segoe UI" w:hAnsi="Segoe UI" w:cs="Segoe UI"/>
-          <w:sz w:val="20"/>
-          <w:szCs w:val="20"/>
-        </w:rPr>
-        <w:t>standard wykończenia – wartość naj</w:t>
-      </w:r>
-      <w:r>
-        <w:rPr>
-          <w:rFonts w:ascii="Segoe UI" w:hAnsi="Segoe UI" w:cs="Segoe UI"/>
-          <w:sz w:val="20"/>
-          <w:szCs w:val="20"/>
-        </w:rPr>
-        <w:t>niższa</w:t>
-      </w:r>
-      <w:r>
-        <w:rPr>
-          <w:rFonts w:ascii="Segoe UI" w:hAnsi="Segoe UI" w:cs="Segoe UI"/>
-          <w:sz w:val="20"/>
-          <w:szCs w:val="20"/>
-        </w:rPr>
-        <w:t xml:space="preserve"> cechy,</w:t>
-      </w:r>
-    </w:p>
-    <w:p>
-      <w:pPr>
-        <w:numPr>
-          <w:ilvl w:val="0"/>
-          <w:numId w:val="14"/>
-        </w:numPr>
-        <w:spacing w:line="276" w:lineRule="auto"/>
-        <w:jc w:val="both"/>
-        <w:rPr>
-          <w:rFonts w:ascii="Segoe UI" w:hAnsi="Segoe UI" w:cs="Segoe UI"/>
-          <w:sz w:val="20"/>
-          <w:szCs w:val="20"/>
-        </w:rPr>
-      </w:pPr>
-      <w:r>
-        <w:rPr>
-          <w:rFonts w:ascii="Segoe UI" w:hAnsi="Segoe UI" w:cs="Segoe UI"/>
-          <w:sz w:val="20"/>
-          <w:szCs w:val="20"/>
-        </w:rPr>
-        <w:t>powierzchnia użytkowa – wartość naj</w:t>
-      </w:r>
-      <w:r>
-        <w:rPr>
-          <w:rFonts w:ascii="Segoe UI" w:hAnsi="Segoe UI" w:cs="Segoe UI"/>
-          <w:sz w:val="20"/>
-          <w:szCs w:val="20"/>
-        </w:rPr>
-        <w:t>wyższ</w:t>
-      </w:r>
-      <w:r>
-        <w:rPr>
-          <w:rFonts w:ascii="Segoe UI" w:hAnsi="Segoe UI" w:cs="Segoe UI"/>
-          <w:sz w:val="20"/>
-          <w:szCs w:val="20"/>
-        </w:rPr>
-        <w:t>a cechy,</w:t>
-      </w:r>
-    </w:p>
-    <w:p>
-      <w:pPr>
-        <w:pStyle w:val="Akapitzlist"/>
-        <w:numPr>
-          <w:ilvl w:val="0"/>
-          <w:numId w:val="14"/>
-        </w:numPr>
-        <w:spacing w:line="276" w:lineRule="auto"/>
-        <w:jc w:val="both"/>
-        <w:rPr>
-          <w:rFonts w:ascii="Segoe UI" w:hAnsi="Segoe UI" w:cs="Segoe UI"/>
-          <w:sz w:val="20"/>
-          <w:szCs w:val="20"/>
-        </w:rPr>
-      </w:pPr>
-      <w:r>
-        <w:rPr>
-          <w:rFonts w:ascii="Segoe UI" w:hAnsi="Segoe UI" w:cs="Segoe UI"/>
-          <w:sz w:val="20"/>
-          <w:szCs w:val="20"/>
-        </w:rPr>
-        <w:t xml:space="preserve">położenie na piętrze – wartość pośrednia cechy, </w:t>
-      </w:r>
-    </w:p>
-    <w:p>
-      <w:pPr>
-        <w:pStyle w:val="Akapitzlist"/>
-        <w:numPr>
-          <w:ilvl w:val="0"/>
-          <w:numId w:val="14"/>
-        </w:numPr>
-        <w:spacing w:line="276" w:lineRule="auto"/>
-        <w:jc w:val="both"/>
-        <w:rPr>
-          <w:rFonts w:ascii="Segoe UI" w:hAnsi="Segoe UI" w:cs="Segoe UI"/>
-          <w:sz w:val="20"/>
-          <w:szCs w:val="20"/>
-        </w:rPr>
-      </w:pPr>
-      <w:r>
-        <w:rPr>
-          <w:rFonts w:ascii="Segoe UI" w:hAnsi="Segoe UI" w:cs="Segoe UI"/>
-          <w:sz w:val="20"/>
-          <w:szCs w:val="20"/>
-        </w:rPr>
-        <w:t>dodatkowe – wartość najwyższa cechy,</w:t>
-      </w:r>
-    </w:p>
-    <w:p>
-      <w:pPr>
-        <w:numPr>
-          <w:ilvl w:val="0"/>
-          <w:numId w:val="14"/>
-        </w:numPr>
-        <w:spacing w:line="276" w:lineRule="auto"/>
-        <w:jc w:val="both"/>
-        <w:rPr>
-          <w:rFonts w:ascii="Segoe UI" w:hAnsi="Segoe UI" w:cs="Segoe UI"/>
-          <w:sz w:val="20"/>
-          <w:szCs w:val="20"/>
-        </w:rPr>
-      </w:pPr>
-      <w:r>
-        <w:rPr>
-          <w:rFonts w:ascii="Segoe UI" w:hAnsi="Segoe UI" w:cs="Segoe UI"/>
-          <w:sz w:val="20"/>
-          <w:szCs w:val="20"/>
-        </w:rPr>
-        <w:t>lokalizacja szczegółowa – wartość naj</w:t>
-      </w:r>
-      <w:r>
-        <w:rPr>
-          <w:rFonts w:ascii="Segoe UI" w:hAnsi="Segoe UI" w:cs="Segoe UI"/>
-          <w:sz w:val="20"/>
-          <w:szCs w:val="20"/>
-        </w:rPr>
-        <w:t xml:space="preserve">niższa </w:t>
-      </w:r>
-      <w:r>
-        <w:rPr>
-          <w:rFonts w:ascii="Segoe UI" w:hAnsi="Segoe UI" w:cs="Segoe UI"/>
-          <w:sz w:val="20"/>
-          <w:szCs w:val="20"/>
-        </w:rPr>
-        <w:t xml:space="preserve">cechy. </w:t>
-      </w:r>
-    </w:p>
-    <w:p>
-      <w:pPr>
-        <w:spacing w:line="276" w:lineRule="auto"/>
-        <w:ind w:left="727"/>
-        <w:jc w:val="both"/>
-        <w:rPr>
-          <w:rFonts w:ascii="Segoe UI" w:hAnsi="Segoe UI" w:cs="Segoe UI"/>
-          <w:sz w:val="20"/>
-          <w:szCs w:val="20"/>
-        </w:rPr>
-      </w:pPr>
-    </w:p>
-    <w:p>
-      <w:pPr>
-        <w:spacing w:line="276" w:lineRule="auto"/>
-        <w:rPr>
-          <w:rFonts w:ascii="Segoe UI" w:hAnsi="Segoe UI" w:cs="Segoe UI"/>
-          <w:b/>
-          <w:bCs/>
-          <w:sz w:val="20"/>
-          <w:szCs w:val="20"/>
-          <w:u w:val="single"/>
-        </w:rPr>
-      </w:pPr>
-      <w:r>
-        <w:rPr>
-          <w:rFonts w:ascii="Segoe UI" w:hAnsi="Segoe UI" w:cs="Segoe UI"/>
-          <w:b/>
-          <w:bCs/>
-          <w:sz w:val="20"/>
-          <w:szCs w:val="20"/>
-          <w:u w:val="single"/>
-        </w:rPr>
-        <w:t>Opis lokalu będącego przedmiotem wyceny pod względem cech rynkowych</w:t>
-      </w:r>
-    </w:p>
-    <w:p>
-      <w:pPr>
-        <w:spacing w:line="276" w:lineRule="auto"/>
-        <w:jc w:val="both"/>
-        <w:rPr>
-          <w:rFonts w:ascii="Segoe UI" w:hAnsi="Segoe UI" w:cs="Segoe UI"/>
-          <w:sz w:val="20"/>
-          <w:szCs w:val="20"/>
-        </w:rPr>
-      </w:pPr>
-      <w:r>
-        <w:rPr>
-          <w:rFonts w:ascii="Segoe UI" w:hAnsi="Segoe UI" w:cs="Segoe UI"/>
-          <w:sz w:val="20"/>
-          <w:szCs w:val="20"/>
-        </w:rPr>
-        <w:t xml:space="preserve">Lokal mieszkalny położony jest pod adresem: {adres}.</w:t>
-      </w:r>
-    </w:p>
-    <w:p>
-      <w:pPr>
-        <w:numPr>
-          <w:ilvl w:val="0"/>
-          <w:numId w:val="14"/>
-        </w:numPr>
-        <w:spacing w:line="276" w:lineRule="auto"/>
-        <w:jc w:val="both"/>
-        <w:rPr>
-          <w:rFonts w:ascii="Segoe UI" w:hAnsi="Segoe UI" w:cs="Segoe UI"/>
-          <w:sz w:val="20"/>
-          <w:szCs w:val="20"/>
-        </w:rPr>
-      </w:pPr>
-      <w:r>
-        <w:rPr>
-          <w:rFonts w:ascii="Segoe UI" w:hAnsi="Segoe UI" w:cs="Segoe UI"/>
-          <w:sz w:val="20"/>
-          <w:szCs w:val="20"/>
-        </w:rPr>
-        <w:t>standard wykończenia – wartość najwyższa cechy,</w:t>
-      </w:r>
-    </w:p>
-    <w:p>
-      <w:pPr>
-        <w:numPr>
-          <w:ilvl w:val="0"/>
-          <w:numId w:val="14"/>
-        </w:numPr>
-        <w:spacing w:line="276" w:lineRule="auto"/>
-        <w:jc w:val="both"/>
-        <w:rPr>
-          <w:rFonts w:ascii="Segoe UI" w:hAnsi="Segoe UI" w:cs="Segoe UI"/>
-          <w:sz w:val="20"/>
-          <w:szCs w:val="20"/>
-        </w:rPr>
-      </w:pPr>
-      <w:r>
-        <w:rPr>
-          <w:rFonts w:ascii="Segoe UI" w:hAnsi="Segoe UI" w:cs="Segoe UI"/>
-          <w:sz w:val="20"/>
-          <w:szCs w:val="20"/>
-        </w:rPr>
-        <w:t>powierzchnia użytkowa – wartość najniższa cechy,</w:t>
-      </w:r>
-    </w:p>
-    <w:p>
-      <w:pPr>
-        <w:pStyle w:val="Akapitzlist"/>
-        <w:numPr>
-          <w:ilvl w:val="0"/>
-          <w:numId w:val="14"/>
-        </w:numPr>
-        <w:spacing w:line="276" w:lineRule="auto"/>
-        <w:jc w:val="both"/>
-        <w:rPr>
-          <w:rFonts w:ascii="Segoe UI" w:hAnsi="Segoe UI" w:cs="Segoe UI"/>
-          <w:sz w:val="20"/>
-          <w:szCs w:val="20"/>
-        </w:rPr>
-      </w:pPr>
-      <w:r>
-        <w:rPr>
-          <w:rFonts w:ascii="Segoe UI" w:hAnsi="Segoe UI" w:cs="Segoe UI"/>
-          <w:sz w:val="20"/>
-          <w:szCs w:val="20"/>
-        </w:rPr>
-        <w:t xml:space="preserve">położenie na piętrze – wartość </w:t>
-      </w:r>
-      <w:r>
-        <w:rPr>
-          <w:rFonts w:ascii="Segoe UI" w:hAnsi="Segoe UI" w:cs="Segoe UI"/>
-          <w:sz w:val="20"/>
-          <w:szCs w:val="20"/>
-        </w:rPr>
-        <w:t>najwyższa</w:t>
-      </w:r>
-      <w:r>
-        <w:rPr>
-          <w:rFonts w:ascii="Segoe UI" w:hAnsi="Segoe UI" w:cs="Segoe UI"/>
-          <w:sz w:val="20"/>
-          <w:szCs w:val="20"/>
-        </w:rPr>
-        <w:t xml:space="preserve"> cechy, </w:t>
-      </w:r>
-    </w:p>
-    <w:p>
-      <w:pPr>
-        <w:pStyle w:val="Akapitzlist"/>
-        <w:numPr>
-          <w:ilvl w:val="0"/>
-          <w:numId w:val="14"/>
-        </w:numPr>
-        <w:spacing w:line="276" w:lineRule="auto"/>
-        <w:jc w:val="both"/>
-        <w:rPr>
-          <w:rFonts w:ascii="Segoe UI" w:hAnsi="Segoe UI" w:cs="Segoe UI"/>
-          <w:sz w:val="20"/>
-          <w:szCs w:val="20"/>
-        </w:rPr>
-      </w:pPr>
-      <w:r>
-        <w:rPr>
-          <w:rFonts w:ascii="Segoe UI" w:hAnsi="Segoe UI" w:cs="Segoe UI"/>
-          <w:sz w:val="20"/>
-          <w:szCs w:val="20"/>
-        </w:rPr>
-        <w:t>dodatkowe – wartość najwyższa cechy,</w:t>
-      </w:r>
-    </w:p>
-    <w:p>
-      <w:pPr>
-        <w:numPr>
-          <w:ilvl w:val="0"/>
-          <w:numId w:val="14"/>
-        </w:numPr>
-        <w:spacing w:line="276" w:lineRule="auto"/>
-        <w:jc w:val="both"/>
-        <w:rPr>
-          <w:rFonts w:ascii="Segoe UI" w:hAnsi="Segoe UI" w:cs="Segoe UI"/>
-          <w:sz w:val="20"/>
-          <w:szCs w:val="20"/>
-        </w:rPr>
-      </w:pPr>
-      <w:r>
-        <w:rPr>
-          <w:rFonts w:ascii="Segoe UI" w:hAnsi="Segoe UI" w:cs="Segoe UI"/>
-          <w:sz w:val="20"/>
-          <w:szCs w:val="20"/>
-        </w:rPr>
-        <w:t xml:space="preserve">lokalizacja szczegółowa – wartość najwyższa cechy. </w:t>
+        <w:t xml:space="preserve">{.}</w:t>
+      </w:r>
+    </w:p>
+    <w:p>
+      <w:r>
+        <w:t xml:space="preserve">{/opis_przedmiot}</w:t>
       </w:r>
     </w:p>
     <w:p>
@@ -17752,7 +17404,7 @@
                 <w:sz w:val="18"/>
                 <w:szCs w:val="18"/>
               </w:rPr>
-              <w:t>Standard wykończenia</w:t>
+              <w:t xml:space="preserve">{#cechy}{nazwa}</w:t>
             </w:r>
           </w:p>
         </w:tc>
@@ -17779,7 +17431,7 @@
                 <w:sz w:val="18"/>
                 <w:szCs w:val="18"/>
               </w:rPr>
-              <w:t>40%</w:t>
+              <w:t xml:space="preserve">{waga_pct}%</w:t>
             </w:r>
           </w:p>
         </w:tc>
@@ -17805,7 +17457,7 @@
                 <w:sz w:val="18"/>
                 <w:szCs w:val="18"/>
               </w:rPr>
-              <w:t>0,368</w:t>
+              <w:t xml:space="preserve">{ui_min}</w:t>
             </w:r>
           </w:p>
         </w:tc>
@@ -17829,7 +17481,7 @@
                 <w:sz w:val="18"/>
                 <w:szCs w:val="18"/>
               </w:rPr>
-              <w:t>0,400</w:t>
+              <w:t xml:space="preserve">{ui_sr}</w:t>
             </w:r>
           </w:p>
         </w:tc>
@@ -17855,7 +17507,7 @@
                 <w:sz w:val="18"/>
                 <w:szCs w:val="18"/>
               </w:rPr>
-              <w:t>0,453</w:t>
+              <w:t xml:space="preserve">{ui_max}</w:t>
             </w:r>
           </w:p>
         </w:tc>
@@ -17881,663 +17533,7 @@
                 <w:sz w:val="18"/>
                 <w:szCs w:val="18"/>
               </w:rPr>
-              <w:t>0,453</w:t>
-            </w:r>
-          </w:p>
-        </w:tc>
-      </w:tr>
-      <w:tr>
-        <w:trPr>
-          <w:trHeight w:val="220"/>
-        </w:trPr>
-        <w:tc>
-          <w:tcPr>
-            <w:tcW w:w="2339" w:type="dxa"/>
-            <w:vAlign w:val="bottom"/>
-          </w:tcPr>
-          <w:p>
-            <w:pPr>
-              <w:spacing w:line="276" w:lineRule="auto"/>
-              <w:jc w:val="center"/>
-              <w:rPr>
-                <w:rFonts w:ascii="Segoe UI" w:hAnsi="Segoe UI" w:cs="Segoe UI"/>
-                <w:b/>
-                <w:bCs/>
-                <w:sz w:val="18"/>
-                <w:szCs w:val="18"/>
-              </w:rPr>
-            </w:pPr>
-            <w:r>
-              <w:rPr>
-                <w:rFonts w:ascii="Segoe UI" w:hAnsi="Segoe UI" w:cs="Segoe UI"/>
-                <w:b/>
-                <w:bCs/>
-                <w:color w:val="000000"/>
-                <w:sz w:val="18"/>
-                <w:szCs w:val="18"/>
-              </w:rPr>
-              <w:t>Położenie na piętrze</w:t>
-            </w:r>
-          </w:p>
-        </w:tc>
-        <w:tc>
-          <w:tcPr>
-            <w:tcW w:w="716" w:type="dxa"/>
-            <w:vAlign w:val="bottom"/>
-          </w:tcPr>
-          <w:p>
-            <w:pPr>
-              <w:spacing w:line="276" w:lineRule="auto"/>
-              <w:jc w:val="center"/>
-              <w:rPr>
-                <w:rFonts w:ascii="Segoe UI" w:hAnsi="Segoe UI" w:cs="Segoe UI"/>
-                <w:bCs/>
-                <w:sz w:val="18"/>
-                <w:szCs w:val="18"/>
-              </w:rPr>
-            </w:pPr>
-            <w:r>
-              <w:rPr>
-                <w:rFonts w:ascii="Segoe UI" w:hAnsi="Segoe UI" w:cs="Segoe UI"/>
-                <w:color w:val="000000"/>
-                <w:sz w:val="18"/>
-                <w:szCs w:val="18"/>
-              </w:rPr>
-              <w:t>30%</w:t>
-            </w:r>
-          </w:p>
-        </w:tc>
-        <w:tc>
-          <w:tcPr>
-            <w:tcW w:w="1489" w:type="dxa"/>
-            <w:vAlign w:val="bottom"/>
-          </w:tcPr>
-          <w:p>
-            <w:pPr>
-              <w:spacing w:line="276" w:lineRule="auto"/>
-              <w:jc w:val="center"/>
-              <w:rPr>
-                <w:rFonts w:ascii="Segoe UI" w:hAnsi="Segoe UI" w:cs="Segoe UI"/>
-                <w:sz w:val="18"/>
-                <w:szCs w:val="18"/>
-              </w:rPr>
-            </w:pPr>
-            <w:r>
-              <w:rPr>
-                <w:rFonts w:ascii="Segoe UI" w:hAnsi="Segoe UI" w:cs="Segoe UI"/>
-                <w:color w:val="000000"/>
-                <w:sz w:val="18"/>
-                <w:szCs w:val="18"/>
-              </w:rPr>
-              <w:t>0,276</w:t>
-            </w:r>
-          </w:p>
-        </w:tc>
-        <w:tc>
-          <w:tcPr>
-            <w:tcW w:w="1347" w:type="dxa"/>
-          </w:tcPr>
-          <w:p>
-            <w:pPr>
-              <w:spacing w:line="276" w:lineRule="auto"/>
-              <w:jc w:val="center"/>
-              <w:rPr>
-                <w:rFonts w:ascii="Segoe UI" w:hAnsi="Segoe UI" w:cs="Segoe UI"/>
-                <w:sz w:val="18"/>
-                <w:szCs w:val="18"/>
-              </w:rPr>
-            </w:pPr>
-            <w:r>
-              <w:rPr>
-                <w:rFonts w:ascii="Segoe UI" w:hAnsi="Segoe UI" w:cs="Segoe UI"/>
-                <w:sz w:val="18"/>
-                <w:szCs w:val="18"/>
-              </w:rPr>
-              <w:t>0,300</w:t>
-            </w:r>
-          </w:p>
-        </w:tc>
-        <w:tc>
-          <w:tcPr>
-            <w:tcW w:w="1358" w:type="dxa"/>
-            <w:vAlign w:val="bottom"/>
-          </w:tcPr>
-          <w:p>
-            <w:pPr>
-              <w:spacing w:line="276" w:lineRule="auto"/>
-              <w:jc w:val="center"/>
-              <w:rPr>
-                <w:rFonts w:ascii="Segoe UI" w:hAnsi="Segoe UI" w:cs="Segoe UI"/>
-                <w:sz w:val="18"/>
-                <w:szCs w:val="18"/>
-              </w:rPr>
-            </w:pPr>
-            <w:r>
-              <w:rPr>
-                <w:rFonts w:ascii="Segoe UI" w:hAnsi="Segoe UI" w:cs="Segoe UI"/>
-                <w:color w:val="000000"/>
-                <w:sz w:val="18"/>
-                <w:szCs w:val="18"/>
-              </w:rPr>
-              <w:t>0,340</w:t>
-            </w:r>
-          </w:p>
-        </w:tc>
-        <w:tc>
-          <w:tcPr>
-            <w:tcW w:w="1712" w:type="dxa"/>
-            <w:vAlign w:val="bottom"/>
-          </w:tcPr>
-          <w:p>
-            <w:pPr>
-              <w:spacing w:line="276" w:lineRule="auto"/>
-              <w:jc w:val="center"/>
-              <w:rPr>
-                <w:rFonts w:ascii="Segoe UI" w:hAnsi="Segoe UI" w:cs="Segoe UI"/>
-                <w:sz w:val="18"/>
-                <w:szCs w:val="18"/>
-              </w:rPr>
-            </w:pPr>
-            <w:r>
-              <w:rPr>
-                <w:rFonts w:ascii="Segoe UI" w:hAnsi="Segoe UI" w:cs="Segoe UI"/>
-                <w:color w:val="000000"/>
-                <w:sz w:val="18"/>
-                <w:szCs w:val="18"/>
-              </w:rPr>
-              <w:t>0,340</w:t>
-            </w:r>
-          </w:p>
-        </w:tc>
-      </w:tr>
-      <w:tr>
-        <w:trPr>
-          <w:trHeight w:val="230"/>
-        </w:trPr>
-        <w:tc>
-          <w:tcPr>
-            <w:tcW w:w="2339" w:type="dxa"/>
-            <w:vAlign w:val="bottom"/>
-          </w:tcPr>
-          <w:p>
-            <w:pPr>
-              <w:spacing w:line="276" w:lineRule="auto"/>
-              <w:jc w:val="center"/>
-              <w:rPr>
-                <w:rFonts w:ascii="Segoe UI" w:hAnsi="Segoe UI" w:cs="Segoe UI"/>
-                <w:b/>
-                <w:bCs/>
-                <w:sz w:val="18"/>
-                <w:szCs w:val="18"/>
-              </w:rPr>
-            </w:pPr>
-            <w:r>
-              <w:rPr>
-                <w:rFonts w:ascii="Segoe UI" w:hAnsi="Segoe UI" w:cs="Segoe UI"/>
-                <w:b/>
-                <w:bCs/>
-                <w:color w:val="000000"/>
-                <w:sz w:val="18"/>
-                <w:szCs w:val="18"/>
-              </w:rPr>
-              <w:t>Powierzchnia użytkowa</w:t>
-            </w:r>
-          </w:p>
-        </w:tc>
-        <w:tc>
-          <w:tcPr>
-            <w:tcW w:w="716" w:type="dxa"/>
-            <w:vAlign w:val="bottom"/>
-          </w:tcPr>
-          <w:p>
-            <w:pPr>
-              <w:spacing w:line="276" w:lineRule="auto"/>
-              <w:jc w:val="center"/>
-              <w:rPr>
-                <w:rFonts w:ascii="Segoe UI" w:hAnsi="Segoe UI" w:cs="Segoe UI"/>
-                <w:bCs/>
-                <w:sz w:val="18"/>
-                <w:szCs w:val="18"/>
-              </w:rPr>
-            </w:pPr>
-            <w:r>
-              <w:rPr>
-                <w:rFonts w:ascii="Segoe UI" w:hAnsi="Segoe UI" w:cs="Segoe UI"/>
-                <w:color w:val="000000"/>
-                <w:sz w:val="18"/>
-                <w:szCs w:val="18"/>
-              </w:rPr>
-              <w:t>10%</w:t>
-            </w:r>
-          </w:p>
-        </w:tc>
-        <w:tc>
-          <w:tcPr>
-            <w:tcW w:w="1489" w:type="dxa"/>
-            <w:vAlign w:val="bottom"/>
-          </w:tcPr>
-          <w:p>
-            <w:pPr>
-              <w:spacing w:line="276" w:lineRule="auto"/>
-              <w:jc w:val="center"/>
-              <w:rPr>
-                <w:rFonts w:ascii="Segoe UI" w:hAnsi="Segoe UI" w:cs="Segoe UI"/>
-                <w:sz w:val="18"/>
-                <w:szCs w:val="18"/>
-              </w:rPr>
-            </w:pPr>
-            <w:r>
-              <w:rPr>
-                <w:rFonts w:ascii="Segoe UI" w:hAnsi="Segoe UI" w:cs="Segoe UI"/>
-                <w:color w:val="000000"/>
-                <w:sz w:val="18"/>
-                <w:szCs w:val="18"/>
-              </w:rPr>
-              <w:t>0,092</w:t>
-            </w:r>
-          </w:p>
-        </w:tc>
-        <w:tc>
-          <w:tcPr>
-            <w:tcW w:w="1347" w:type="dxa"/>
-          </w:tcPr>
-          <w:p>
-            <w:pPr>
-              <w:spacing w:line="276" w:lineRule="auto"/>
-              <w:jc w:val="center"/>
-              <w:rPr>
-                <w:rFonts w:ascii="Segoe UI" w:hAnsi="Segoe UI" w:cs="Segoe UI"/>
-                <w:sz w:val="18"/>
-                <w:szCs w:val="18"/>
-              </w:rPr>
-            </w:pPr>
-            <w:r>
-              <w:rPr>
-                <w:rFonts w:ascii="Segoe UI" w:hAnsi="Segoe UI" w:cs="Segoe UI"/>
-                <w:sz w:val="18"/>
-                <w:szCs w:val="18"/>
-              </w:rPr>
-              <w:t>0,100</w:t>
-            </w:r>
-          </w:p>
-        </w:tc>
-        <w:tc>
-          <w:tcPr>
-            <w:tcW w:w="1358" w:type="dxa"/>
-            <w:vAlign w:val="bottom"/>
-          </w:tcPr>
-          <w:p>
-            <w:pPr>
-              <w:spacing w:line="276" w:lineRule="auto"/>
-              <w:jc w:val="center"/>
-              <w:rPr>
-                <w:rFonts w:ascii="Segoe UI" w:hAnsi="Segoe UI" w:cs="Segoe UI"/>
-                <w:sz w:val="18"/>
-                <w:szCs w:val="18"/>
-              </w:rPr>
-            </w:pPr>
-            <w:r>
-              <w:rPr>
-                <w:rFonts w:ascii="Segoe UI" w:hAnsi="Segoe UI" w:cs="Segoe UI"/>
-                <w:color w:val="000000"/>
-                <w:sz w:val="18"/>
-                <w:szCs w:val="18"/>
-              </w:rPr>
-              <w:t>0,113</w:t>
-            </w:r>
-          </w:p>
-        </w:tc>
-        <w:tc>
-          <w:tcPr>
-            <w:tcW w:w="1712" w:type="dxa"/>
-            <w:vAlign w:val="bottom"/>
-          </w:tcPr>
-          <w:p>
-            <w:pPr>
-              <w:spacing w:line="276" w:lineRule="auto"/>
-              <w:jc w:val="center"/>
-              <w:rPr>
-                <w:rFonts w:ascii="Segoe UI" w:hAnsi="Segoe UI" w:cs="Segoe UI"/>
-                <w:sz w:val="18"/>
-                <w:szCs w:val="18"/>
-              </w:rPr>
-            </w:pPr>
-            <w:r>
-              <w:rPr>
-                <w:rFonts w:ascii="Segoe UI" w:hAnsi="Segoe UI" w:cs="Segoe UI"/>
-                <w:color w:val="000000"/>
-                <w:sz w:val="18"/>
-                <w:szCs w:val="18"/>
-              </w:rPr>
-              <w:t>0,092</w:t>
-            </w:r>
-          </w:p>
-        </w:tc>
-      </w:tr>
-      <w:tr>
-        <w:trPr>
-          <w:trHeight w:val="230"/>
-        </w:trPr>
-        <w:tc>
-          <w:tcPr>
-            <w:tcW w:w="2339" w:type="dxa"/>
-            <w:vAlign w:val="bottom"/>
-          </w:tcPr>
-          <w:p>
-            <w:pPr>
-              <w:spacing w:line="276" w:lineRule="auto"/>
-              <w:jc w:val="center"/>
-              <w:rPr>
-                <w:rFonts w:ascii="Segoe UI" w:hAnsi="Segoe UI" w:cs="Segoe UI"/>
-                <w:b/>
-                <w:bCs/>
-                <w:sz w:val="18"/>
-                <w:szCs w:val="18"/>
-              </w:rPr>
-            </w:pPr>
-            <w:r>
-              <w:rPr>
-                <w:rFonts w:ascii="Segoe UI" w:hAnsi="Segoe UI" w:cs="Segoe UI"/>
-                <w:b/>
-                <w:bCs/>
-                <w:color w:val="000000"/>
-                <w:sz w:val="18"/>
-                <w:szCs w:val="18"/>
-              </w:rPr>
-              <w:t>Dodatkowe</w:t>
-            </w:r>
-          </w:p>
-        </w:tc>
-        <w:tc>
-          <w:tcPr>
-            <w:tcW w:w="716" w:type="dxa"/>
-            <w:vAlign w:val="bottom"/>
-          </w:tcPr>
-          <w:p>
-            <w:pPr>
-              <w:spacing w:line="276" w:lineRule="auto"/>
-              <w:jc w:val="center"/>
-              <w:rPr>
-                <w:rFonts w:ascii="Segoe UI" w:hAnsi="Segoe UI" w:cs="Segoe UI"/>
-                <w:bCs/>
-                <w:sz w:val="18"/>
-                <w:szCs w:val="18"/>
-              </w:rPr>
-            </w:pPr>
-            <w:r>
-              <w:rPr>
-                <w:rFonts w:ascii="Segoe UI" w:hAnsi="Segoe UI" w:cs="Segoe UI"/>
-                <w:color w:val="000000"/>
-                <w:sz w:val="18"/>
-                <w:szCs w:val="18"/>
-              </w:rPr>
-              <w:t>10%</w:t>
-            </w:r>
-          </w:p>
-        </w:tc>
-        <w:tc>
-          <w:tcPr>
-            <w:tcW w:w="1489" w:type="dxa"/>
-            <w:vAlign w:val="bottom"/>
-          </w:tcPr>
-          <w:p>
-            <w:pPr>
-              <w:spacing w:line="276" w:lineRule="auto"/>
-              <w:jc w:val="center"/>
-              <w:rPr>
-                <w:rFonts w:ascii="Segoe UI" w:hAnsi="Segoe UI" w:cs="Segoe UI"/>
-                <w:sz w:val="18"/>
-                <w:szCs w:val="18"/>
-              </w:rPr>
-            </w:pPr>
-            <w:r>
-              <w:rPr>
-                <w:rFonts w:ascii="Segoe UI" w:hAnsi="Segoe UI" w:cs="Segoe UI"/>
-                <w:color w:val="000000"/>
-                <w:sz w:val="18"/>
-                <w:szCs w:val="18"/>
-              </w:rPr>
-              <w:t>0,092</w:t>
-            </w:r>
-          </w:p>
-        </w:tc>
-        <w:tc>
-          <w:tcPr>
-            <w:tcW w:w="1347" w:type="dxa"/>
-          </w:tcPr>
-          <w:p>
-            <w:pPr>
-              <w:spacing w:line="276" w:lineRule="auto"/>
-              <w:jc w:val="center"/>
-              <w:rPr>
-                <w:rFonts w:ascii="Segoe UI" w:hAnsi="Segoe UI" w:cs="Segoe UI"/>
-                <w:sz w:val="18"/>
-                <w:szCs w:val="18"/>
-              </w:rPr>
-            </w:pPr>
-            <w:r>
-              <w:rPr>
-                <w:rFonts w:ascii="Segoe UI" w:hAnsi="Segoe UI" w:cs="Segoe UI"/>
-                <w:sz w:val="18"/>
-                <w:szCs w:val="18"/>
-              </w:rPr>
-              <w:t>0,100</w:t>
-            </w:r>
-          </w:p>
-        </w:tc>
-        <w:tc>
-          <w:tcPr>
-            <w:tcW w:w="1358" w:type="dxa"/>
-            <w:vAlign w:val="bottom"/>
-          </w:tcPr>
-          <w:p>
-            <w:pPr>
-              <w:spacing w:line="276" w:lineRule="auto"/>
-              <w:jc w:val="center"/>
-              <w:rPr>
-                <w:rFonts w:ascii="Segoe UI" w:hAnsi="Segoe UI" w:cs="Segoe UI"/>
-                <w:sz w:val="18"/>
-                <w:szCs w:val="18"/>
-              </w:rPr>
-            </w:pPr>
-            <w:r>
-              <w:rPr>
-                <w:rFonts w:ascii="Segoe UI" w:hAnsi="Segoe UI" w:cs="Segoe UI"/>
-                <w:color w:val="000000"/>
-                <w:sz w:val="18"/>
-                <w:szCs w:val="18"/>
-              </w:rPr>
-              <w:t>0,113</w:t>
-            </w:r>
-          </w:p>
-        </w:tc>
-        <w:tc>
-          <w:tcPr>
-            <w:tcW w:w="1712" w:type="dxa"/>
-            <w:vAlign w:val="bottom"/>
-          </w:tcPr>
-          <w:p>
-            <w:pPr>
-              <w:spacing w:line="276" w:lineRule="auto"/>
-              <w:jc w:val="center"/>
-              <w:rPr>
-                <w:rFonts w:ascii="Segoe UI" w:hAnsi="Segoe UI" w:cs="Segoe UI"/>
-                <w:sz w:val="18"/>
-                <w:szCs w:val="18"/>
-              </w:rPr>
-            </w:pPr>
-            <w:r>
-              <w:rPr>
-                <w:rFonts w:ascii="Segoe UI" w:hAnsi="Segoe UI" w:cs="Segoe UI"/>
-                <w:color w:val="000000"/>
-                <w:sz w:val="18"/>
-                <w:szCs w:val="18"/>
-              </w:rPr>
-              <w:t>0,113</w:t>
-            </w:r>
-          </w:p>
-        </w:tc>
-      </w:tr>
-      <w:tr>
-        <w:trPr>
-          <w:trHeight w:val="230"/>
-        </w:trPr>
-        <w:tc>
-          <w:tcPr>
-            <w:tcW w:w="2339" w:type="dxa"/>
-            <w:vAlign w:val="bottom"/>
-          </w:tcPr>
-          <w:p>
-            <w:pPr>
-              <w:spacing w:line="276" w:lineRule="auto"/>
-              <w:jc w:val="center"/>
-              <w:rPr>
-                <w:rFonts w:ascii="Segoe UI" w:hAnsi="Segoe UI" w:cs="Segoe UI"/>
-                <w:b/>
-                <w:bCs/>
-                <w:sz w:val="18"/>
-                <w:szCs w:val="18"/>
-              </w:rPr>
-            </w:pPr>
-            <w:r>
-              <w:rPr>
-                <w:rFonts w:ascii="Segoe UI" w:hAnsi="Segoe UI" w:cs="Segoe UI"/>
-                <w:b/>
-                <w:bCs/>
-                <w:color w:val="000000"/>
-                <w:sz w:val="18"/>
-                <w:szCs w:val="18"/>
-              </w:rPr>
-              <w:t>Lokalizacja szczegółowa</w:t>
-            </w:r>
-          </w:p>
-        </w:tc>
-        <w:tc>
-          <w:tcPr>
-            <w:tcW w:w="716" w:type="dxa"/>
-            <w:vAlign w:val="bottom"/>
-          </w:tcPr>
-          <w:p>
-            <w:pPr>
-              <w:spacing w:line="276" w:lineRule="auto"/>
-              <w:jc w:val="center"/>
-              <w:rPr>
-                <w:rFonts w:ascii="Segoe UI" w:hAnsi="Segoe UI" w:cs="Segoe UI"/>
-                <w:bCs/>
-                <w:sz w:val="18"/>
-                <w:szCs w:val="18"/>
-              </w:rPr>
-            </w:pPr>
-            <w:r>
-              <w:rPr>
-                <w:rFonts w:ascii="Segoe UI" w:hAnsi="Segoe UI" w:cs="Segoe UI"/>
-                <w:color w:val="000000"/>
-                <w:sz w:val="18"/>
-                <w:szCs w:val="18"/>
-              </w:rPr>
-              <w:t>10%</w:t>
-            </w:r>
-          </w:p>
-        </w:tc>
-        <w:tc>
-          <w:tcPr>
-            <w:tcW w:w="1489" w:type="dxa"/>
-            <w:vAlign w:val="bottom"/>
-          </w:tcPr>
-          <w:p>
-            <w:pPr>
-              <w:spacing w:line="276" w:lineRule="auto"/>
-              <w:jc w:val="center"/>
-              <w:rPr>
-                <w:rFonts w:ascii="Segoe UI" w:hAnsi="Segoe UI" w:cs="Segoe UI"/>
-                <w:sz w:val="18"/>
-                <w:szCs w:val="18"/>
-              </w:rPr>
-            </w:pPr>
-            <w:r>
-              <w:rPr>
-                <w:rFonts w:ascii="Segoe UI" w:hAnsi="Segoe UI" w:cs="Segoe UI"/>
-                <w:color w:val="000000"/>
-                <w:sz w:val="18"/>
-                <w:szCs w:val="18"/>
-              </w:rPr>
-              <w:t>0,092</w:t>
-            </w:r>
-          </w:p>
-        </w:tc>
-        <w:tc>
-          <w:tcPr>
-            <w:tcW w:w="1347" w:type="dxa"/>
-          </w:tcPr>
-          <w:p>
-            <w:pPr>
-              <w:spacing w:line="276" w:lineRule="auto"/>
-              <w:jc w:val="center"/>
-              <w:rPr>
-                <w:rFonts w:ascii="Segoe UI" w:hAnsi="Segoe UI" w:cs="Segoe UI"/>
-                <w:sz w:val="18"/>
-                <w:szCs w:val="18"/>
-              </w:rPr>
-            </w:pPr>
-            <w:r>
-              <w:rPr>
-                <w:rFonts w:ascii="Segoe UI" w:hAnsi="Segoe UI" w:cs="Segoe UI"/>
-                <w:sz w:val="18"/>
-                <w:szCs w:val="18"/>
-              </w:rPr>
-              <w:t>0,100</w:t>
-            </w:r>
-          </w:p>
-        </w:tc>
-        <w:tc>
-          <w:tcPr>
-            <w:tcW w:w="1358" w:type="dxa"/>
-            <w:vAlign w:val="bottom"/>
-          </w:tcPr>
-          <w:p>
-            <w:pPr>
-              <w:spacing w:line="276" w:lineRule="auto"/>
-              <w:jc w:val="center"/>
-              <w:rPr>
-                <w:rFonts w:ascii="Segoe UI" w:hAnsi="Segoe UI" w:cs="Segoe UI"/>
-                <w:sz w:val="18"/>
-                <w:szCs w:val="18"/>
-              </w:rPr>
-            </w:pPr>
-            <w:r>
-              <w:rPr>
-                <w:rFonts w:ascii="Segoe UI" w:hAnsi="Segoe UI" w:cs="Segoe UI"/>
-                <w:color w:val="000000"/>
-                <w:sz w:val="18"/>
-                <w:szCs w:val="18"/>
-              </w:rPr>
-              <w:t>0,113</w:t>
-            </w:r>
-          </w:p>
-        </w:tc>
-        <w:tc>
-          <w:tcPr>
-            <w:tcW w:w="1712" w:type="dxa"/>
-            <w:vAlign w:val="bottom"/>
-          </w:tcPr>
-          <w:p>
-            <w:pPr>
-              <w:spacing w:line="276" w:lineRule="auto"/>
-              <w:jc w:val="center"/>
-              <w:rPr>
-                <w:rFonts w:ascii="Segoe UI" w:hAnsi="Segoe UI" w:cs="Segoe UI"/>
-                <w:sz w:val="18"/>
-                <w:szCs w:val="18"/>
-              </w:rPr>
-            </w:pPr>
-            <w:r>
-              <w:rPr>
-                <w:rFonts w:ascii="Segoe UI" w:hAnsi="Segoe UI" w:cs="Segoe UI"/>
-                <w:color w:val="000000"/>
-                <w:sz w:val="18"/>
-                <w:szCs w:val="18"/>
-              </w:rPr>
-              <w:t>0,113</w:t>
+              <w:t xml:space="preserve">{ui_przedmiot}{/cechy}</w:t>
             </w:r>
           </w:p>
         </w:tc>
@@ -18622,7 +17618,7 @@
                 <w:sz w:val="18"/>
                 <w:szCs w:val="18"/>
               </w:rPr>
-              <w:t>0,</w:t>
+              <w:t xml:space="preserve">{vmin}</w:t>
             </w:r>
             <w:r>
               <w:rPr>
@@ -18631,7 +17627,7 @@
                 <w:sz w:val="18"/>
                 <w:szCs w:val="18"/>
               </w:rPr>
-              <w:t>920</w:t>
+              <w:t/>
             </w:r>
           </w:p>
         </w:tc>
@@ -18683,7 +17679,7 @@
                 <w:sz w:val="18"/>
                 <w:szCs w:val="18"/>
               </w:rPr>
-              <w:t>1,132</w:t>
+              <w:t xml:space="preserve">{vmax}</w:t>
             </w:r>
           </w:p>
         </w:tc>
@@ -18709,7 +17705,7 @@
                 <w:sz w:val="18"/>
                 <w:szCs w:val="18"/>
               </w:rPr>
-              <w:t>1,111</w:t>
+              <w:t xml:space="preserve">{suma_ui}</w:t>
             </w:r>
           </w:p>
         </w:tc>
@@ -19413,7 +18409,7 @@
                 <w:sz w:val="18"/>
                 <w:szCs w:val="18"/>
               </w:rPr>
-              <w:t>13 123,60</w:t>
+              <w:t xml:space="preserve">{cena_sr}</w:t>
             </w:r>
           </w:p>
         </w:tc>
@@ -19470,7 +18466,7 @@
                 <w:sz w:val="18"/>
                 <w:szCs w:val="18"/>
               </w:rPr>
-              <w:t>1,111</w:t>
+              <w:t xml:space="preserve">{suma_ui}</w:t>
             </w:r>
           </w:p>
         </w:tc>
@@ -19588,7 +18584,7 @@
                 <w:sz w:val="18"/>
                 <w:szCs w:val="18"/>
               </w:rPr>
-              <w:t>14 580,3</w:t>
+              <w:t xml:space="preserve">{cena_1m2}</w:t>
             </w:r>
             <w:r>
               <w:rPr>
@@ -19597,7 +18593,7 @@
                 <w:sz w:val="18"/>
                 <w:szCs w:val="18"/>
               </w:rPr>
-              <w:t>2</w:t>
+              <w:t/>
             </w:r>
           </w:p>
         </w:tc>
@@ -19776,7 +18772,7 @@
                 <w:sz w:val="18"/>
                 <w:szCs w:val="18"/>
               </w:rPr>
-              <w:t>1 044 388,32</w:t>
+              <w:t xml:space="preserve">{wr_dokladna}</w:t>
             </w:r>
           </w:p>
         </w:tc>

</xml_diff>

<commit_message>
fix: neutralize residual sample figures in section 11 and 13 prose
</commit_message>
<xml_diff>
--- a/apps/web/templates/operat-szablon.docx
+++ b/apps/web/templates/operat-szablon.docx
@@ -13361,39 +13361,39 @@
           <w:sz w:val="20"/>
           <w:szCs w:val="20"/>
         </w:rPr>
-        <w:t>W okresie monitorowania rynku lokalnego odnotowano transakcj</w:t>
-      </w:r>
-      <w:r>
-        <w:rPr>
-          <w:rFonts w:ascii="Segoe UI" w:hAnsi="Segoe UI" w:cs="Segoe UI"/>
-          <w:sz w:val="20"/>
-          <w:szCs w:val="20"/>
-        </w:rPr>
-        <w:t xml:space="preserve">e </w:t>
-      </w:r>
-      <w:r>
-        <w:rPr>
-          <w:rFonts w:ascii="Segoe UI" w:hAnsi="Segoe UI" w:cs="Segoe UI"/>
-          <w:sz w:val="20"/>
-          <w:szCs w:val="20"/>
-        </w:rPr>
-        <w:t>na badanym terenie,</w:t>
-      </w:r>
-      <w:r>
-        <w:rPr>
-          <w:rFonts w:ascii="Segoe UI" w:hAnsi="Segoe UI" w:cs="Segoe UI"/>
-          <w:sz w:val="20"/>
-          <w:szCs w:val="20"/>
-        </w:rPr>
-        <w:t xml:space="preserve"> </w:t>
-      </w:r>
-      <w:r>
-        <w:rPr>
-          <w:rFonts w:ascii="Segoe UI" w:hAnsi="Segoe UI" w:cs="Segoe UI"/>
-          <w:sz w:val="20"/>
-          <w:szCs w:val="20"/>
-        </w:rPr>
-        <w:t>w których wystąpiła sprzedaż nieruchomości lokalowych o funkcji mieszkalnej. W próbie znalazły się nieruchomości lokalowe o funkcji mieszkalnej</w:t>
+        <w:t xml:space="preserve">W okresie monitorowania rynku lokalnego odnotowano transakcje na badanym terenie, w których wystąpiła sprzedaż nieruchomości lokalowych o funkcji mieszkalnej. Ceny transakcyjne w analizowanym segmencie wykazują zróżnicowanie zależne od standardu wykończenia, położenia oraz powierzchni lokali.</w:t>
+      </w:r>
+      <w:r>
+        <w:rPr>
+          <w:rFonts w:ascii="Segoe UI" w:hAnsi="Segoe UI" w:cs="Segoe UI"/>
+          <w:sz w:val="20"/>
+          <w:szCs w:val="20"/>
+        </w:rPr>
+        <w:t xml:space="preserve"/>
+      </w:r>
+      <w:r>
+        <w:rPr>
+          <w:rFonts w:ascii="Segoe UI" w:hAnsi="Segoe UI" w:cs="Segoe UI"/>
+          <w:sz w:val="20"/>
+          <w:szCs w:val="20"/>
+        </w:rPr>
+        <w:t/>
+      </w:r>
+      <w:r>
+        <w:rPr>
+          <w:rFonts w:ascii="Segoe UI" w:hAnsi="Segoe UI" w:cs="Segoe UI"/>
+          <w:sz w:val="20"/>
+          <w:szCs w:val="20"/>
+        </w:rPr>
+        <w:t xml:space="preserve"/>
+      </w:r>
+      <w:r>
+        <w:rPr>
+          <w:rFonts w:ascii="Segoe UI" w:hAnsi="Segoe UI" w:cs="Segoe UI"/>
+          <w:sz w:val="20"/>
+          <w:szCs w:val="20"/>
+        </w:rPr>
+        <w:t/>
       </w:r>
       <w:r>
         <w:rPr>
@@ -13401,31 +13401,31 @@
           <w:sz w:val="20"/>
           <w:szCs w:val="20"/>
         </w:rPr>
-        <w:t xml:space="preserve"> </w:t>
-      </w:r>
-      <w:r>
-        <w:rPr>
-          <w:rFonts w:ascii="Segoe UI" w:hAnsi="Segoe UI" w:cs="Segoe UI"/>
-          <w:sz w:val="20"/>
-          <w:szCs w:val="20"/>
-        </w:rPr>
-        <w:t xml:space="preserve">o powierzchni użytkowej od </w:t>
-      </w:r>
-      <w:r>
-        <w:rPr>
-          <w:rFonts w:ascii="Segoe UI" w:hAnsi="Segoe UI" w:cs="Segoe UI"/>
-          <w:sz w:val="20"/>
-          <w:szCs w:val="20"/>
-        </w:rPr>
-        <w:t>50,13</w:t>
-      </w:r>
-      <w:r>
-        <w:rPr>
-          <w:rFonts w:ascii="Segoe UI" w:hAnsi="Segoe UI" w:cs="Segoe UI"/>
-          <w:sz w:val="20"/>
-          <w:szCs w:val="20"/>
-        </w:rPr>
-        <w:t xml:space="preserve"> m</w:t>
+        <w:t xml:space="preserve"/>
+      </w:r>
+      <w:r>
+        <w:rPr>
+          <w:rFonts w:ascii="Segoe UI" w:hAnsi="Segoe UI" w:cs="Segoe UI"/>
+          <w:sz w:val="20"/>
+          <w:szCs w:val="20"/>
+        </w:rPr>
+        <w:t xml:space="preserve"/>
+      </w:r>
+      <w:r>
+        <w:rPr>
+          <w:rFonts w:ascii="Segoe UI" w:hAnsi="Segoe UI" w:cs="Segoe UI"/>
+          <w:sz w:val="20"/>
+          <w:szCs w:val="20"/>
+        </w:rPr>
+        <w:t/>
+      </w:r>
+      <w:r>
+        <w:rPr>
+          <w:rFonts w:ascii="Segoe UI" w:hAnsi="Segoe UI" w:cs="Segoe UI"/>
+          <w:sz w:val="20"/>
+          <w:szCs w:val="20"/>
+        </w:rPr>
+        <w:t xml:space="preserve"/>
       </w:r>
       <w:r>
         <w:rPr>
@@ -13434,31 +13434,31 @@
           <w:szCs w:val="20"/>
           <w:vertAlign w:val="superscript"/>
         </w:rPr>
-        <w:t>2</w:t>
-      </w:r>
-      <w:r>
-        <w:rPr>
-          <w:rFonts w:ascii="Segoe UI" w:hAnsi="Segoe UI" w:cs="Segoe UI"/>
-          <w:sz w:val="20"/>
-          <w:szCs w:val="20"/>
-        </w:rPr>
-        <w:t xml:space="preserve"> do </w:t>
-      </w:r>
-      <w:r>
-        <w:rPr>
-          <w:rFonts w:ascii="Segoe UI" w:hAnsi="Segoe UI" w:cs="Segoe UI"/>
-          <w:sz w:val="20"/>
-          <w:szCs w:val="20"/>
-        </w:rPr>
-        <w:t>76,41</w:t>
-      </w:r>
-      <w:r>
-        <w:rPr>
-          <w:rFonts w:ascii="Segoe UI" w:hAnsi="Segoe UI" w:cs="Segoe UI"/>
-          <w:sz w:val="20"/>
-          <w:szCs w:val="20"/>
-        </w:rPr>
-        <w:t xml:space="preserve"> m</w:t>
+        <w:t/>
+      </w:r>
+      <w:r>
+        <w:rPr>
+          <w:rFonts w:ascii="Segoe UI" w:hAnsi="Segoe UI" w:cs="Segoe UI"/>
+          <w:sz w:val="20"/>
+          <w:szCs w:val="20"/>
+        </w:rPr>
+        <w:t xml:space="preserve"/>
+      </w:r>
+      <w:r>
+        <w:rPr>
+          <w:rFonts w:ascii="Segoe UI" w:hAnsi="Segoe UI" w:cs="Segoe UI"/>
+          <w:sz w:val="20"/>
+          <w:szCs w:val="20"/>
+        </w:rPr>
+        <w:t/>
+      </w:r>
+      <w:r>
+        <w:rPr>
+          <w:rFonts w:ascii="Segoe UI" w:hAnsi="Segoe UI" w:cs="Segoe UI"/>
+          <w:sz w:val="20"/>
+          <w:szCs w:val="20"/>
+        </w:rPr>
+        <w:t xml:space="preserve"/>
       </w:r>
       <w:r>
         <w:rPr>
@@ -13467,47 +13467,47 @@
           <w:szCs w:val="20"/>
           <w:vertAlign w:val="superscript"/>
         </w:rPr>
-        <w:t>2</w:t>
-      </w:r>
-      <w:r>
-        <w:rPr>
-          <w:rFonts w:ascii="Segoe UI" w:hAnsi="Segoe UI" w:cs="Segoe UI"/>
-          <w:sz w:val="20"/>
-          <w:szCs w:val="20"/>
-        </w:rPr>
-        <w:t xml:space="preserve">. Jednostkowe ceny transakcyjne znajdowały się w przedziale od </w:t>
-      </w:r>
-      <w:r>
-        <w:rPr>
-          <w:rFonts w:ascii="Segoe UI" w:hAnsi="Segoe UI" w:cs="Segoe UI"/>
-          <w:sz w:val="20"/>
-          <w:szCs w:val="20"/>
-        </w:rPr>
-        <w:t>10 967,74</w:t>
-      </w:r>
-      <w:r>
-        <w:rPr>
-          <w:rFonts w:ascii="Segoe UI" w:hAnsi="Segoe UI" w:cs="Segoe UI"/>
-          <w:sz w:val="20"/>
-          <w:szCs w:val="20"/>
-        </w:rPr>
-        <w:t xml:space="preserve"> zł do </w:t>
-      </w:r>
-      <w:r>
-        <w:rPr>
-          <w:rFonts w:ascii="Segoe UI" w:hAnsi="Segoe UI" w:cs="Segoe UI"/>
-          <w:sz w:val="20"/>
-          <w:szCs w:val="20"/>
-        </w:rPr>
-        <w:t>15 112,59</w:t>
-      </w:r>
-      <w:r>
-        <w:rPr>
-          <w:rFonts w:ascii="Segoe UI" w:hAnsi="Segoe UI" w:cs="Segoe UI"/>
-          <w:sz w:val="20"/>
-          <w:szCs w:val="20"/>
-        </w:rPr>
-        <w:t xml:space="preserve"> zł za 1 m</w:t>
+        <w:t/>
+      </w:r>
+      <w:r>
+        <w:rPr>
+          <w:rFonts w:ascii="Segoe UI" w:hAnsi="Segoe UI" w:cs="Segoe UI"/>
+          <w:sz w:val="20"/>
+          <w:szCs w:val="20"/>
+        </w:rPr>
+        <w:t xml:space="preserve"/>
+      </w:r>
+      <w:r>
+        <w:rPr>
+          <w:rFonts w:ascii="Segoe UI" w:hAnsi="Segoe UI" w:cs="Segoe UI"/>
+          <w:sz w:val="20"/>
+          <w:szCs w:val="20"/>
+        </w:rPr>
+        <w:t/>
+      </w:r>
+      <w:r>
+        <w:rPr>
+          <w:rFonts w:ascii="Segoe UI" w:hAnsi="Segoe UI" w:cs="Segoe UI"/>
+          <w:sz w:val="20"/>
+          <w:szCs w:val="20"/>
+        </w:rPr>
+        <w:t xml:space="preserve"/>
+      </w:r>
+      <w:r>
+        <w:rPr>
+          <w:rFonts w:ascii="Segoe UI" w:hAnsi="Segoe UI" w:cs="Segoe UI"/>
+          <w:sz w:val="20"/>
+          <w:szCs w:val="20"/>
+        </w:rPr>
+        <w:t/>
+      </w:r>
+      <w:r>
+        <w:rPr>
+          <w:rFonts w:ascii="Segoe UI" w:hAnsi="Segoe UI" w:cs="Segoe UI"/>
+          <w:sz w:val="20"/>
+          <w:szCs w:val="20"/>
+        </w:rPr>
+        <w:t xml:space="preserve"/>
       </w:r>
       <w:r>
         <w:rPr>
@@ -13516,31 +13516,31 @@
           <w:szCs w:val="20"/>
           <w:vertAlign w:val="superscript"/>
         </w:rPr>
-        <w:t>2</w:t>
-      </w:r>
-      <w:r>
-        <w:rPr>
-          <w:rFonts w:ascii="Segoe UI" w:hAnsi="Segoe UI" w:cs="Segoe UI"/>
-          <w:sz w:val="20"/>
-          <w:szCs w:val="20"/>
-        </w:rPr>
-        <w:t xml:space="preserve"> powierzchni użytkowej lokalu. Średnia cena została ustalona na poziomie </w:t>
-      </w:r>
-      <w:r>
-        <w:rPr>
-          <w:rFonts w:ascii="Segoe UI" w:hAnsi="Segoe UI" w:cs="Segoe UI"/>
-          <w:sz w:val="20"/>
-          <w:szCs w:val="20"/>
-        </w:rPr>
-        <w:t>13 150,13</w:t>
-      </w:r>
-      <w:r>
-        <w:rPr>
-          <w:rFonts w:ascii="Segoe UI" w:hAnsi="Segoe UI" w:cs="Segoe UI"/>
-          <w:sz w:val="20"/>
-          <w:szCs w:val="20"/>
-        </w:rPr>
-        <w:t xml:space="preserve"> zł za 1 m</w:t>
+        <w:t/>
+      </w:r>
+      <w:r>
+        <w:rPr>
+          <w:rFonts w:ascii="Segoe UI" w:hAnsi="Segoe UI" w:cs="Segoe UI"/>
+          <w:sz w:val="20"/>
+          <w:szCs w:val="20"/>
+        </w:rPr>
+        <w:t xml:space="preserve"/>
+      </w:r>
+      <w:r>
+        <w:rPr>
+          <w:rFonts w:ascii="Segoe UI" w:hAnsi="Segoe UI" w:cs="Segoe UI"/>
+          <w:sz w:val="20"/>
+          <w:szCs w:val="20"/>
+        </w:rPr>
+        <w:t/>
+      </w:r>
+      <w:r>
+        <w:rPr>
+          <w:rFonts w:ascii="Segoe UI" w:hAnsi="Segoe UI" w:cs="Segoe UI"/>
+          <w:sz w:val="20"/>
+          <w:szCs w:val="20"/>
+        </w:rPr>
+        <w:t xml:space="preserve"/>
       </w:r>
       <w:r>
         <w:rPr>
@@ -13549,71 +13549,71 @@
           <w:szCs w:val="20"/>
           <w:vertAlign w:val="superscript"/>
         </w:rPr>
-        <w:t>2</w:t>
-      </w:r>
-      <w:r>
-        <w:rPr>
-          <w:rFonts w:ascii="Segoe UI" w:hAnsi="Segoe UI" w:cs="Segoe UI"/>
-          <w:sz w:val="20"/>
-          <w:szCs w:val="20"/>
-        </w:rPr>
-        <w:t xml:space="preserve">. Ceny transakcyjne kształtowały się od </w:t>
-      </w:r>
-      <w:r>
-        <w:rPr>
-          <w:rFonts w:ascii="Segoe UI" w:hAnsi="Segoe UI" w:cs="Segoe UI"/>
-          <w:sz w:val="20"/>
-          <w:szCs w:val="20"/>
-        </w:rPr>
-        <w:t>675</w:t>
-      </w:r>
-      <w:r>
-        <w:rPr>
-          <w:rFonts w:ascii="Segoe UI" w:hAnsi="Segoe UI" w:cs="Segoe UI"/>
-          <w:sz w:val="20"/>
-          <w:szCs w:val="20"/>
-        </w:rPr>
-        <w:t xml:space="preserve"> 000</w:t>
-      </w:r>
-      <w:r>
-        <w:rPr>
-          <w:rFonts w:ascii="Segoe UI" w:hAnsi="Segoe UI" w:cs="Segoe UI"/>
-          <w:sz w:val="20"/>
-          <w:szCs w:val="20"/>
-        </w:rPr>
-        <w:t xml:space="preserve"> zł do </w:t>
-      </w:r>
-      <w:r>
-        <w:rPr>
-          <w:rFonts w:ascii="Segoe UI" w:hAnsi="Segoe UI" w:cs="Segoe UI"/>
-          <w:sz w:val="20"/>
-          <w:szCs w:val="20"/>
-        </w:rPr>
-        <w:t>1 040</w:t>
-      </w:r>
-      <w:r>
-        <w:rPr>
-          <w:rFonts w:ascii="Segoe UI" w:hAnsi="Segoe UI" w:cs="Segoe UI"/>
-          <w:sz w:val="20"/>
-          <w:szCs w:val="20"/>
-        </w:rPr>
-        <w:t xml:space="preserve"> 000 zł. Średnia cena wyniosła </w:t>
-      </w:r>
-      <w:r>
-        <w:rPr>
-          <w:rFonts w:ascii="Segoe UI" w:hAnsi="Segoe UI" w:cs="Segoe UI"/>
-          <w:sz w:val="20"/>
-          <w:szCs w:val="20"/>
-        </w:rPr>
-        <w:t>844 421</w:t>
-      </w:r>
-      <w:r>
-        <w:rPr>
-          <w:rFonts w:ascii="Segoe UI" w:hAnsi="Segoe UI" w:cs="Segoe UI"/>
-          <w:sz w:val="20"/>
-          <w:szCs w:val="20"/>
-        </w:rPr>
-        <w:t xml:space="preserve"> zł. </w:t>
+        <w:t/>
+      </w:r>
+      <w:r>
+        <w:rPr>
+          <w:rFonts w:ascii="Segoe UI" w:hAnsi="Segoe UI" w:cs="Segoe UI"/>
+          <w:sz w:val="20"/>
+          <w:szCs w:val="20"/>
+        </w:rPr>
+        <w:t xml:space="preserve"/>
+      </w:r>
+      <w:r>
+        <w:rPr>
+          <w:rFonts w:ascii="Segoe UI" w:hAnsi="Segoe UI" w:cs="Segoe UI"/>
+          <w:sz w:val="20"/>
+          <w:szCs w:val="20"/>
+        </w:rPr>
+        <w:t/>
+      </w:r>
+      <w:r>
+        <w:rPr>
+          <w:rFonts w:ascii="Segoe UI" w:hAnsi="Segoe UI" w:cs="Segoe UI"/>
+          <w:sz w:val="20"/>
+          <w:szCs w:val="20"/>
+        </w:rPr>
+        <w:t xml:space="preserve"/>
+      </w:r>
+      <w:r>
+        <w:rPr>
+          <w:rFonts w:ascii="Segoe UI" w:hAnsi="Segoe UI" w:cs="Segoe UI"/>
+          <w:sz w:val="20"/>
+          <w:szCs w:val="20"/>
+        </w:rPr>
+        <w:t xml:space="preserve"/>
+      </w:r>
+      <w:r>
+        <w:rPr>
+          <w:rFonts w:ascii="Segoe UI" w:hAnsi="Segoe UI" w:cs="Segoe UI"/>
+          <w:sz w:val="20"/>
+          <w:szCs w:val="20"/>
+        </w:rPr>
+        <w:t/>
+      </w:r>
+      <w:r>
+        <w:rPr>
+          <w:rFonts w:ascii="Segoe UI" w:hAnsi="Segoe UI" w:cs="Segoe UI"/>
+          <w:sz w:val="20"/>
+          <w:szCs w:val="20"/>
+        </w:rPr>
+        <w:t xml:space="preserve"/>
+      </w:r>
+      <w:r>
+        <w:rPr>
+          <w:rFonts w:ascii="Segoe UI" w:hAnsi="Segoe UI" w:cs="Segoe UI"/>
+          <w:sz w:val="20"/>
+          <w:szCs w:val="20"/>
+        </w:rPr>
+        <w:t/>
+      </w:r>
+      <w:r>
+        <w:rPr>
+          <w:rFonts w:ascii="Segoe UI" w:hAnsi="Segoe UI" w:cs="Segoe UI"/>
+          <w:sz w:val="20"/>
+          <w:szCs w:val="20"/>
+        </w:rPr>
+        <w:t xml:space="preserve"/>
       </w:r>
     </w:p>
     <w:p>
@@ -13737,7 +13737,7 @@
           <w:sz w:val="20"/>
           <w:szCs w:val="20"/>
         </w:rPr>
-        <w:t>W próbie znalazły się nieruchomości lokalowe o funkcji mieszkalnej</w:t>
+        <w:t xml:space="preserve">W próbie znalazły się nieruchomości lokalowe o funkcji mieszkalnej, położone w budynkach mieszkalnych o powierzchni użytkowej od 61,35 m2 do 76,41 m2. Jednostkowe ceny transakcyjne lokali mieszkalnych znajdowały się w przedziale od {cena_min} zł do {cena_max} zł za 1 m2 powierzchni użytkowej lokalu. Średnia cena została ustalona na poziomie {cena_sr} zł za 1 m2.</w:t>
       </w:r>
       <w:r>
         <w:rPr>
@@ -13745,31 +13745,31 @@
           <w:sz w:val="20"/>
           <w:szCs w:val="20"/>
         </w:rPr>
-        <w:t xml:space="preserve">, położone w budynkach mieszkalnych </w:t>
-      </w:r>
-      <w:r>
-        <w:rPr>
-          <w:rFonts w:ascii="Segoe UI" w:hAnsi="Segoe UI" w:cs="Segoe UI"/>
-          <w:sz w:val="20"/>
-          <w:szCs w:val="20"/>
-        </w:rPr>
-        <w:t xml:space="preserve">o powierzchni użytkowej od </w:t>
-      </w:r>
-      <w:r>
-        <w:rPr>
-          <w:rFonts w:ascii="Segoe UI" w:hAnsi="Segoe UI" w:cs="Segoe UI"/>
-          <w:sz w:val="20"/>
-          <w:szCs w:val="20"/>
-        </w:rPr>
-        <w:t>61,35</w:t>
-      </w:r>
-      <w:r>
-        <w:rPr>
-          <w:rFonts w:ascii="Segoe UI" w:hAnsi="Segoe UI" w:cs="Segoe UI"/>
-          <w:sz w:val="20"/>
-          <w:szCs w:val="20"/>
-        </w:rPr>
-        <w:t xml:space="preserve"> m</w:t>
+        <w:t xml:space="preserve"/>
+      </w:r>
+      <w:r>
+        <w:rPr>
+          <w:rFonts w:ascii="Segoe UI" w:hAnsi="Segoe UI" w:cs="Segoe UI"/>
+          <w:sz w:val="20"/>
+          <w:szCs w:val="20"/>
+        </w:rPr>
+        <w:t xml:space="preserve"/>
+      </w:r>
+      <w:r>
+        <w:rPr>
+          <w:rFonts w:ascii="Segoe UI" w:hAnsi="Segoe UI" w:cs="Segoe UI"/>
+          <w:sz w:val="20"/>
+          <w:szCs w:val="20"/>
+        </w:rPr>
+        <w:t/>
+      </w:r>
+      <w:r>
+        <w:rPr>
+          <w:rFonts w:ascii="Segoe UI" w:hAnsi="Segoe UI" w:cs="Segoe UI"/>
+          <w:sz w:val="20"/>
+          <w:szCs w:val="20"/>
+        </w:rPr>
+        <w:t xml:space="preserve"/>
       </w:r>
       <w:r>
         <w:rPr>
@@ -13778,31 +13778,31 @@
           <w:szCs w:val="20"/>
           <w:vertAlign w:val="superscript"/>
         </w:rPr>
-        <w:t>2</w:t>
-      </w:r>
-      <w:r>
-        <w:rPr>
-          <w:rFonts w:ascii="Segoe UI" w:hAnsi="Segoe UI" w:cs="Segoe UI"/>
-          <w:sz w:val="20"/>
-          <w:szCs w:val="20"/>
-        </w:rPr>
-        <w:t xml:space="preserve"> do </w:t>
-      </w:r>
-      <w:r>
-        <w:rPr>
-          <w:rFonts w:ascii="Segoe UI" w:hAnsi="Segoe UI" w:cs="Segoe UI"/>
-          <w:sz w:val="20"/>
-          <w:szCs w:val="20"/>
-        </w:rPr>
-        <w:t>76,41</w:t>
-      </w:r>
-      <w:r>
-        <w:rPr>
-          <w:rFonts w:ascii="Segoe UI" w:hAnsi="Segoe UI" w:cs="Segoe UI"/>
-          <w:sz w:val="20"/>
-          <w:szCs w:val="20"/>
-        </w:rPr>
-        <w:t xml:space="preserve"> m</w:t>
+        <w:t/>
+      </w:r>
+      <w:r>
+        <w:rPr>
+          <w:rFonts w:ascii="Segoe UI" w:hAnsi="Segoe UI" w:cs="Segoe UI"/>
+          <w:sz w:val="20"/>
+          <w:szCs w:val="20"/>
+        </w:rPr>
+        <w:t xml:space="preserve"/>
+      </w:r>
+      <w:r>
+        <w:rPr>
+          <w:rFonts w:ascii="Segoe UI" w:hAnsi="Segoe UI" w:cs="Segoe UI"/>
+          <w:sz w:val="20"/>
+          <w:szCs w:val="20"/>
+        </w:rPr>
+        <w:t/>
+      </w:r>
+      <w:r>
+        <w:rPr>
+          <w:rFonts w:ascii="Segoe UI" w:hAnsi="Segoe UI" w:cs="Segoe UI"/>
+          <w:sz w:val="20"/>
+          <w:szCs w:val="20"/>
+        </w:rPr>
+        <w:t xml:space="preserve"/>
       </w:r>
       <w:r>
         <w:rPr>
@@ -13811,55 +13811,55 @@
           <w:szCs w:val="20"/>
           <w:vertAlign w:val="superscript"/>
         </w:rPr>
-        <w:t>2</w:t>
-      </w:r>
-      <w:r>
-        <w:rPr>
-          <w:rFonts w:ascii="Segoe UI" w:hAnsi="Segoe UI" w:cs="Segoe UI"/>
-          <w:sz w:val="20"/>
-          <w:szCs w:val="20"/>
-        </w:rPr>
-        <w:t xml:space="preserve">. Jednostkowe ceny transakcyjne lokali mieszkalnych znajdowały się w przedziale od </w:t>
-      </w:r>
-      <w:r>
-        <w:rPr>
-          <w:rFonts w:ascii="Segoe UI" w:hAnsi="Segoe UI" w:cs="Segoe UI"/>
-          <w:sz w:val="20"/>
-          <w:szCs w:val="20"/>
-        </w:rPr>
-        <w:t xml:space="preserve">{cena_min}</w:t>
-      </w:r>
-      <w:r>
-        <w:rPr>
-          <w:rFonts w:ascii="Segoe UI" w:hAnsi="Segoe UI" w:cs="Segoe UI"/>
-          <w:sz w:val="20"/>
-          <w:szCs w:val="20"/>
-        </w:rPr>
-        <w:t xml:space="preserve"> </w:t>
-      </w:r>
-      <w:r>
-        <w:rPr>
-          <w:rFonts w:ascii="Segoe UI" w:hAnsi="Segoe UI" w:cs="Segoe UI"/>
-          <w:sz w:val="20"/>
-          <w:szCs w:val="20"/>
-        </w:rPr>
-        <w:t xml:space="preserve">zł do </w:t>
-      </w:r>
-      <w:r>
-        <w:rPr>
-          <w:rFonts w:ascii="Segoe UI" w:hAnsi="Segoe UI" w:cs="Segoe UI"/>
-          <w:sz w:val="20"/>
-          <w:szCs w:val="20"/>
-        </w:rPr>
-        <w:t xml:space="preserve">{cena_max}</w:t>
-      </w:r>
-      <w:r>
-        <w:rPr>
-          <w:rFonts w:ascii="Segoe UI" w:hAnsi="Segoe UI" w:cs="Segoe UI"/>
-          <w:sz w:val="20"/>
-          <w:szCs w:val="20"/>
-        </w:rPr>
-        <w:t xml:space="preserve"> zł za 1 m</w:t>
+        <w:t/>
+      </w:r>
+      <w:r>
+        <w:rPr>
+          <w:rFonts w:ascii="Segoe UI" w:hAnsi="Segoe UI" w:cs="Segoe UI"/>
+          <w:sz w:val="20"/>
+          <w:szCs w:val="20"/>
+        </w:rPr>
+        <w:t xml:space="preserve"/>
+      </w:r>
+      <w:r>
+        <w:rPr>
+          <w:rFonts w:ascii="Segoe UI" w:hAnsi="Segoe UI" w:cs="Segoe UI"/>
+          <w:sz w:val="20"/>
+          <w:szCs w:val="20"/>
+        </w:rPr>
+        <w:t/>
+      </w:r>
+      <w:r>
+        <w:rPr>
+          <w:rFonts w:ascii="Segoe UI" w:hAnsi="Segoe UI" w:cs="Segoe UI"/>
+          <w:sz w:val="20"/>
+          <w:szCs w:val="20"/>
+        </w:rPr>
+        <w:t xml:space="preserve"/>
+      </w:r>
+      <w:r>
+        <w:rPr>
+          <w:rFonts w:ascii="Segoe UI" w:hAnsi="Segoe UI" w:cs="Segoe UI"/>
+          <w:sz w:val="20"/>
+          <w:szCs w:val="20"/>
+        </w:rPr>
+        <w:t xml:space="preserve"/>
+      </w:r>
+      <w:r>
+        <w:rPr>
+          <w:rFonts w:ascii="Segoe UI" w:hAnsi="Segoe UI" w:cs="Segoe UI"/>
+          <w:sz w:val="20"/>
+          <w:szCs w:val="20"/>
+        </w:rPr>
+        <w:t/>
+      </w:r>
+      <w:r>
+        <w:rPr>
+          <w:rFonts w:ascii="Segoe UI" w:hAnsi="Segoe UI" w:cs="Segoe UI"/>
+          <w:sz w:val="20"/>
+          <w:szCs w:val="20"/>
+        </w:rPr>
+        <w:t xml:space="preserve"/>
       </w:r>
       <w:r>
         <w:rPr>
@@ -13868,31 +13868,31 @@
           <w:szCs w:val="20"/>
           <w:vertAlign w:val="superscript"/>
         </w:rPr>
-        <w:t>2</w:t>
-      </w:r>
-      <w:r>
-        <w:rPr>
-          <w:rFonts w:ascii="Segoe UI" w:hAnsi="Segoe UI" w:cs="Segoe UI"/>
-          <w:sz w:val="20"/>
-          <w:szCs w:val="20"/>
-        </w:rPr>
-        <w:t xml:space="preserve"> powierzchni użytkowej lokalu. Średnia cena została ustalona na poziomie </w:t>
-      </w:r>
-      <w:r>
-        <w:rPr>
-          <w:rFonts w:ascii="Segoe UI" w:hAnsi="Segoe UI" w:cs="Segoe UI"/>
-          <w:sz w:val="20"/>
-          <w:szCs w:val="20"/>
-        </w:rPr>
-        <w:t xml:space="preserve">{cena_sr}</w:t>
-      </w:r>
-      <w:r>
-        <w:rPr>
-          <w:rFonts w:ascii="Segoe UI" w:hAnsi="Segoe UI" w:cs="Segoe UI"/>
-          <w:sz w:val="20"/>
-          <w:szCs w:val="20"/>
-        </w:rPr>
-        <w:t xml:space="preserve"> zł za 1 m</w:t>
+        <w:t/>
+      </w:r>
+      <w:r>
+        <w:rPr>
+          <w:rFonts w:ascii="Segoe UI" w:hAnsi="Segoe UI" w:cs="Segoe UI"/>
+          <w:sz w:val="20"/>
+          <w:szCs w:val="20"/>
+        </w:rPr>
+        <w:t xml:space="preserve"/>
+      </w:r>
+      <w:r>
+        <w:rPr>
+          <w:rFonts w:ascii="Segoe UI" w:hAnsi="Segoe UI" w:cs="Segoe UI"/>
+          <w:sz w:val="20"/>
+          <w:szCs w:val="20"/>
+        </w:rPr>
+        <w:t/>
+      </w:r>
+      <w:r>
+        <w:rPr>
+          <w:rFonts w:ascii="Segoe UI" w:hAnsi="Segoe UI" w:cs="Segoe UI"/>
+          <w:sz w:val="20"/>
+          <w:szCs w:val="20"/>
+        </w:rPr>
+        <w:t xml:space="preserve"/>
       </w:r>
       <w:r>
         <w:rPr>
@@ -13901,63 +13901,63 @@
           <w:szCs w:val="20"/>
           <w:vertAlign w:val="superscript"/>
         </w:rPr>
-        <w:t>2</w:t>
-      </w:r>
-      <w:r>
-        <w:rPr>
-          <w:rFonts w:ascii="Segoe UI" w:hAnsi="Segoe UI" w:cs="Segoe UI"/>
-          <w:sz w:val="20"/>
-          <w:szCs w:val="20"/>
-        </w:rPr>
-        <w:t xml:space="preserve">. Ceny transakcyjne kształtowały się od </w:t>
-      </w:r>
-      <w:r>
-        <w:rPr>
-          <w:rFonts w:ascii="Segoe UI" w:hAnsi="Segoe UI" w:cs="Segoe UI"/>
-          <w:sz w:val="20"/>
-          <w:szCs w:val="20"/>
-        </w:rPr>
-        <w:t>740 000</w:t>
-      </w:r>
-      <w:r>
-        <w:rPr>
-          <w:rFonts w:ascii="Segoe UI" w:hAnsi="Segoe UI" w:cs="Segoe UI"/>
-          <w:sz w:val="20"/>
-          <w:szCs w:val="20"/>
-        </w:rPr>
-        <w:t xml:space="preserve"> zł do </w:t>
-      </w:r>
-      <w:r>
-        <w:rPr>
-          <w:rFonts w:ascii="Segoe UI" w:hAnsi="Segoe UI" w:cs="Segoe UI"/>
-          <w:sz w:val="20"/>
-          <w:szCs w:val="20"/>
-        </w:rPr>
-        <w:t>1 040 000</w:t>
-      </w:r>
-      <w:r>
-        <w:rPr>
-          <w:rFonts w:ascii="Segoe UI" w:hAnsi="Segoe UI" w:cs="Segoe UI"/>
-          <w:sz w:val="20"/>
-          <w:szCs w:val="20"/>
-        </w:rPr>
-        <w:t xml:space="preserve"> zł. Średnia cena wyniosła </w:t>
-      </w:r>
-      <w:r>
-        <w:rPr>
-          <w:rFonts w:ascii="Segoe UI" w:hAnsi="Segoe UI" w:cs="Segoe UI"/>
-          <w:sz w:val="20"/>
-          <w:szCs w:val="20"/>
-        </w:rPr>
-        <w:t>874 333</w:t>
-      </w:r>
-      <w:r>
-        <w:rPr>
-          <w:rFonts w:ascii="Segoe UI" w:hAnsi="Segoe UI" w:cs="Segoe UI"/>
-          <w:sz w:val="20"/>
-          <w:szCs w:val="20"/>
-        </w:rPr>
-        <w:t xml:space="preserve"> zł.</w:t>
+        <w:t/>
+      </w:r>
+      <w:r>
+        <w:rPr>
+          <w:rFonts w:ascii="Segoe UI" w:hAnsi="Segoe UI" w:cs="Segoe UI"/>
+          <w:sz w:val="20"/>
+          <w:szCs w:val="20"/>
+        </w:rPr>
+        <w:t xml:space="preserve"/>
+      </w:r>
+      <w:r>
+        <w:rPr>
+          <w:rFonts w:ascii="Segoe UI" w:hAnsi="Segoe UI" w:cs="Segoe UI"/>
+          <w:sz w:val="20"/>
+          <w:szCs w:val="20"/>
+        </w:rPr>
+        <w:t/>
+      </w:r>
+      <w:r>
+        <w:rPr>
+          <w:rFonts w:ascii="Segoe UI" w:hAnsi="Segoe UI" w:cs="Segoe UI"/>
+          <w:sz w:val="20"/>
+          <w:szCs w:val="20"/>
+        </w:rPr>
+        <w:t xml:space="preserve"/>
+      </w:r>
+      <w:r>
+        <w:rPr>
+          <w:rFonts w:ascii="Segoe UI" w:hAnsi="Segoe UI" w:cs="Segoe UI"/>
+          <w:sz w:val="20"/>
+          <w:szCs w:val="20"/>
+        </w:rPr>
+        <w:t/>
+      </w:r>
+      <w:r>
+        <w:rPr>
+          <w:rFonts w:ascii="Segoe UI" w:hAnsi="Segoe UI" w:cs="Segoe UI"/>
+          <w:sz w:val="20"/>
+          <w:szCs w:val="20"/>
+        </w:rPr>
+        <w:t xml:space="preserve"/>
+      </w:r>
+      <w:r>
+        <w:rPr>
+          <w:rFonts w:ascii="Segoe UI" w:hAnsi="Segoe UI" w:cs="Segoe UI"/>
+          <w:sz w:val="20"/>
+          <w:szCs w:val="20"/>
+        </w:rPr>
+        <w:t/>
+      </w:r>
+      <w:r>
+        <w:rPr>
+          <w:rFonts w:ascii="Segoe UI" w:hAnsi="Segoe UI" w:cs="Segoe UI"/>
+          <w:sz w:val="20"/>
+          <w:szCs w:val="20"/>
+        </w:rPr>
+        <w:t xml:space="preserve"/>
       </w:r>
     </w:p>
     <w:p>
@@ -19408,7 +19408,7 @@
           <w:sz w:val="20"/>
           <w:szCs w:val="20"/>
         </w:rPr>
-        <w:t xml:space="preserve">Wyceniana nieruchomość mieści się w zbiorze zebranych transakcji, co jest adekwatne w stosunku do sytuacji na lokalnym rynku nieruchomości. Ponadto, dokonano analizy rynku ofertowego lokali mieszkalnych, położonych w rejonie wycenianej nieruchomości. Ceny ofertowe w przeliczeniu na 1 m2 znajdowały się w przedziale od około 14 800 zł/ m2 do około 18 169 zł/ m2. Należy podkreślić, iż ceny ofertowe podlegają negocjacjom cenowym. Reasumując, wynik uznaje się za bliski cenie możliwej do osiągnięcia w obrocie nieruchomościami na rynku lokalnym, potwierdzony i uzasadniony.</w:t>
+        <w:t xml:space="preserve">Wyceniana nieruchomość mieści się w zbiorze zebranych transakcji, co jest adekwatne w stosunku do sytuacji na lokalnym rynku nieruchomości. Ponadto, dokonano analizy rynku ofertowego lokali mieszkalnych, położonych w rejonie wycenianej nieruchomości. Jednostkowe ceny transakcyjne w analizowanym zbiorze znajdowały się w przedziale od {cena_min} zł/m2 do {cena_max} zł/m2. Należy podkreślić, iż ceny ofertowe podlegają negocjacjom cenowym. Reasumując, wynik uznaje się za bliski cenie możliwej do osiągnięcia w obrocie nieruchomościami na rynku lokalnym, potwierdzony i uzasadniony.</w:t>
       </w:r>
       <w:r>
         <w:rPr>

</xml_diff>

<commit_message>
fix: scrub source metadata from template docProps; fix heading typo
</commit_message>
<xml_diff>
--- a/apps/web/templates/operat-szablon.docx
+++ b/apps/web/templates/operat-szablon.docx
@@ -15408,7 +15408,7 @@
           <w:sz w:val="22"/>
           <w:szCs w:val="22"/>
         </w:rPr>
-        <w:t>Charakterystyka wycenianego lokalu mieszalnego i lokali przyjętych do porównań w aspekcie cech rynkowych</w:t>
+        <w:t xml:space="preserve">Charakterystyka wycenianego lokalu mieszkalnego i lokali przyjętych do porównań w aspekcie cech rynkowych</w:t>
       </w:r>
     </w:p>
     <w:p>
@@ -25151,16 +25151,4 @@
     </a:ext>
   </a:extLst>
 </a:theme>
-</file>
-
-<file path=customXml/item1.xml><?xml version="1.0" encoding="utf-8"?>
-<b:Sources xmlns:b="http://schemas.openxmlformats.org/officeDocument/2006/bibliography" xmlns="http://schemas.openxmlformats.org/officeDocument/2006/bibliography" SelectedStyle="\APASixthEditionOfficeOnline.xsl" StyleName="APA" Version="6"/>
-</file>
-
-<file path=customXml/itemProps1.xml><?xml version="1.0" encoding="utf-8"?>
-<ds:datastoreItem xmlns:ds="http://schemas.openxmlformats.org/officeDocument/2006/customXml" ds:itemID="{5B9DA81D-216C-4681-A79C-B23F1A38B8DA}">
-  <ds:schemaRefs>
-    <ds:schemaRef ds:uri="http://schemas.openxmlformats.org/officeDocument/2006/bibliography"/>
-  </ds:schemaRefs>
-</ds:datastoreItem>
 </file>
</xml_diff>

<commit_message>
feat(web): operat template placeholders for egib facts block and mpzp variants (f-12)
</commit_message>
<xml_diff>
--- a/apps/web/templates/operat-szablon.docx
+++ b/apps/web/templates/operat-szablon.docx
@@ -9485,6 +9485,21 @@
       </w:r>
     </w:p>
     <w:p>
+      <w:r>
+        <w:t xml:space="preserve">Dane ewidencyjne (EGiB): obręb {obreb}, arkusz mapy {arkusz}, działka nr {nr_dzialki}, powierzchnia ewidencyjna działki {pow_dzialki} ha, użytek {uzytek}.</w:t>
+      </w:r>
+    </w:p>
+    <w:p>
+      <w:r>
+        <w:t xml:space="preserve">Budynek: {budynek_rodzaj}, kondygnacje (nadziemne / podziemne): {kondygnacje}, rok budowy: {rok_budowy}.</w:t>
+      </w:r>
+    </w:p>
+    <w:p>
+      <w:r>
+        <w:t xml:space="preserve">Udział w nieruchomości wspólnej — wg odpisu księgi wieczystej.</w:t>
+      </w:r>
+    </w:p>
+    <w:p>
       <w:pPr>
         <w:pStyle w:val="iza2"/>
         <w:rPr>
@@ -10960,7 +10975,267 @@
           <w:sz w:val="20"/>
           <w:szCs w:val="20"/>
         </w:rPr>
-        <w:t xml:space="preserve">Wobec powyższego, przeznaczenie przedmiotowego terenu ustalono na podstawie zapisów obowiązującego miejscowego planu zagospodarowania przestrzennego. Szczegółowe oznaczenie planistyczne zostanie uzupełnione na podstawie dokumentacji planistycznej.</w:t>
+        <w:t xml:space="preserve">Przeznaczenie przedmiotowego terenu ustalono na podstawie dokumentacji planistycznej.</w:t>
+      </w:r>
+      <w:r>
+        <w:rPr>
+          <w:rFonts w:ascii="Segoe UI" w:hAnsi="Segoe UI" w:cs="Segoe UI"/>
+          <w:sz w:val="20"/>
+          <w:szCs w:val="20"/>
+        </w:rPr>
+        <w:t xml:space="preserve"/>
+      </w:r>
+      <w:r>
+        <w:rPr>
+          <w:rFonts w:ascii="Segoe UI" w:hAnsi="Segoe UI" w:cs="Segoe UI"/>
+          <w:sz w:val="20"/>
+          <w:szCs w:val="20"/>
+        </w:rPr>
+        <w:t xml:space="preserve"/>
+      </w:r>
+      <w:r>
+        <w:rPr>
+          <w:rFonts w:ascii="Segoe UI" w:hAnsi="Segoe UI" w:cs="Segoe UI"/>
+          <w:sz w:val="20"/>
+          <w:szCs w:val="20"/>
+        </w:rPr>
+        <w:t xml:space="preserve"/>
+      </w:r>
+      <w:r>
+        <w:rPr>
+          <w:rFonts w:ascii="Segoe UI" w:hAnsi="Segoe UI" w:cs="Segoe UI"/>
+          <w:sz w:val="20"/>
+          <w:szCs w:val="20"/>
+        </w:rPr>
+        <w:t xml:space="preserve"/>
+      </w:r>
+      <w:r>
+        <w:rPr>
+          <w:rFonts w:ascii="Segoe UI" w:hAnsi="Segoe UI" w:cs="Segoe UI"/>
+          <w:sz w:val="20"/>
+          <w:szCs w:val="20"/>
+        </w:rPr>
+        <w:t/>
+      </w:r>
+      <w:r>
+        <w:rPr>
+          <w:rFonts w:ascii="Segoe UI" w:hAnsi="Segoe UI" w:cs="Segoe UI"/>
+          <w:sz w:val="20"/>
+          <w:szCs w:val="20"/>
+        </w:rPr>
+        <w:t xml:space="preserve"/>
+      </w:r>
+      <w:r>
+        <w:rPr>
+          <w:rFonts w:ascii="Segoe UI" w:hAnsi="Segoe UI" w:cs="Segoe UI"/>
+          <w:sz w:val="20"/>
+          <w:szCs w:val="20"/>
+        </w:rPr>
+        <w:t xml:space="preserve"/>
+      </w:r>
+      <w:r>
+        <w:rPr>
+          <w:rFonts w:ascii="Segoe UI" w:hAnsi="Segoe UI" w:cs="Segoe UI"/>
+          <w:sz w:val="20"/>
+          <w:szCs w:val="20"/>
+        </w:rPr>
+        <w:t xml:space="preserve"/>
+      </w:r>
+      <w:r>
+        <w:rPr>
+          <w:rFonts w:ascii="Segoe UI" w:hAnsi="Segoe UI" w:cs="Segoe UI"/>
+          <w:sz w:val="20"/>
+          <w:szCs w:val="20"/>
+          <w:u w:val="single"/>
+        </w:rPr>
+        <w:t/>
+      </w:r>
+      <w:r>
+        <w:rPr>
+          <w:rFonts w:ascii="Segoe UI" w:hAnsi="Segoe UI" w:cs="Segoe UI"/>
+          <w:sz w:val="20"/>
+          <w:szCs w:val="20"/>
+          <w:u w:val="single"/>
+        </w:rPr>
+        <w:t/>
+      </w:r>
+      <w:r>
+        <w:rPr>
+          <w:rFonts w:ascii="Segoe UI" w:hAnsi="Segoe UI" w:cs="Segoe UI"/>
+          <w:sz w:val="20"/>
+          <w:szCs w:val="20"/>
+          <w:u w:val="single"/>
+        </w:rPr>
+        <w:t/>
+      </w:r>
+      <w:r>
+        <w:rPr>
+          <w:rFonts w:ascii="Segoe UI" w:hAnsi="Segoe UI" w:cs="Segoe UI"/>
+          <w:sz w:val="20"/>
+          <w:szCs w:val="20"/>
+          <w:u w:val="single"/>
+        </w:rPr>
+        <w:t xml:space="preserve"/>
+      </w:r>
+      <w:r>
+        <w:rPr>
+          <w:rFonts w:ascii="Segoe UI" w:hAnsi="Segoe UI" w:cs="Segoe UI"/>
+          <w:sz w:val="20"/>
+          <w:szCs w:val="20"/>
+          <w:u w:val="single"/>
+        </w:rPr>
+        <w:t/>
+      </w:r>
+    </w:p>
+    <w:p>
+      <w:pPr>
+        <w:spacing w:line="276" w:lineRule="auto"/>
+        <w:contextualSpacing/>
+        <w:jc w:val="both"/>
+        <w:rPr>
+          <w:rFonts w:ascii="Segoe UI" w:hAnsi="Segoe UI" w:cs="Segoe UI"/>
+          <w:sz w:val="20"/>
+          <w:szCs w:val="20"/>
+          <w:u w:val="single"/>
+        </w:rPr>
+      </w:pPr>
+      <w:r>
+        <w:rPr>
+          <w:rFonts w:ascii="Segoe UI" w:hAnsi="Segoe UI" w:cs="Segoe UI"/>
+          <w:sz w:val="20"/>
+          <w:szCs w:val="20"/>
+        </w:rPr>
+        <w:t xml:space="preserve">{#mpzp}Teren objęty miejscowym planem zagospodarowania przestrzennego: {nazwa} — symbol przeznaczenia {symbol}, uchwała nr {uchwala} z dnia {data}, publikacja: {publ}.{/mpzp}</w:t>
+      </w:r>
+      <w:r>
+        <w:rPr>
+          <w:rFonts w:ascii="Segoe UI" w:hAnsi="Segoe UI" w:cs="Segoe UI"/>
+          <w:sz w:val="20"/>
+          <w:szCs w:val="20"/>
+        </w:rPr>
+        <w:t xml:space="preserve"/>
+      </w:r>
+      <w:r>
+        <w:rPr>
+          <w:rFonts w:ascii="Segoe UI" w:hAnsi="Segoe UI" w:cs="Segoe UI"/>
+          <w:sz w:val="20"/>
+          <w:szCs w:val="20"/>
+        </w:rPr>
+        <w:t xml:space="preserve"/>
+      </w:r>
+      <w:r>
+        <w:rPr>
+          <w:rFonts w:ascii="Segoe UI" w:hAnsi="Segoe UI" w:cs="Segoe UI"/>
+          <w:sz w:val="20"/>
+          <w:szCs w:val="20"/>
+        </w:rPr>
+        <w:t xml:space="preserve"/>
+      </w:r>
+      <w:r>
+        <w:rPr>
+          <w:rFonts w:ascii="Segoe UI" w:hAnsi="Segoe UI" w:cs="Segoe UI"/>
+          <w:sz w:val="20"/>
+          <w:szCs w:val="20"/>
+        </w:rPr>
+        <w:t xml:space="preserve"/>
+      </w:r>
+      <w:r>
+        <w:rPr>
+          <w:rFonts w:ascii="Segoe UI" w:hAnsi="Segoe UI" w:cs="Segoe UI"/>
+          <w:sz w:val="20"/>
+          <w:szCs w:val="20"/>
+        </w:rPr>
+        <w:t/>
+      </w:r>
+      <w:r>
+        <w:rPr>
+          <w:rFonts w:ascii="Segoe UI" w:hAnsi="Segoe UI" w:cs="Segoe UI"/>
+          <w:sz w:val="20"/>
+          <w:szCs w:val="20"/>
+        </w:rPr>
+        <w:t xml:space="preserve"/>
+      </w:r>
+      <w:r>
+        <w:rPr>
+          <w:rFonts w:ascii="Segoe UI" w:hAnsi="Segoe UI" w:cs="Segoe UI"/>
+          <w:sz w:val="20"/>
+          <w:szCs w:val="20"/>
+        </w:rPr>
+        <w:t xml:space="preserve"/>
+      </w:r>
+      <w:r>
+        <w:rPr>
+          <w:rFonts w:ascii="Segoe UI" w:hAnsi="Segoe UI" w:cs="Segoe UI"/>
+          <w:sz w:val="20"/>
+          <w:szCs w:val="20"/>
+        </w:rPr>
+        <w:t xml:space="preserve"/>
+      </w:r>
+      <w:r>
+        <w:rPr>
+          <w:rFonts w:ascii="Segoe UI" w:hAnsi="Segoe UI" w:cs="Segoe UI"/>
+          <w:sz w:val="20"/>
+          <w:szCs w:val="20"/>
+          <w:u w:val="single"/>
+        </w:rPr>
+        <w:t/>
+      </w:r>
+      <w:r>
+        <w:rPr>
+          <w:rFonts w:ascii="Segoe UI" w:hAnsi="Segoe UI" w:cs="Segoe UI"/>
+          <w:sz w:val="20"/>
+          <w:szCs w:val="20"/>
+          <w:u w:val="single"/>
+        </w:rPr>
+        <w:t/>
+      </w:r>
+      <w:r>
+        <w:rPr>
+          <w:rFonts w:ascii="Segoe UI" w:hAnsi="Segoe UI" w:cs="Segoe UI"/>
+          <w:sz w:val="20"/>
+          <w:szCs w:val="20"/>
+          <w:u w:val="single"/>
+        </w:rPr>
+        <w:t/>
+      </w:r>
+      <w:r>
+        <w:rPr>
+          <w:rFonts w:ascii="Segoe UI" w:hAnsi="Segoe UI" w:cs="Segoe UI"/>
+          <w:sz w:val="20"/>
+          <w:szCs w:val="20"/>
+          <w:u w:val="single"/>
+        </w:rPr>
+        <w:t xml:space="preserve"/>
+      </w:r>
+      <w:r>
+        <w:rPr>
+          <w:rFonts w:ascii="Segoe UI" w:hAnsi="Segoe UI" w:cs="Segoe UI"/>
+          <w:sz w:val="20"/>
+          <w:szCs w:val="20"/>
+          <w:u w:val="single"/>
+        </w:rPr>
+        <w:t/>
+      </w:r>
+    </w:p>
+    <w:p>
+      <w:pPr>
+        <w:spacing w:line="276" w:lineRule="auto"/>
+        <w:contextualSpacing/>
+        <w:jc w:val="both"/>
+        <w:rPr>
+          <w:rFonts w:ascii="Segoe UI" w:hAnsi="Segoe UI" w:cs="Segoe UI"/>
+          <w:sz w:val="20"/>
+          <w:szCs w:val="20"/>
+          <w:u w:val="single"/>
+        </w:rPr>
+      </w:pPr>
+      <w:r>
+        <w:rPr>
+          <w:rFonts w:ascii="Segoe UI" w:hAnsi="Segoe UI" w:cs="Segoe UI"/>
+          <w:sz w:val="20"/>
+          <w:szCs w:val="20"/>
+        </w:rPr>
+        <w:t xml:space="preserve">{#mpzp_brak}Dla przedmiotowego terenu brak obowiązującego miejscowego planu zagospodarowania przestrzennego. Przeznaczenie określono na podstawie studium uwarunkowań i kierunków zagospodarowania przestrzennego lub decyzji o warunkach zabudowy: {przeznaczenie_studium}.{/mpzp_brak}</w:t>
       </w:r>
       <w:r>
         <w:rPr>

</xml_diff>

<commit_message>
feat: operat template kw examination block in 8.2 (f-12 red handoff)
</commit_message>
<xml_diff>
--- a/apps/web/templates/operat-szablon.docx
+++ b/apps/web/templates/operat-szablon.docx
@@ -9486,6 +9486,51 @@
     </w:p>
     <w:p>
       <w:r>
+        <w:t xml:space="preserve">{#kw_badanie}Badanie ksiąg wieczystych przeprowadzono na podstawie: {kw_zrodlo} (data dokumentu: {kw_data_dok}).</w:t>
+      </w:r>
+    </w:p>
+    <w:p>
+      <w:r>
+        <w:t xml:space="preserve">{#kw_standard}Księga wieczysta lokalu: {kw_lokalu}. Księga wieczysta gruntu: {kw_gruntu}.{/kw_standard}</w:t>
+      </w:r>
+    </w:p>
+    <w:p>
+      <w:r>
+        <w:t xml:space="preserve">{#kw_deweloperski}Lokal nie posiada założonej księgi wieczystej (nabycie od dewelopera) — badaniem objęto księgę macierzystą gruntu: {kw_gruntu}.{/kw_deweloperski}</w:t>
+      </w:r>
+    </w:p>
+    <w:p>
+      <w:r>
+        <w:t xml:space="preserve">Księgi prowadzi: {kw_sad}, {kw_wydzial}.</w:t>
+      </w:r>
+    </w:p>
+    <w:p>
+      <w:r>
+        <w:t xml:space="preserve">{#dzial3_brak}Dział III (prawa, roszczenia i ograniczenia): brak wpisów.{/dzial3_brak}</w:t>
+      </w:r>
+    </w:p>
+    <w:p>
+      <w:r>
+        <w:t xml:space="preserve">{#dzial3_wpisy}Dział III — wpis: {.}{/dzial3_wpisy}</w:t>
+      </w:r>
+    </w:p>
+    <w:p>
+      <w:r>
+        <w:t xml:space="preserve">{#dzial4_brak}Dział IV (hipoteki): brak wpisów.{/dzial4_brak}</w:t>
+      </w:r>
+    </w:p>
+    <w:p>
+      <w:r>
+        <w:t xml:space="preserve">{#dzial4_wpisy}Dział IV — wpis: {.}{/dzial4_wpisy}</w:t>
+      </w:r>
+    </w:p>
+    <w:p>
+      <w:r>
+        <w:t xml:space="preserve">{/kw_badanie}</w:t>
+      </w:r>
+    </w:p>
+    <w:p>
+      <w:r>
         <w:t xml:space="preserve">Dane ewidencyjne (EGiB): obręb {obreb}, arkusz mapy {arkusz}, działka nr {nr_dzialki}, powierzchnia ewidencyjna działki {pow_dzialki} ha, użytek {uzytek}.</w:t>
       </w:r>
     </w:p>
@@ -9496,7 +9541,12 @@
     </w:p>
     <w:p>
       <w:r>
-        <w:t xml:space="preserve">Udział w nieruchomości wspólnej — wg odpisu księgi wieczystej.</w:t>
+        <w:t xml:space="preserve">Udział w nieruchomości wspólnej: {udzial_kw}.</w:t>
+      </w:r>
+    </w:p>
+    <w:p>
+      <w:r>
+        <w:t xml:space="preserve">{#pow_kw_present}Powierzchnia użytkowa lokalu (wg dokumentu KW/aktu): {pow_uzytkowa_kw}.{/pow_kw_present}</w:t>
       </w:r>
     </w:p>
     <w:p>

</xml_diff>

<commit_message>
feat: operat 12.1 — parameterized rating-scale loop + honest weights prose (f-12)
</commit_message>
<xml_diff>
--- a/apps/web/templates/operat-szablon.docx
+++ b/apps/web/templates/operat-szablon.docx
@@ -14805,6 +14805,113 @@
           <w:szCs w:val="20"/>
         </w:rPr>
       </w:pPr>
+      <w:r>
+        <w:rPr>
+          <w:rFonts w:ascii="Segoe UI" w:hAnsi="Segoe UI" w:cs="Segoe UI"/>
+          <w:sz w:val="20"/>
+          <w:szCs w:val="20"/>
+        </w:rPr>
+        <w:t xml:space="preserve">Wagi cech rynkowych przyjęto na podstawie analizy rynku lokalnego oraz wiedzy i doświadczenia zawodowego rzeczoznawcy majątkowego, odzwierciedlając wpływ poszczególnych atrybutów na jednostkowe ceny transakcyjne nieruchomości podobnych.</w:t>
+      </w:r>
+      <w:r>
+        <w:rPr>
+          <w:rFonts w:ascii="Segoe UI" w:hAnsi="Segoe UI" w:cs="Segoe UI"/>
+          <w:sz w:val="20"/>
+          <w:szCs w:val="20"/>
+        </w:rPr>
+        <w:t xml:space="preserve"/>
+      </w:r>
+      <w:r>
+        <w:rPr>
+          <w:rFonts w:ascii="Segoe UI" w:hAnsi="Segoe UI" w:cs="Segoe UI"/>
+          <w:sz w:val="20"/>
+          <w:szCs w:val="20"/>
+        </w:rPr>
+        <w:br/>
+      </w:r>
+      <w:r>
+        <w:rPr>
+          <w:rFonts w:ascii="Segoe UI" w:hAnsi="Segoe UI" w:cs="Segoe UI"/>
+          <w:sz w:val="20"/>
+          <w:szCs w:val="20"/>
+        </w:rPr>
+        <w:t xml:space="preserve"/>
+      </w:r>
+      <w:r>
+        <w:rPr>
+          <w:rFonts w:ascii="Segoe UI" w:hAnsi="Segoe UI" w:cs="Segoe UI"/>
+          <w:sz w:val="20"/>
+          <w:szCs w:val="20"/>
+        </w:rPr>
+        <w:t xml:space="preserve"/>
+      </w:r>
+      <w:r>
+        <w:rPr>
+          <w:rFonts w:ascii="Segoe UI" w:hAnsi="Segoe UI" w:cs="Segoe UI"/>
+          <w:sz w:val="20"/>
+          <w:szCs w:val="20"/>
+        </w:rPr>
+        <w:t/>
+      </w:r>
+      <w:r>
+        <w:rPr>
+          <w:rFonts w:ascii="Segoe UI" w:hAnsi="Segoe UI" w:cs="Segoe UI"/>
+          <w:sz w:val="20"/>
+          <w:szCs w:val="20"/>
+        </w:rPr>
+        <w:t xml:space="preserve"/>
+      </w:r>
+      <w:r>
+        <w:rPr>
+          <w:rFonts w:ascii="Segoe UI" w:hAnsi="Segoe UI" w:cs="Segoe UI"/>
+          <w:sz w:val="20"/>
+          <w:szCs w:val="20"/>
+        </w:rPr>
+        <w:t xml:space="preserve"/>
+      </w:r>
+      <w:r>
+        <w:rPr>
+          <w:rFonts w:ascii="Segoe UI" w:hAnsi="Segoe UI" w:cs="Segoe UI"/>
+          <w:sz w:val="20"/>
+          <w:szCs w:val="20"/>
+        </w:rPr>
+        <w:t/>
+      </w:r>
+      <w:r>
+        <w:rPr>
+          <w:rFonts w:ascii="Segoe UI" w:hAnsi="Segoe UI" w:cs="Segoe UI"/>
+          <w:sz w:val="20"/>
+          <w:szCs w:val="20"/>
+        </w:rPr>
+        <w:t xml:space="preserve"/>
+      </w:r>
+      <w:r>
+        <w:rPr>
+          <w:rFonts w:ascii="Segoe UI" w:hAnsi="Segoe UI" w:cs="Segoe UI"/>
+          <w:sz w:val="20"/>
+          <w:szCs w:val="20"/>
+        </w:rPr>
+        <w:t/>
+      </w:r>
+      <w:r>
+        <w:rPr>
+          <w:rFonts w:ascii="Segoe UI" w:hAnsi="Segoe UI" w:cs="Segoe UI"/>
+          <w:sz w:val="20"/>
+          <w:szCs w:val="20"/>
+        </w:rPr>
+        <w:t/>
+      </w:r>
+    </w:p>
+    <w:p>
+      <w:pPr>
+        <w:spacing w:line="276" w:lineRule="auto"/>
+        <w:jc w:val="both"/>
+        <w:rPr>
+          <w:rFonts w:ascii="Segoe UI" w:hAnsi="Segoe UI" w:cs="Segoe UI"/>
+          <w:sz w:val="20"/>
+          <w:szCs w:val="20"/>
+        </w:rPr>
+      </w:pPr>
     </w:p>
     <w:p>
       <w:pPr>
@@ -14891,7 +14998,7 @@
                 <w:sz w:val="18"/>
                 <w:szCs w:val="18"/>
               </w:rPr>
-              <w:t>Standard wykończenia</w:t>
+              <w:t xml:space="preserve">{#skala_ocen}{cecha}</w:t>
             </w:r>
           </w:p>
         </w:tc>
@@ -14907,759 +15014,23 @@
             <w:vAlign w:val="center"/>
           </w:tcPr>
           <w:p>
-            <w:pPr>
-              <w:spacing w:before="120" w:after="120"/>
-              <w:jc w:val="center"/>
-              <w:rPr>
-                <w:rFonts w:ascii="Segoe UI" w:hAnsi="Segoe UI" w:cs="Segoe UI"/>
-                <w:b/>
-                <w:sz w:val="18"/>
-                <w:szCs w:val="18"/>
-              </w:rPr>
-            </w:pPr>
             <w:r>
-              <w:rPr>
-                <w:rFonts w:ascii="Segoe UI" w:hAnsi="Segoe UI" w:cs="Segoe UI"/>
-                <w:b/>
-                <w:sz w:val="18"/>
-                <w:szCs w:val="18"/>
-              </w:rPr>
-              <w:t xml:space="preserve">lepsza </w:t>
-            </w:r>
-            <w:r>
-              <w:rPr>
-                <w:rFonts w:ascii="Segoe UI" w:hAnsi="Segoe UI" w:cs="Segoe UI"/>
-                <w:bCs/>
-                <w:sz w:val="18"/>
-                <w:szCs w:val="18"/>
-              </w:rPr>
-              <w:t>– standard dobry, wykończenie materiałami lepszej jakości</w:t>
+              <w:t>{#poziomy}</w:t>
             </w:r>
           </w:p>
           <w:p>
-            <w:pPr>
-              <w:spacing w:before="120" w:after="120"/>
-              <w:jc w:val="center"/>
-              <w:rPr>
-                <w:rFonts w:ascii="Segoe UI" w:hAnsi="Segoe UI" w:cs="Segoe UI"/>
-                <w:bCs/>
-                <w:sz w:val="18"/>
-                <w:szCs w:val="18"/>
-              </w:rPr>
-            </w:pPr>
             <w:r>
-              <w:rPr>
-                <w:rFonts w:ascii="Segoe UI" w:hAnsi="Segoe UI" w:cs="Segoe UI"/>
-                <w:b/>
-                <w:sz w:val="18"/>
-                <w:szCs w:val="18"/>
-              </w:rPr>
-              <w:t xml:space="preserve">dobra </w:t>
-            </w:r>
-            <w:r>
-              <w:rPr>
-                <w:rFonts w:ascii="Segoe UI" w:hAnsi="Segoe UI" w:cs="Segoe UI"/>
-                <w:bCs/>
-                <w:sz w:val="18"/>
-                <w:szCs w:val="18"/>
-              </w:rPr>
-              <w:t>– standard dobry, wykończenie materiałami dobrej jakości</w:t>
-            </w:r>
-          </w:p>
-        </w:tc>
-      </w:tr>
-      <w:tr>
-        <w:trPr>
-          <w:trHeight w:val="1391"/>
-        </w:trPr>
-        <w:tc>
-          <w:tcPr>
-            <w:tcW w:w="3881" w:type="dxa"/>
-            <w:tcBorders>
-              <w:top w:val="single" w:sz="4" w:space="0" w:color="BFBFBF"/>
-              <w:left w:val="single" w:sz="4" w:space="0" w:color="BFBFBF"/>
-              <w:bottom w:val="single" w:sz="4" w:space="0" w:color="BFBFBF"/>
-              <w:right w:val="single" w:sz="4" w:space="0" w:color="BFBFBF"/>
-            </w:tcBorders>
-            <w:vAlign w:val="center"/>
-          </w:tcPr>
-          <w:p>
-            <w:pPr>
-              <w:spacing w:before="60" w:after="60"/>
-              <w:jc w:val="center"/>
-              <w:rPr>
-                <w:rFonts w:ascii="Segoe UI" w:hAnsi="Segoe UI" w:cs="Segoe UI"/>
-                <w:b/>
-                <w:sz w:val="18"/>
-                <w:szCs w:val="18"/>
-              </w:rPr>
-            </w:pPr>
-            <w:r>
-              <w:rPr>
-                <w:rFonts w:ascii="Segoe UI" w:hAnsi="Segoe UI" w:cs="Segoe UI"/>
-                <w:b/>
-                <w:sz w:val="18"/>
-                <w:szCs w:val="18"/>
-              </w:rPr>
-              <w:t>Położenie na piętrze</w:t>
-            </w:r>
-          </w:p>
-        </w:tc>
-        <w:tc>
-          <w:tcPr>
-            <w:tcW w:w="5191" w:type="dxa"/>
-            <w:tcBorders>
-              <w:top w:val="single" w:sz="4" w:space="0" w:color="BFBFBF"/>
-              <w:left w:val="single" w:sz="4" w:space="0" w:color="BFBFBF"/>
-              <w:bottom w:val="single" w:sz="4" w:space="0" w:color="BFBFBF"/>
-              <w:right w:val="single" w:sz="4" w:space="0" w:color="BFBFBF"/>
-            </w:tcBorders>
-          </w:tcPr>
-          <w:p>
-            <w:pPr>
-              <w:spacing w:before="120" w:after="120"/>
-              <w:jc w:val="center"/>
-              <w:rPr>
-                <w:rFonts w:ascii="Segoe UI" w:hAnsi="Segoe UI" w:cs="Segoe UI"/>
-                <w:bCs/>
-                <w:sz w:val="18"/>
-                <w:szCs w:val="18"/>
-              </w:rPr>
-            </w:pPr>
-            <w:r>
-              <w:rPr>
-                <w:rFonts w:ascii="Segoe UI" w:hAnsi="Segoe UI" w:cs="Segoe UI"/>
-                <w:b/>
-                <w:sz w:val="18"/>
-                <w:szCs w:val="18"/>
-              </w:rPr>
-              <w:t xml:space="preserve">lepsza </w:t>
-            </w:r>
-            <w:r>
-              <w:rPr>
-                <w:rFonts w:ascii="Segoe UI" w:hAnsi="Segoe UI" w:cs="Segoe UI"/>
-                <w:bCs/>
-                <w:sz w:val="18"/>
-                <w:szCs w:val="18"/>
-              </w:rPr>
-              <w:t>–</w:t>
-            </w:r>
-            <w:r>
-              <w:rPr>
-                <w:rFonts w:ascii="Segoe UI" w:hAnsi="Segoe UI" w:cs="Segoe UI"/>
-                <w:b/>
-                <w:sz w:val="18"/>
-                <w:szCs w:val="18"/>
-              </w:rPr>
-              <w:t xml:space="preserve"> </w:t>
-            </w:r>
-            <w:r>
-              <w:rPr>
-                <w:rFonts w:ascii="Segoe UI" w:hAnsi="Segoe UI" w:cs="Segoe UI"/>
-                <w:bCs/>
-                <w:sz w:val="18"/>
-                <w:szCs w:val="18"/>
-              </w:rPr>
-              <w:t>4</w:t>
-            </w:r>
-            <w:r>
-              <w:rPr>
-                <w:rFonts w:ascii="Segoe UI" w:hAnsi="Segoe UI" w:cs="Segoe UI"/>
-                <w:bCs/>
-                <w:sz w:val="18"/>
-                <w:szCs w:val="18"/>
-              </w:rPr>
-              <w:t xml:space="preserve"> piętro i powyżej</w:t>
+              <w:t>{poziom} – {def}.</w:t>
             </w:r>
           </w:p>
           <w:p>
-            <w:pPr>
-              <w:spacing w:before="120" w:after="120"/>
-              <w:jc w:val="center"/>
-              <w:rPr>
-                <w:rFonts w:ascii="Segoe UI" w:hAnsi="Segoe UI" w:cs="Segoe UI"/>
-                <w:b/>
-                <w:sz w:val="18"/>
-                <w:szCs w:val="18"/>
-              </w:rPr>
-            </w:pPr>
             <w:r>
-              <w:rPr>
-                <w:rFonts w:ascii="Segoe UI" w:hAnsi="Segoe UI" w:cs="Segoe UI"/>
-                <w:b/>
-                <w:sz w:val="18"/>
-                <w:szCs w:val="18"/>
-              </w:rPr>
-              <w:t xml:space="preserve">przeciętna </w:t>
-            </w:r>
-            <w:r>
-              <w:rPr>
-                <w:rFonts w:ascii="Segoe UI" w:hAnsi="Segoe UI" w:cs="Segoe UI"/>
-                <w:bCs/>
-                <w:sz w:val="18"/>
-                <w:szCs w:val="18"/>
-              </w:rPr>
-              <w:t xml:space="preserve">– </w:t>
-            </w:r>
-            <w:r>
-              <w:rPr>
-                <w:rFonts w:ascii="Segoe UI" w:hAnsi="Segoe UI" w:cs="Segoe UI"/>
-                <w:bCs/>
-                <w:sz w:val="18"/>
-                <w:szCs w:val="18"/>
-              </w:rPr>
-              <w:t>piętra pośrednie</w:t>
+              <w:t>{/poziomy}</w:t>
             </w:r>
           </w:p>
           <w:p>
-            <w:pPr>
-              <w:spacing w:before="120" w:after="120"/>
-              <w:jc w:val="center"/>
-              <w:rPr>
-                <w:rFonts w:ascii="Segoe UI" w:hAnsi="Segoe UI" w:cs="Segoe UI"/>
-                <w:b/>
-                <w:sz w:val="18"/>
-                <w:szCs w:val="18"/>
-              </w:rPr>
-            </w:pPr>
             <w:r>
-              <w:rPr>
-                <w:rFonts w:ascii="Segoe UI" w:hAnsi="Segoe UI" w:cs="Segoe UI"/>
-                <w:b/>
-                <w:sz w:val="18"/>
-                <w:szCs w:val="18"/>
-              </w:rPr>
-              <w:t xml:space="preserve">gorsza </w:t>
-            </w:r>
-            <w:r>
-              <w:rPr>
-                <w:rFonts w:ascii="Segoe UI" w:hAnsi="Segoe UI" w:cs="Segoe UI"/>
-                <w:bCs/>
-                <w:sz w:val="18"/>
-                <w:szCs w:val="18"/>
-              </w:rPr>
-              <w:t>– parter</w:t>
-            </w:r>
-          </w:p>
-        </w:tc>
-      </w:tr>
-      <w:tr>
-        <w:trPr>
-          <w:trHeight w:val="845"/>
-        </w:trPr>
-        <w:tc>
-          <w:tcPr>
-            <w:tcW w:w="3881" w:type="dxa"/>
-            <w:tcBorders>
-              <w:top w:val="single" w:sz="4" w:space="0" w:color="BFBFBF"/>
-              <w:left w:val="single" w:sz="4" w:space="0" w:color="BFBFBF"/>
-              <w:bottom w:val="single" w:sz="4" w:space="0" w:color="BFBFBF"/>
-              <w:right w:val="single" w:sz="4" w:space="0" w:color="BFBFBF"/>
-            </w:tcBorders>
-            <w:vAlign w:val="center"/>
-          </w:tcPr>
-          <w:p>
-            <w:pPr>
-              <w:spacing w:before="60" w:after="60"/>
-              <w:jc w:val="center"/>
-              <w:rPr>
-                <w:rFonts w:ascii="Segoe UI" w:hAnsi="Segoe UI" w:cs="Segoe UI"/>
-                <w:b/>
-                <w:sz w:val="18"/>
-                <w:szCs w:val="18"/>
-              </w:rPr>
-            </w:pPr>
-            <w:r>
-              <w:rPr>
-                <w:rFonts w:ascii="Segoe UI" w:hAnsi="Segoe UI" w:cs="Segoe UI"/>
-                <w:b/>
-                <w:sz w:val="18"/>
-                <w:szCs w:val="18"/>
-              </w:rPr>
-              <w:t>Powierzchnia użytkowa</w:t>
-            </w:r>
-          </w:p>
-        </w:tc>
-        <w:tc>
-          <w:tcPr>
-            <w:tcW w:w="5191" w:type="dxa"/>
-            <w:tcBorders>
-              <w:top w:val="single" w:sz="4" w:space="0" w:color="BFBFBF"/>
-              <w:left w:val="single" w:sz="4" w:space="0" w:color="BFBFBF"/>
-              <w:bottom w:val="single" w:sz="4" w:space="0" w:color="BFBFBF"/>
-              <w:right w:val="single" w:sz="4" w:space="0" w:color="BFBFBF"/>
-            </w:tcBorders>
-          </w:tcPr>
-          <w:p>
-            <w:pPr>
-              <w:spacing w:before="120" w:after="120"/>
-              <w:jc w:val="center"/>
-              <w:rPr>
-                <w:rFonts w:ascii="Segoe UI" w:hAnsi="Segoe UI" w:cs="Segoe UI"/>
-                <w:b/>
-                <w:bCs/>
-                <w:sz w:val="18"/>
-                <w:szCs w:val="18"/>
-              </w:rPr>
-            </w:pPr>
-            <w:r>
-              <w:rPr>
-                <w:rFonts w:ascii="Segoe UI" w:hAnsi="Segoe UI" w:cs="Segoe UI"/>
-                <w:b/>
-                <w:bCs/>
-                <w:sz w:val="18"/>
-                <w:szCs w:val="18"/>
-              </w:rPr>
-              <w:t xml:space="preserve">lepsza </w:t>
-            </w:r>
-            <w:r>
-              <w:rPr>
-                <w:rFonts w:ascii="Segoe UI" w:hAnsi="Segoe UI" w:cs="Segoe UI"/>
-                <w:sz w:val="18"/>
-                <w:szCs w:val="18"/>
-              </w:rPr>
-              <w:t>–</w:t>
-            </w:r>
-            <w:r>
-              <w:rPr>
-                <w:rFonts w:ascii="Segoe UI" w:hAnsi="Segoe UI" w:cs="Segoe UI"/>
-                <w:b/>
-                <w:bCs/>
-                <w:sz w:val="18"/>
-                <w:szCs w:val="18"/>
-              </w:rPr>
-              <w:t xml:space="preserve"> </w:t>
-            </w:r>
-            <w:r>
-              <w:rPr>
-                <w:rFonts w:ascii="Segoe UI" w:hAnsi="Segoe UI" w:cs="Segoe UI"/>
-                <w:sz w:val="18"/>
-                <w:szCs w:val="18"/>
-              </w:rPr>
-              <w:t>po</w:t>
-            </w:r>
-            <w:r>
-              <w:rPr>
-                <w:rFonts w:ascii="Segoe UI" w:hAnsi="Segoe UI" w:cs="Segoe UI"/>
-                <w:sz w:val="18"/>
-                <w:szCs w:val="18"/>
-              </w:rPr>
-              <w:t>niżej</w:t>
-            </w:r>
-            <w:r>
-              <w:rPr>
-                <w:rFonts w:ascii="Segoe UI" w:hAnsi="Segoe UI" w:cs="Segoe UI"/>
-                <w:sz w:val="18"/>
-                <w:szCs w:val="18"/>
-              </w:rPr>
-              <w:t xml:space="preserve"> </w:t>
-            </w:r>
-            <w:r>
-              <w:rPr>
-                <w:rFonts w:ascii="Segoe UI" w:hAnsi="Segoe UI" w:cs="Segoe UI"/>
-                <w:sz w:val="18"/>
-                <w:szCs w:val="18"/>
-              </w:rPr>
-              <w:t>65</w:t>
-            </w:r>
-            <w:r>
-              <w:rPr>
-                <w:rFonts w:ascii="Segoe UI" w:hAnsi="Segoe UI" w:cs="Segoe UI"/>
-                <w:sz w:val="18"/>
-                <w:szCs w:val="18"/>
-              </w:rPr>
-              <w:t xml:space="preserve"> m</w:t>
-            </w:r>
-            <w:r>
-              <w:rPr>
-                <w:rFonts w:ascii="Segoe UI" w:hAnsi="Segoe UI" w:cs="Segoe UI"/>
-                <w:sz w:val="18"/>
-                <w:szCs w:val="18"/>
-                <w:vertAlign w:val="superscript"/>
-              </w:rPr>
-              <w:t>2</w:t>
-            </w:r>
-            <w:r>
-              <w:rPr>
-                <w:rFonts w:ascii="Segoe UI" w:hAnsi="Segoe UI" w:cs="Segoe UI"/>
-                <w:b/>
-                <w:bCs/>
-                <w:sz w:val="18"/>
-                <w:szCs w:val="18"/>
-              </w:rPr>
-              <w:t xml:space="preserve"> </w:t>
-            </w:r>
-          </w:p>
-          <w:p>
-            <w:pPr>
-              <w:spacing w:before="120" w:after="120"/>
-              <w:jc w:val="center"/>
-              <w:rPr>
-                <w:rFonts w:ascii="Segoe UI" w:hAnsi="Segoe UI" w:cs="Segoe UI"/>
-                <w:b/>
-                <w:bCs/>
-                <w:sz w:val="18"/>
-                <w:szCs w:val="18"/>
-              </w:rPr>
-            </w:pPr>
-            <w:r>
-              <w:rPr>
-                <w:rFonts w:ascii="Segoe UI" w:hAnsi="Segoe UI" w:cs="Segoe UI"/>
-                <w:b/>
-                <w:bCs/>
-                <w:sz w:val="18"/>
-                <w:szCs w:val="18"/>
-              </w:rPr>
-              <w:t>gorsza</w:t>
-            </w:r>
-            <w:r>
-              <w:rPr>
-                <w:rFonts w:ascii="Segoe UI" w:hAnsi="Segoe UI" w:cs="Segoe UI"/>
-                <w:b/>
-                <w:bCs/>
-                <w:sz w:val="18"/>
-                <w:szCs w:val="18"/>
-              </w:rPr>
-              <w:t xml:space="preserve"> </w:t>
-            </w:r>
-            <w:r>
-              <w:rPr>
-                <w:rFonts w:ascii="Segoe UI" w:hAnsi="Segoe UI" w:cs="Segoe UI"/>
-                <w:sz w:val="18"/>
-                <w:szCs w:val="18"/>
-              </w:rPr>
-              <w:t>–</w:t>
-            </w:r>
-            <w:r>
-              <w:rPr>
-                <w:rFonts w:ascii="Segoe UI" w:hAnsi="Segoe UI" w:cs="Segoe UI"/>
-                <w:b/>
-                <w:bCs/>
-                <w:sz w:val="18"/>
-                <w:szCs w:val="18"/>
-              </w:rPr>
-              <w:t xml:space="preserve"> </w:t>
-            </w:r>
-            <w:r>
-              <w:rPr>
-                <w:rFonts w:ascii="Segoe UI" w:hAnsi="Segoe UI" w:cs="Segoe UI"/>
-                <w:sz w:val="18"/>
-                <w:szCs w:val="18"/>
-              </w:rPr>
-              <w:t>po</w:t>
-            </w:r>
-            <w:r>
-              <w:rPr>
-                <w:rFonts w:ascii="Segoe UI" w:hAnsi="Segoe UI" w:cs="Segoe UI"/>
-                <w:sz w:val="18"/>
-                <w:szCs w:val="18"/>
-              </w:rPr>
-              <w:t>wyżej</w:t>
-            </w:r>
-            <w:r>
-              <w:rPr>
-                <w:rFonts w:ascii="Segoe UI" w:hAnsi="Segoe UI" w:cs="Segoe UI"/>
-                <w:sz w:val="18"/>
-                <w:szCs w:val="18"/>
-              </w:rPr>
-              <w:t xml:space="preserve"> </w:t>
-            </w:r>
-            <w:r>
-              <w:rPr>
-                <w:rFonts w:ascii="Segoe UI" w:hAnsi="Segoe UI" w:cs="Segoe UI"/>
-                <w:sz w:val="18"/>
-                <w:szCs w:val="18"/>
-              </w:rPr>
-              <w:t>65</w:t>
-            </w:r>
-            <w:r>
-              <w:rPr>
-                <w:rFonts w:ascii="Segoe UI" w:hAnsi="Segoe UI" w:cs="Segoe UI"/>
-                <w:sz w:val="18"/>
-                <w:szCs w:val="18"/>
-              </w:rPr>
-              <w:t xml:space="preserve"> m</w:t>
-            </w:r>
-            <w:r>
-              <w:rPr>
-                <w:rFonts w:ascii="Segoe UI" w:hAnsi="Segoe UI" w:cs="Segoe UI"/>
-                <w:sz w:val="18"/>
-                <w:szCs w:val="18"/>
-                <w:vertAlign w:val="superscript"/>
-              </w:rPr>
-              <w:t>2</w:t>
-            </w:r>
-          </w:p>
-        </w:tc>
-      </w:tr>
-      <w:tr>
-        <w:trPr>
-          <w:trHeight w:val="60"/>
-        </w:trPr>
-        <w:tc>
-          <w:tcPr>
-            <w:tcW w:w="3881" w:type="dxa"/>
-            <w:tcBorders>
-              <w:top w:val="single" w:sz="4" w:space="0" w:color="BFBFBF"/>
-              <w:left w:val="single" w:sz="4" w:space="0" w:color="BFBFBF"/>
-              <w:bottom w:val="single" w:sz="4" w:space="0" w:color="BFBFBF"/>
-              <w:right w:val="single" w:sz="4" w:space="0" w:color="BFBFBF"/>
-            </w:tcBorders>
-            <w:vAlign w:val="center"/>
-          </w:tcPr>
-          <w:p>
-            <w:pPr>
-              <w:spacing w:before="60" w:after="60"/>
-              <w:jc w:val="center"/>
-              <w:rPr>
-                <w:rFonts w:ascii="Segoe UI" w:hAnsi="Segoe UI" w:cs="Segoe UI"/>
-                <w:b/>
-                <w:sz w:val="18"/>
-                <w:szCs w:val="18"/>
-              </w:rPr>
-            </w:pPr>
-            <w:r>
-              <w:rPr>
-                <w:rFonts w:ascii="Segoe UI" w:hAnsi="Segoe UI" w:cs="Segoe UI"/>
-                <w:b/>
-                <w:sz w:val="18"/>
-                <w:szCs w:val="18"/>
-              </w:rPr>
-              <w:t>Dodatkowe</w:t>
-            </w:r>
-          </w:p>
-        </w:tc>
-        <w:tc>
-          <w:tcPr>
-            <w:tcW w:w="5191" w:type="dxa"/>
-            <w:tcBorders>
-              <w:top w:val="single" w:sz="4" w:space="0" w:color="BFBFBF"/>
-              <w:left w:val="single" w:sz="4" w:space="0" w:color="BFBFBF"/>
-              <w:bottom w:val="single" w:sz="4" w:space="0" w:color="BFBFBF"/>
-              <w:right w:val="single" w:sz="4" w:space="0" w:color="BFBFBF"/>
-            </w:tcBorders>
-          </w:tcPr>
-          <w:p>
-            <w:pPr>
-              <w:spacing w:before="120" w:after="120"/>
-              <w:jc w:val="center"/>
-              <w:rPr>
-                <w:rFonts w:ascii="Segoe UI" w:hAnsi="Segoe UI" w:cs="Segoe UI"/>
-                <w:bCs/>
-                <w:sz w:val="18"/>
-                <w:szCs w:val="18"/>
-              </w:rPr>
-            </w:pPr>
-            <w:r>
-              <w:rPr>
-                <w:rFonts w:ascii="Segoe UI" w:hAnsi="Segoe UI" w:cs="Segoe UI"/>
-                <w:b/>
-                <w:sz w:val="18"/>
-                <w:szCs w:val="18"/>
-              </w:rPr>
-              <w:t xml:space="preserve">lepsza </w:t>
-            </w:r>
-            <w:r>
-              <w:rPr>
-                <w:rFonts w:ascii="Segoe UI" w:hAnsi="Segoe UI" w:cs="Segoe UI"/>
-                <w:bCs/>
-                <w:sz w:val="18"/>
-                <w:szCs w:val="18"/>
-              </w:rPr>
-              <w:t xml:space="preserve">– </w:t>
-            </w:r>
-            <w:r>
-              <w:rPr>
-                <w:rFonts w:ascii="Segoe UI" w:hAnsi="Segoe UI" w:cs="Segoe UI"/>
-                <w:bCs/>
-                <w:sz w:val="18"/>
-                <w:szCs w:val="18"/>
-              </w:rPr>
-              <w:t>prawo do wyłącznego korzystania z miejsca postojowego</w:t>
-            </w:r>
-          </w:p>
-          <w:p>
-            <w:pPr>
-              <w:spacing w:before="120" w:after="120"/>
-              <w:jc w:val="center"/>
-              <w:rPr>
-                <w:rFonts w:ascii="Segoe UI" w:hAnsi="Segoe UI" w:cs="Segoe UI"/>
-                <w:b/>
-                <w:sz w:val="18"/>
-                <w:szCs w:val="18"/>
-              </w:rPr>
-            </w:pPr>
-            <w:r>
-              <w:rPr>
-                <w:rFonts w:ascii="Segoe UI" w:hAnsi="Segoe UI" w:cs="Segoe UI"/>
-                <w:b/>
-                <w:bCs/>
-                <w:sz w:val="18"/>
-                <w:szCs w:val="18"/>
-              </w:rPr>
-              <w:t xml:space="preserve">gorsza </w:t>
-            </w:r>
-            <w:r>
-              <w:rPr>
-                <w:rFonts w:ascii="Segoe UI" w:hAnsi="Segoe UI" w:cs="Segoe UI"/>
-                <w:sz w:val="18"/>
-                <w:szCs w:val="18"/>
-              </w:rPr>
-              <w:t xml:space="preserve">– </w:t>
-            </w:r>
-            <w:r>
-              <w:rPr>
-                <w:rFonts w:ascii="Segoe UI" w:hAnsi="Segoe UI" w:cs="Segoe UI"/>
-                <w:sz w:val="18"/>
-                <w:szCs w:val="18"/>
-              </w:rPr>
-              <w:t>brak</w:t>
-            </w:r>
-          </w:p>
-        </w:tc>
-      </w:tr>
-      <w:tr>
-        <w:trPr>
-          <w:trHeight w:val="2542"/>
-        </w:trPr>
-        <w:tc>
-          <w:tcPr>
-            <w:tcW w:w="3881" w:type="dxa"/>
-            <w:tcBorders>
-              <w:top w:val="single" w:sz="4" w:space="0" w:color="BFBFBF"/>
-              <w:left w:val="single" w:sz="4" w:space="0" w:color="BFBFBF"/>
-              <w:bottom w:val="single" w:sz="4" w:space="0" w:color="BFBFBF"/>
-              <w:right w:val="single" w:sz="4" w:space="0" w:color="BFBFBF"/>
-            </w:tcBorders>
-            <w:vAlign w:val="center"/>
-          </w:tcPr>
-          <w:p>
-            <w:pPr>
-              <w:spacing w:before="60" w:after="60"/>
-              <w:jc w:val="center"/>
-              <w:rPr>
-                <w:rFonts w:ascii="Segoe UI" w:hAnsi="Segoe UI" w:cs="Segoe UI"/>
-                <w:b/>
-                <w:sz w:val="18"/>
-                <w:szCs w:val="18"/>
-              </w:rPr>
-            </w:pPr>
-            <w:r>
-              <w:rPr>
-                <w:rFonts w:ascii="Segoe UI" w:hAnsi="Segoe UI" w:cs="Segoe UI"/>
-                <w:b/>
-                <w:sz w:val="18"/>
-                <w:szCs w:val="18"/>
-              </w:rPr>
-              <w:t>Lokalizacja szczegółowa</w:t>
-            </w:r>
-          </w:p>
-        </w:tc>
-        <w:tc>
-          <w:tcPr>
-            <w:tcW w:w="5191" w:type="dxa"/>
-            <w:tcBorders>
-              <w:top w:val="single" w:sz="4" w:space="0" w:color="BFBFBF"/>
-              <w:left w:val="single" w:sz="4" w:space="0" w:color="BFBFBF"/>
-              <w:bottom w:val="single" w:sz="4" w:space="0" w:color="BFBFBF"/>
-              <w:right w:val="single" w:sz="4" w:space="0" w:color="BFBFBF"/>
-            </w:tcBorders>
-            <w:vAlign w:val="center"/>
-          </w:tcPr>
-          <w:p>
-            <w:pPr>
-              <w:spacing w:after="120"/>
-              <w:jc w:val="center"/>
-              <w:rPr>
-                <w:rFonts w:ascii="Segoe UI" w:hAnsi="Segoe UI" w:cs="Segoe UI"/>
-                <w:b/>
-                <w:sz w:val="18"/>
-                <w:szCs w:val="18"/>
-              </w:rPr>
-            </w:pPr>
-            <w:r>
-              <w:rPr>
-                <w:rFonts w:ascii="Segoe UI" w:hAnsi="Segoe UI" w:cs="Segoe UI"/>
-                <w:b/>
-                <w:sz w:val="18"/>
-                <w:szCs w:val="18"/>
-              </w:rPr>
-              <w:t xml:space="preserve">lepsza </w:t>
-            </w:r>
-            <w:r>
-              <w:rPr>
-                <w:rFonts w:ascii="Segoe UI" w:hAnsi="Segoe UI" w:cs="Segoe UI"/>
-                <w:bCs/>
-                <w:sz w:val="18"/>
-                <w:szCs w:val="18"/>
-              </w:rPr>
-              <w:t>–</w:t>
-            </w:r>
-            <w:r>
-              <w:rPr>
-                <w:rFonts w:ascii="Segoe UI" w:hAnsi="Segoe UI" w:cs="Segoe UI"/>
-                <w:b/>
-                <w:sz w:val="18"/>
-                <w:szCs w:val="18"/>
-              </w:rPr>
-              <w:t xml:space="preserve"> </w:t>
-            </w:r>
-            <w:r>
-              <w:rPr>
-                <w:rFonts w:ascii="Segoe UI" w:hAnsi="Segoe UI" w:cs="Segoe UI"/>
-                <w:bCs/>
-                <w:sz w:val="18"/>
-                <w:szCs w:val="18"/>
-              </w:rPr>
-              <w:t>położenie w otoczeniu zabudowy mieszkaniowej wielorodzinnej, w bliskiej odległości od punktów handlowo – usługowych, położenie w bliskiej odległości od często uczęszczanych szlaków komunikacyjnych</w:t>
-            </w:r>
-          </w:p>
-          <w:p>
-            <w:pPr>
-              <w:spacing w:before="120" w:after="120"/>
-              <w:jc w:val="center"/>
-              <w:rPr>
-                <w:rFonts w:ascii="Segoe UI" w:hAnsi="Segoe UI" w:cs="Segoe UI"/>
-                <w:b/>
-                <w:sz w:val="18"/>
-                <w:szCs w:val="18"/>
-              </w:rPr>
-            </w:pPr>
-            <w:r>
-              <w:rPr>
-                <w:rFonts w:ascii="Segoe UI" w:hAnsi="Segoe UI" w:cs="Segoe UI"/>
-                <w:b/>
-                <w:sz w:val="18"/>
-                <w:szCs w:val="18"/>
-              </w:rPr>
-              <w:t xml:space="preserve">dobra </w:t>
-            </w:r>
-            <w:r>
-              <w:rPr>
-                <w:rFonts w:ascii="Segoe UI" w:hAnsi="Segoe UI" w:cs="Segoe UI"/>
-                <w:bCs/>
-                <w:sz w:val="18"/>
-                <w:szCs w:val="18"/>
-              </w:rPr>
-              <w:t>–</w:t>
-            </w:r>
-            <w:r>
-              <w:rPr>
-                <w:rFonts w:ascii="Segoe UI" w:hAnsi="Segoe UI" w:cs="Segoe UI"/>
-                <w:b/>
-                <w:sz w:val="18"/>
-                <w:szCs w:val="18"/>
-              </w:rPr>
-              <w:t xml:space="preserve"> </w:t>
-            </w:r>
-            <w:r>
-              <w:rPr>
-                <w:rFonts w:ascii="Segoe UI" w:hAnsi="Segoe UI" w:cs="Segoe UI"/>
-                <w:bCs/>
-                <w:sz w:val="18"/>
-                <w:szCs w:val="18"/>
-              </w:rPr>
-              <w:t>położenie w otoczeniu zabudowy mieszkaniowej wielorodzinnej i terenów zielonych, w biskiej odległości                     od punktów handlowo – usługowych, położenie w dalszej odległości od często uczęszczanych szlaków komunikacyjnych</w:t>
+              <w:t>{/skala_ocen}</w:t>
             </w:r>
           </w:p>
         </w:tc>

</xml_diff>

<commit_message>
fix: conditional period + preserved formatting + structural loop guard in operat 12.1
</commit_message>
<xml_diff>
--- a/apps/web/templates/operat-szablon.docx
+++ b/apps/web/templates/operat-szablon.docx
@@ -15014,23 +15014,115 @@
             <w:vAlign w:val="center"/>
           </w:tcPr>
           <w:p>
+            <w:pPr>
+              <w:spacing w:before="120" w:after="120"/>
+              <w:jc w:val="center"/>
+              <w:rPr>
+                <w:rFonts w:ascii="Segoe UI" w:hAnsi="Segoe UI" w:cs="Segoe UI"/>
+                <w:sz w:val="18"/>
+                <w:szCs w:val="18"/>
+              </w:rPr>
+            </w:pPr>
             <w:r>
-              <w:t>{#poziomy}</w:t>
+              <w:rPr>
+                <w:rFonts w:ascii="Segoe UI" w:hAnsi="Segoe UI" w:cs="Segoe UI"/>
+                <w:sz w:val="18"/>
+                <w:szCs w:val="18"/>
+              </w:rPr>
+              <w:t xml:space="preserve">{#poziomy}</w:t>
+            </w:r>
+            <w:r>
+              <w:rPr>
+                <w:rFonts w:ascii="Segoe UI" w:hAnsi="Segoe UI" w:cs="Segoe UI"/>
+                <w:bCs/>
+                <w:sz w:val="18"/>
+                <w:szCs w:val="18"/>
+              </w:rPr>
+              <w:t/>
             </w:r>
           </w:p>
           <w:p>
+            <w:pPr>
+              <w:spacing w:before="120" w:after="120"/>
+              <w:jc w:val="center"/>
+              <w:rPr>
+                <w:rFonts w:ascii="Segoe UI" w:hAnsi="Segoe UI" w:cs="Segoe UI"/>
+                <w:sz w:val="18"/>
+                <w:szCs w:val="18"/>
+              </w:rPr>
+            </w:pPr>
             <w:r>
-              <w:t>{poziom} – {def}.</w:t>
+              <w:rPr>
+                <w:rFonts w:ascii="Segoe UI" w:hAnsi="Segoe UI" w:cs="Segoe UI"/>
+                <w:sz w:val="18"/>
+                <w:szCs w:val="18"/>
+              </w:rPr>
+              <w:t xml:space="preserve">{poziom} – {def}</w:t>
+            </w:r>
+            <w:r>
+              <w:rPr>
+                <w:rFonts w:ascii="Segoe UI" w:hAnsi="Segoe UI" w:cs="Segoe UI"/>
+                <w:bCs/>
+                <w:sz w:val="18"/>
+                <w:szCs w:val="18"/>
+              </w:rPr>
+              <w:t/>
             </w:r>
           </w:p>
           <w:p>
+            <w:pPr>
+              <w:spacing w:before="120" w:after="120"/>
+              <w:jc w:val="center"/>
+              <w:rPr>
+                <w:rFonts w:ascii="Segoe UI" w:hAnsi="Segoe UI" w:cs="Segoe UI"/>
+                <w:sz w:val="18"/>
+                <w:szCs w:val="18"/>
+              </w:rPr>
+            </w:pPr>
             <w:r>
-              <w:t>{/poziomy}</w:t>
+              <w:rPr>
+                <w:rFonts w:ascii="Segoe UI" w:hAnsi="Segoe UI" w:cs="Segoe UI"/>
+                <w:sz w:val="18"/>
+                <w:szCs w:val="18"/>
+              </w:rPr>
+              <w:t xml:space="preserve">{/poziomy}</w:t>
+            </w:r>
+            <w:r>
+              <w:rPr>
+                <w:rFonts w:ascii="Segoe UI" w:hAnsi="Segoe UI" w:cs="Segoe UI"/>
+                <w:bCs/>
+                <w:sz w:val="18"/>
+                <w:szCs w:val="18"/>
+              </w:rPr>
+              <w:t/>
             </w:r>
           </w:p>
           <w:p>
+            <w:pPr>
+              <w:spacing w:before="120" w:after="120"/>
+              <w:jc w:val="center"/>
+              <w:rPr>
+                <w:rFonts w:ascii="Segoe UI" w:hAnsi="Segoe UI" w:cs="Segoe UI"/>
+                <w:sz w:val="18"/>
+                <w:szCs w:val="18"/>
+              </w:rPr>
+            </w:pPr>
             <w:r>
-              <w:t>{/skala_ocen}</w:t>
+              <w:rPr>
+                <w:rFonts w:ascii="Segoe UI" w:hAnsi="Segoe UI" w:cs="Segoe UI"/>
+                <w:sz w:val="18"/>
+                <w:szCs w:val="18"/>
+              </w:rPr>
+              <w:t xml:space="preserve">{/skala_ocen}</w:t>
+            </w:r>
+            <w:r>
+              <w:rPr>
+                <w:rFonts w:ascii="Segoe UI" w:hAnsi="Segoe UI" w:cs="Segoe UI"/>
+                <w:bCs/>
+                <w:sz w:val="18"/>
+                <w:szCs w:val="18"/>
+              </w:rPr>
+              <w:t/>
             </w:r>
           </w:p>
         </w:tc>

</xml_diff>

<commit_message>
fix: truthful feature-list intro and honest-silence wrap for empty rating scale
The §12.1/§13 prose hardcoded the source operat's fixed 5-feature list
verbatim, so a generated document would lie whenever this valuation's active
feature bag differed. Rewire both paragraphs to contract slots computed from
the active feature bag, and wrap the §12.1 rating-scale intro/table/caption
in {#ma_skale}/{/ma_skale} so an empty scale (legacy snapshot, or every
definition cleared) renders as honest silence instead of orphaned prose.
</commit_message>
<xml_diff>
--- a/apps/web/templates/operat-szablon.docx
+++ b/apps/web/templates/operat-szablon.docx
@@ -14704,15 +14704,15 @@
           <w:sz w:val="20"/>
           <w:szCs w:val="20"/>
         </w:rPr>
-        <w:t>Na podstawie analizy transakcji lokali o funkcji mieszkalnej będących przedmiotem prawa własności, wskazano najważniejsze czynniki, które kształtują ich wartość. Jako cechy różniące występujące</w:t>
-      </w:r>
-      <w:r>
-        <w:rPr>
-          <w:rFonts w:ascii="Segoe UI" w:hAnsi="Segoe UI" w:cs="Segoe UI"/>
-          <w:sz w:val="20"/>
-          <w:szCs w:val="20"/>
-        </w:rPr>
-        <w:t xml:space="preserve"> </w:t>
+        <w:t xml:space="preserve">Na podstawie analizy transakcji lokali o funkcji mieszkalnej będących przedmiotem prawa własności, wskazano najważniejsze czynniki, które kształtują ich wartość. Cechy różniące występujące w zebranej próbie, a mogące mieć wpływ na ich cenę, to: {cechy_lista}.</w:t>
+      </w:r>
+      <w:r>
+        <w:rPr>
+          <w:rFonts w:ascii="Segoe UI" w:hAnsi="Segoe UI" w:cs="Segoe UI"/>
+          <w:sz w:val="20"/>
+          <w:szCs w:val="20"/>
+        </w:rPr>
+        <w:t xml:space="preserve"/>
       </w:r>
       <w:r>
         <w:rPr>
@@ -14728,71 +14728,71 @@
           <w:sz w:val="20"/>
           <w:szCs w:val="20"/>
         </w:rPr>
-        <w:t xml:space="preserve">w zebranej próbie, a mogące mieć wpływ na ich cenę wskazano: </w:t>
-      </w:r>
-      <w:r>
-        <w:rPr>
-          <w:rFonts w:ascii="Segoe UI" w:hAnsi="Segoe UI" w:cs="Segoe UI"/>
-          <w:sz w:val="20"/>
-          <w:szCs w:val="20"/>
-        </w:rPr>
-        <w:t xml:space="preserve">standard wykończenia, </w:t>
-      </w:r>
-      <w:r>
-        <w:rPr>
-          <w:rFonts w:ascii="Segoe UI" w:hAnsi="Segoe UI" w:cs="Segoe UI"/>
-          <w:sz w:val="20"/>
-          <w:szCs w:val="20"/>
-        </w:rPr>
-        <w:t>położenie na piętrze</w:t>
-      </w:r>
-      <w:r>
-        <w:rPr>
-          <w:rFonts w:ascii="Segoe UI" w:hAnsi="Segoe UI" w:cs="Segoe UI"/>
-          <w:sz w:val="20"/>
-          <w:szCs w:val="20"/>
-        </w:rPr>
-        <w:t xml:space="preserve">, </w:t>
-      </w:r>
-      <w:r>
-        <w:rPr>
-          <w:rFonts w:ascii="Segoe UI" w:hAnsi="Segoe UI" w:cs="Segoe UI"/>
-          <w:sz w:val="20"/>
-          <w:szCs w:val="20"/>
-        </w:rPr>
-        <w:t xml:space="preserve">powierzchnię użytkową, </w:t>
-      </w:r>
-      <w:r>
-        <w:rPr>
-          <w:rFonts w:ascii="Segoe UI" w:hAnsi="Segoe UI" w:cs="Segoe UI"/>
-          <w:sz w:val="20"/>
-          <w:szCs w:val="20"/>
-        </w:rPr>
-        <w:t>dodatkowe</w:t>
-      </w:r>
-      <w:r>
-        <w:rPr>
-          <w:rFonts w:ascii="Segoe UI" w:hAnsi="Segoe UI" w:cs="Segoe UI"/>
-          <w:sz w:val="20"/>
-          <w:szCs w:val="20"/>
-        </w:rPr>
-        <w:t xml:space="preserve"> oraz </w:t>
-      </w:r>
-      <w:r>
-        <w:rPr>
-          <w:rFonts w:ascii="Segoe UI" w:hAnsi="Segoe UI" w:cs="Segoe UI"/>
-          <w:sz w:val="20"/>
-          <w:szCs w:val="20"/>
-        </w:rPr>
-        <w:t>lokalizację szczegółową</w:t>
-      </w:r>
-      <w:r>
-        <w:rPr>
-          <w:rFonts w:ascii="Segoe UI" w:hAnsi="Segoe UI" w:cs="Segoe UI"/>
-          <w:sz w:val="20"/>
-          <w:szCs w:val="20"/>
-        </w:rPr>
-        <w:t>.</w:t>
+        <w:t xml:space="preserve"/>
+      </w:r>
+      <w:r>
+        <w:rPr>
+          <w:rFonts w:ascii="Segoe UI" w:hAnsi="Segoe UI" w:cs="Segoe UI"/>
+          <w:sz w:val="20"/>
+          <w:szCs w:val="20"/>
+        </w:rPr>
+        <w:t xml:space="preserve"/>
+      </w:r>
+      <w:r>
+        <w:rPr>
+          <w:rFonts w:ascii="Segoe UI" w:hAnsi="Segoe UI" w:cs="Segoe UI"/>
+          <w:sz w:val="20"/>
+          <w:szCs w:val="20"/>
+        </w:rPr>
+        <w:t/>
+      </w:r>
+      <w:r>
+        <w:rPr>
+          <w:rFonts w:ascii="Segoe UI" w:hAnsi="Segoe UI" w:cs="Segoe UI"/>
+          <w:sz w:val="20"/>
+          <w:szCs w:val="20"/>
+        </w:rPr>
+        <w:t xml:space="preserve"/>
+      </w:r>
+      <w:r>
+        <w:rPr>
+          <w:rFonts w:ascii="Segoe UI" w:hAnsi="Segoe UI" w:cs="Segoe UI"/>
+          <w:sz w:val="20"/>
+          <w:szCs w:val="20"/>
+        </w:rPr>
+        <w:t xml:space="preserve"/>
+      </w:r>
+      <w:r>
+        <w:rPr>
+          <w:rFonts w:ascii="Segoe UI" w:hAnsi="Segoe UI" w:cs="Segoe UI"/>
+          <w:sz w:val="20"/>
+          <w:szCs w:val="20"/>
+        </w:rPr>
+        <w:t/>
+      </w:r>
+      <w:r>
+        <w:rPr>
+          <w:rFonts w:ascii="Segoe UI" w:hAnsi="Segoe UI" w:cs="Segoe UI"/>
+          <w:sz w:val="20"/>
+          <w:szCs w:val="20"/>
+        </w:rPr>
+        <w:t xml:space="preserve"/>
+      </w:r>
+      <w:r>
+        <w:rPr>
+          <w:rFonts w:ascii="Segoe UI" w:hAnsi="Segoe UI" w:cs="Segoe UI"/>
+          <w:sz w:val="20"/>
+          <w:szCs w:val="20"/>
+        </w:rPr>
+        <w:t/>
+      </w:r>
+      <w:r>
+        <w:rPr>
+          <w:rFonts w:ascii="Segoe UI" w:hAnsi="Segoe UI" w:cs="Segoe UI"/>
+          <w:sz w:val="20"/>
+          <w:szCs w:val="20"/>
+        </w:rPr>
+        <w:t/>
       </w:r>
     </w:p>
     <w:p>
@@ -14912,6 +14912,113 @@
           <w:szCs w:val="20"/>
         </w:rPr>
       </w:pPr>
+    </w:p>
+    <w:p>
+      <w:pPr>
+        <w:spacing w:line="276" w:lineRule="auto"/>
+        <w:jc w:val="both"/>
+        <w:rPr>
+          <w:rFonts w:ascii="Segoe UI" w:hAnsi="Segoe UI" w:cs="Segoe UI"/>
+          <w:sz w:val="20"/>
+          <w:szCs w:val="20"/>
+        </w:rPr>
+      </w:pPr>
+      <w:r>
+        <w:rPr>
+          <w:rFonts w:ascii="Segoe UI" w:hAnsi="Segoe UI" w:cs="Segoe UI"/>
+          <w:sz w:val="20"/>
+          <w:szCs w:val="20"/>
+        </w:rPr>
+        <w:t xml:space="preserve">{#ma_skale}</w:t>
+      </w:r>
+      <w:r>
+        <w:rPr>
+          <w:rFonts w:ascii="Segoe UI" w:hAnsi="Segoe UI" w:cs="Segoe UI"/>
+          <w:sz w:val="20"/>
+          <w:szCs w:val="20"/>
+        </w:rPr>
+        <w:t xml:space="preserve"/>
+      </w:r>
+      <w:r>
+        <w:rPr>
+          <w:rFonts w:ascii="Segoe UI" w:hAnsi="Segoe UI" w:cs="Segoe UI"/>
+          <w:sz w:val="20"/>
+          <w:szCs w:val="20"/>
+        </w:rPr>
+        <w:br/>
+      </w:r>
+      <w:r>
+        <w:rPr>
+          <w:rFonts w:ascii="Segoe UI" w:hAnsi="Segoe UI" w:cs="Segoe UI"/>
+          <w:sz w:val="20"/>
+          <w:szCs w:val="20"/>
+        </w:rPr>
+        <w:t xml:space="preserve"/>
+      </w:r>
+      <w:r>
+        <w:rPr>
+          <w:rFonts w:ascii="Segoe UI" w:hAnsi="Segoe UI" w:cs="Segoe UI"/>
+          <w:sz w:val="20"/>
+          <w:szCs w:val="20"/>
+        </w:rPr>
+        <w:t xml:space="preserve"/>
+      </w:r>
+      <w:r>
+        <w:rPr>
+          <w:rFonts w:ascii="Segoe UI" w:hAnsi="Segoe UI" w:cs="Segoe UI"/>
+          <w:sz w:val="20"/>
+          <w:szCs w:val="20"/>
+        </w:rPr>
+        <w:t/>
+      </w:r>
+      <w:r>
+        <w:rPr>
+          <w:rFonts w:ascii="Segoe UI" w:hAnsi="Segoe UI" w:cs="Segoe UI"/>
+          <w:sz w:val="20"/>
+          <w:szCs w:val="20"/>
+        </w:rPr>
+        <w:t xml:space="preserve"/>
+      </w:r>
+      <w:r>
+        <w:rPr>
+          <w:rFonts w:ascii="Segoe UI" w:hAnsi="Segoe UI" w:cs="Segoe UI"/>
+          <w:sz w:val="20"/>
+          <w:szCs w:val="20"/>
+        </w:rPr>
+        <w:t xml:space="preserve"/>
+      </w:r>
+      <w:r>
+        <w:rPr>
+          <w:rFonts w:ascii="Segoe UI" w:hAnsi="Segoe UI" w:cs="Segoe UI"/>
+          <w:sz w:val="20"/>
+          <w:szCs w:val="20"/>
+        </w:rPr>
+        <w:t/>
+      </w:r>
+      <w:r>
+        <w:rPr>
+          <w:rFonts w:ascii="Segoe UI" w:hAnsi="Segoe UI" w:cs="Segoe UI"/>
+          <w:sz w:val="20"/>
+          <w:szCs w:val="20"/>
+        </w:rPr>
+        <w:t xml:space="preserve"/>
+      </w:r>
+      <w:r>
+        <w:rPr>
+          <w:rFonts w:ascii="Segoe UI" w:hAnsi="Segoe UI" w:cs="Segoe UI"/>
+          <w:sz w:val="20"/>
+          <w:szCs w:val="20"/>
+        </w:rPr>
+        <w:t/>
+      </w:r>
+      <w:r>
+        <w:rPr>
+          <w:rFonts w:ascii="Segoe UI" w:hAnsi="Segoe UI" w:cs="Segoe UI"/>
+          <w:sz w:val="20"/>
+          <w:szCs w:val="20"/>
+        </w:rPr>
+        <w:t/>
+      </w:r>
     </w:p>
     <w:p>
       <w:pPr>
@@ -15156,6 +15263,113 @@
     </w:p>
     <w:p>
       <w:pPr>
+        <w:spacing w:line="276" w:lineRule="auto"/>
+        <w:jc w:val="both"/>
+        <w:rPr>
+          <w:rFonts w:ascii="Segoe UI" w:hAnsi="Segoe UI" w:cs="Segoe UI"/>
+          <w:sz w:val="20"/>
+          <w:szCs w:val="20"/>
+        </w:rPr>
+      </w:pPr>
+      <w:r>
+        <w:rPr>
+          <w:rFonts w:ascii="Segoe UI" w:hAnsi="Segoe UI" w:cs="Segoe UI"/>
+          <w:sz w:val="20"/>
+          <w:szCs w:val="20"/>
+        </w:rPr>
+        <w:t xml:space="preserve">{/ma_skale}</w:t>
+      </w:r>
+      <w:r>
+        <w:rPr>
+          <w:rFonts w:ascii="Segoe UI" w:hAnsi="Segoe UI" w:cs="Segoe UI"/>
+          <w:sz w:val="20"/>
+          <w:szCs w:val="20"/>
+        </w:rPr>
+        <w:t xml:space="preserve"/>
+      </w:r>
+      <w:r>
+        <w:rPr>
+          <w:rFonts w:ascii="Segoe UI" w:hAnsi="Segoe UI" w:cs="Segoe UI"/>
+          <w:sz w:val="20"/>
+          <w:szCs w:val="20"/>
+        </w:rPr>
+        <w:br/>
+      </w:r>
+      <w:r>
+        <w:rPr>
+          <w:rFonts w:ascii="Segoe UI" w:hAnsi="Segoe UI" w:cs="Segoe UI"/>
+          <w:sz w:val="20"/>
+          <w:szCs w:val="20"/>
+        </w:rPr>
+        <w:t xml:space="preserve"/>
+      </w:r>
+      <w:r>
+        <w:rPr>
+          <w:rFonts w:ascii="Segoe UI" w:hAnsi="Segoe UI" w:cs="Segoe UI"/>
+          <w:sz w:val="20"/>
+          <w:szCs w:val="20"/>
+        </w:rPr>
+        <w:t xml:space="preserve"/>
+      </w:r>
+      <w:r>
+        <w:rPr>
+          <w:rFonts w:ascii="Segoe UI" w:hAnsi="Segoe UI" w:cs="Segoe UI"/>
+          <w:sz w:val="20"/>
+          <w:szCs w:val="20"/>
+        </w:rPr>
+        <w:t/>
+      </w:r>
+      <w:r>
+        <w:rPr>
+          <w:rFonts w:ascii="Segoe UI" w:hAnsi="Segoe UI" w:cs="Segoe UI"/>
+          <w:sz w:val="20"/>
+          <w:szCs w:val="20"/>
+        </w:rPr>
+        <w:t xml:space="preserve"/>
+      </w:r>
+      <w:r>
+        <w:rPr>
+          <w:rFonts w:ascii="Segoe UI" w:hAnsi="Segoe UI" w:cs="Segoe UI"/>
+          <w:sz w:val="20"/>
+          <w:szCs w:val="20"/>
+        </w:rPr>
+        <w:t xml:space="preserve"/>
+      </w:r>
+      <w:r>
+        <w:rPr>
+          <w:rFonts w:ascii="Segoe UI" w:hAnsi="Segoe UI" w:cs="Segoe UI"/>
+          <w:sz w:val="20"/>
+          <w:szCs w:val="20"/>
+        </w:rPr>
+        <w:t/>
+      </w:r>
+      <w:r>
+        <w:rPr>
+          <w:rFonts w:ascii="Segoe UI" w:hAnsi="Segoe UI" w:cs="Segoe UI"/>
+          <w:sz w:val="20"/>
+          <w:szCs w:val="20"/>
+        </w:rPr>
+        <w:t xml:space="preserve"/>
+      </w:r>
+      <w:r>
+        <w:rPr>
+          <w:rFonts w:ascii="Segoe UI" w:hAnsi="Segoe UI" w:cs="Segoe UI"/>
+          <w:sz w:val="20"/>
+          <w:szCs w:val="20"/>
+        </w:rPr>
+        <w:t/>
+      </w:r>
+      <w:r>
+        <w:rPr>
+          <w:rFonts w:ascii="Segoe UI" w:hAnsi="Segoe UI" w:cs="Segoe UI"/>
+          <w:sz w:val="20"/>
+          <w:szCs w:val="20"/>
+        </w:rPr>
+        <w:t/>
+      </w:r>
+    </w:p>
+    <w:p>
+      <w:pPr>
         <w:pStyle w:val="iza2"/>
         <w:spacing w:line="276" w:lineRule="auto"/>
         <w:ind w:left="567" w:hanging="567"/>
@@ -15259,23 +15473,23 @@
           <w:sz w:val="20"/>
           <w:szCs w:val="20"/>
         </w:rPr>
-        <w:t>Kryterium wyboru lokali mieszkalnych przyjętych do porównań były cechy rynkowe zgodnie z ich wagą, czyli kolejno: standard wykończenia, położenie na piętrze</w:t>
-      </w:r>
-      <w:r>
-        <w:rPr>
-          <w:rFonts w:ascii="Segoe UI" w:hAnsi="Segoe UI" w:cs="Segoe UI"/>
-          <w:sz w:val="20"/>
-          <w:szCs w:val="20"/>
-        </w:rPr>
-        <w:t>, powierzchnia użytkowa, dodatkowe oraz lokalizacja szczegółowa</w:t>
-      </w:r>
-      <w:r>
-        <w:rPr>
-          <w:rFonts w:ascii="Segoe UI" w:hAnsi="Segoe UI" w:cs="Segoe UI"/>
-          <w:sz w:val="20"/>
-          <w:szCs w:val="20"/>
-        </w:rPr>
-        <w:t xml:space="preserve">. Zgodnie z powyższym, podobieństwo nieruchomości sformułowano za pomocą 5 atrybutów. </w:t>
+        <w:t xml:space="preserve">Kryterium wyboru lokali mieszkalnych przyjętych do porównań były cechy rynkowe zgodnie z ich wagą, czyli kolejno: {cechy_lista_wg_wag}. Zgodnie z powyższym, podobieństwo nieruchomości sformułowano za pomocą {liczba_atrybutow_fraza}.</w:t>
+      </w:r>
+      <w:r>
+        <w:rPr>
+          <w:rFonts w:ascii="Segoe UI" w:hAnsi="Segoe UI" w:cs="Segoe UI"/>
+          <w:sz w:val="20"/>
+          <w:szCs w:val="20"/>
+        </w:rPr>
+        <w:t/>
+      </w:r>
+      <w:r>
+        <w:rPr>
+          <w:rFonts w:ascii="Segoe UI" w:hAnsi="Segoe UI" w:cs="Segoe UI"/>
+          <w:sz w:val="20"/>
+          <w:szCs w:val="20"/>
+        </w:rPr>
+        <w:t xml:space="preserve"/>
       </w:r>
     </w:p>
     <w:p>

</xml_diff>

<commit_message>
feat(template): section 8.1 conditional map block with source captions (f-12 stage)
</commit_message>
<xml_diff>
--- a/apps/web/templates/operat-szablon.docx
+++ b/apps/web/templates/operat-szablon.docx
@@ -9256,6 +9256,82 @@
           <w:szCs w:val="20"/>
         </w:rPr>
         <w:t xml:space="preserve"/>
+      </w:r>
+    </w:p>
+    <w:p>
+      <w:pPr>
+        <w:jc w:val="center"/>
+      </w:pPr>
+      <w:r>
+        <w:t xml:space="preserve">{#mapy}</w:t>
+      </w:r>
+    </w:p>
+    <w:p>
+      <w:pPr>
+        <w:keepNext/>
+        <w:jc w:val="center"/>
+      </w:pPr>
+      <w:r>
+        <w:t xml:space="preserve">Mapa ewidencyjna:</w:t>
+      </w:r>
+    </w:p>
+    <w:p>
+      <w:pPr>
+        <w:keepNext/>
+        <w:jc w:val="center"/>
+      </w:pPr>
+      <w:r>
+        <w:t xml:space="preserve">{%mapa_ewidencyjna}</w:t>
+      </w:r>
+    </w:p>
+    <w:p>
+      <w:pPr>
+        <w:jc w:val="center"/>
+      </w:pPr>
+      <w:r>
+        <w:t xml:space="preserve">Źródło: Geoportal.gov.pl, dane pobrane {mapy_data}</w:t>
+      </w:r>
+    </w:p>
+    <w:p>
+      <w:pPr>
+        <w:keepNext/>
+        <w:jc w:val="center"/>
+      </w:pPr>
+      <w:r>
+        <w:t xml:space="preserve">Ortofotomapa:</w:t>
+      </w:r>
+    </w:p>
+    <w:p>
+      <w:pPr>
+        <w:keepNext/>
+        <w:jc w:val="center"/>
+      </w:pPr>
+      <w:r>
+        <w:t xml:space="preserve">{%mapa_orto}</w:t>
+      </w:r>
+    </w:p>
+    <w:p>
+      <w:pPr>
+        <w:jc w:val="center"/>
+      </w:pPr>
+      <w:r>
+        <w:t xml:space="preserve">Źródło: Geoportal.gov.pl, dane pobrane {mapy_data}</w:t>
+      </w:r>
+    </w:p>
+    <w:p>
+      <w:pPr>
+        <w:jc w:val="center"/>
+      </w:pPr>
+      <w:r>
+        <w:t xml:space="preserve">{/mapy}</w:t>
+      </w:r>
+    </w:p>
+    <w:p>
+      <w:pPr>
+        <w:jc w:val="center"/>
+      </w:pPr>
+      <w:r>
+        <w:t xml:space="preserve">{^mapy}Dokumentacja kartograficzna zostanie uzupełniona.{/mapy}</w:t>
       </w:r>
     </w:p>
     <w:p>

</xml_diff>

<commit_message>
feat(web): template stage 13 - inspection photo blocks + note, stub removal (fr-2)
</commit_message>
<xml_diff>
--- a/apps/web/templates/operat-szablon.docx
+++ b/apps/web/templates/operat-szablon.docx
@@ -8944,11 +8944,6 @@
         </w:rPr>
       </w:pPr>
     </w:p>
-    <w:p>
-      <w:r>
-        <w:t xml:space="preserve">Dokumentacja fotograficzna i kartograficzna zostanie uzupełniona po oględzinach.</w:t>
-      </w:r>
-    </w:p>
     <w:bookmarkEnd w:id="18"/>
     <w:p>
       <w:pPr>
@@ -9332,6 +9327,42 @@
       </w:pPr>
       <w:r>
         <w:t xml:space="preserve">{^mapy}Dokumentacja kartograficzna zostanie uzupełniona.{/mapy}</w:t>
+      </w:r>
+    </w:p>
+    <w:p>
+      <w:r>
+        <w:t xml:space="preserve">{#ma_foto_otoczenie}</w:t>
+      </w:r>
+    </w:p>
+    <w:p>
+      <w:pPr>
+        <w:keepNext/>
+      </w:pPr>
+      <w:r>
+        <w:t xml:space="preserve">Poniżej dokumentacja fotograficzna drogi dojazdowej oraz bezpośredniego otoczenia, wg stanu aktualnego:</w:t>
+      </w:r>
+    </w:p>
+    <w:p>
+      <w:r>
+        <w:t xml:space="preserve">{#foto_otoczenie}</w:t>
+      </w:r>
+    </w:p>
+    <w:p>
+      <w:pPr>
+        <w:jc w:val="center"/>
+      </w:pPr>
+      <w:r>
+        <w:t xml:space="preserve">{%img}</w:t>
+      </w:r>
+    </w:p>
+    <w:p>
+      <w:r>
+        <w:t xml:space="preserve">{/foto_otoczenie}</w:t>
+      </w:r>
+    </w:p>
+    <w:p>
+      <w:r>
+        <w:t xml:space="preserve">{/ma_foto_otoczenie}</w:t>
       </w:r>
     </w:p>
     <w:p>
@@ -10286,7 +10317,38 @@
     </w:p>
     <w:p>
       <w:r>
-        <w:t xml:space="preserve">Dokumentacja fotograficzna i kartograficzna zostanie uzupełniona po oględzinach.</w:t>
+        <w:t xml:space="preserve">{#ma_foto_budynek}</w:t>
+      </w:r>
+    </w:p>
+    <w:p>
+      <w:pPr>
+        <w:keepNext/>
+      </w:pPr>
+      <w:r>
+        <w:t xml:space="preserve">Poniżej przedstawiono dokumentację fotograficzną budynku oraz bezpośredniego otoczenia, wg stanu aktualnego:</w:t>
+      </w:r>
+    </w:p>
+    <w:p>
+      <w:r>
+        <w:t xml:space="preserve">{#foto_budynek}</w:t>
+      </w:r>
+    </w:p>
+    <w:p>
+      <w:pPr>
+        <w:jc w:val="center"/>
+      </w:pPr>
+      <w:r>
+        <w:t xml:space="preserve">{%img}</w:t>
+      </w:r>
+    </w:p>
+    <w:p>
+      <w:r>
+        <w:t xml:space="preserve">{/foto_budynek}</w:t>
+      </w:r>
+    </w:p>
+    <w:p>
+      <w:r>
+        <w:t xml:space="preserve">{/ma_foto_budynek}</w:t>
       </w:r>
     </w:p>
     <w:p>
@@ -10426,6 +10488,65 @@
           <w:szCs w:val="20"/>
         </w:rPr>
         <w:t xml:space="preserve"/>
+      </w:r>
+    </w:p>
+    <w:p>
+      <w:r>
+        <w:t xml:space="preserve">{#ma_foto_wnetrza}</w:t>
+      </w:r>
+    </w:p>
+    <w:p>
+      <w:pPr>
+        <w:keepNext/>
+      </w:pPr>
+      <w:r>
+        <w:t xml:space="preserve">Poniżej przedstawiono dokumentację fotograficzną lokalu mieszkalnego, wg stanu aktualnego:</w:t>
+      </w:r>
+    </w:p>
+    <w:p>
+      <w:r>
+        <w:t xml:space="preserve">{#foto_wnetrza}</w:t>
+      </w:r>
+    </w:p>
+    <w:p>
+      <w:pPr>
+        <w:jc w:val="center"/>
+      </w:pPr>
+      <w:r>
+        <w:t xml:space="preserve">{%img}</w:t>
+      </w:r>
+    </w:p>
+    <w:p>
+      <w:r>
+        <w:t xml:space="preserve">{/foto_wnetrza}</w:t>
+      </w:r>
+    </w:p>
+    <w:p>
+      <w:r>
+        <w:t xml:space="preserve">{/ma_foto_wnetrza}</w:t>
+      </w:r>
+    </w:p>
+    <w:p>
+      <w:r>
+        <w:t xml:space="preserve">{#ma_uwagi_ogledzin}</w:t>
+      </w:r>
+    </w:p>
+    <w:p>
+      <w:pPr>
+        <w:keepNext/>
+      </w:pPr>
+      <w:r>
+        <w:t xml:space="preserve">Uwagi z oględzin:</w:t>
+      </w:r>
+    </w:p>
+    <w:p>
+      <w:r>
+        <w:t xml:space="preserve">{uwagi_ogledzin}</w:t>
+      </w:r>
+    </w:p>
+    <w:p>
+      <w:r>
+        <w:t xml:space="preserve">{/ma_uwagi_ogledzin}</w:t>
       </w:r>
     </w:p>
     <w:p>
@@ -10947,11 +11068,6 @@
           <w:szCs w:val="20"/>
         </w:rPr>
       </w:pPr>
-    </w:p>
-    <w:p>
-      <w:r>
-        <w:t xml:space="preserve">Dokumentacja fotograficzna i kartograficzna zostanie uzupełniona po oględzinach.</w:t>
-      </w:r>
     </w:p>
     <w:p>
       <w:pPr>
@@ -20156,11 +20272,6 @@
           <w:szCs w:val="20"/>
         </w:rPr>
       </w:pPr>
-    </w:p>
-    <w:p>
-      <w:r>
-        <w:t xml:space="preserve">Dokumentacja fotograficzna i kartograficzna zostanie uzupełniona po oględzinach.</w:t>
-      </w:r>
     </w:p>
     <w:bookmarkEnd w:id="97"/>
     <w:p>

</xml_diff>

<commit_message>
feat(web): render operat prose from the snapshot; drop source-operat literals
</commit_message>
<xml_diff>
--- a/apps/web/templates/operat-szablon.docx
+++ b/apps/web/templates/operat-szablon.docx
@@ -4771,7 +4771,7 @@
                 <w:sz w:val="18"/>
                 <w:szCs w:val="18"/>
               </w:rPr>
-              <w:t xml:space="preserve">Lokal mieszkalny o powierzchni użytkowej {powierzchnia} m2. Szczegółowy opis układu funkcjonalnego zostanie uzupełniony po oględzinach.</w:t>
+              <w:t xml:space="preserve">{proza_opis_lokalu}</w:t>
             </w:r>
             <w:r>
               <w:rPr>
@@ -9018,7 +9018,7 @@
           <w:sz w:val="20"/>
           <w:szCs w:val="20"/>
         </w:rPr>
-        <w:t xml:space="preserve">Wyceniana nieruchomość zlokalizowana jest pod adresem: {adres}. Charakterystyka bezpośredniego otoczenia zostanie uzupełniona po oględzinach. </w:t>
+        <w:t xml:space="preserve">Wyceniana nieruchomość zlokalizowana jest pod adresem: {adres}. {proza_otoczenie}</w:t>
       </w:r>
       <w:r>
         <w:rPr>
@@ -9363,74 +9363,6 @@
     <w:p>
       <w:r>
         <w:t xml:space="preserve">{/ma_foto_otoczenie}</w:t>
-      </w:r>
-    </w:p>
-    <w:p>
-      <w:pPr>
-        <w:pStyle w:val="Bezodstpw"/>
-        <w:spacing w:line="276" w:lineRule="auto"/>
-        <w:jc w:val="both"/>
-        <w:rPr>
-          <w:rFonts w:ascii="Segoe UI" w:hAnsi="Segoe UI" w:cs="Segoe UI"/>
-          <w:sz w:val="20"/>
-          <w:szCs w:val="20"/>
-        </w:rPr>
-      </w:pPr>
-      <w:r>
-        <w:rPr>
-          <w:rFonts w:ascii="Segoe UI" w:hAnsi="Segoe UI" w:cs="Segoe UI"/>
-          <w:sz w:val="20"/>
-          <w:szCs w:val="20"/>
-        </w:rPr>
-        <w:t>Dojazd do przedmiotow</w:t>
-      </w:r>
-      <w:r>
-        <w:rPr>
-          <w:rFonts w:ascii="Segoe UI" w:hAnsi="Segoe UI" w:cs="Segoe UI"/>
-          <w:sz w:val="20"/>
-          <w:szCs w:val="20"/>
-        </w:rPr>
-        <w:t xml:space="preserve">ej </w:t>
-      </w:r>
-      <w:r>
-        <w:rPr>
-          <w:rFonts w:ascii="Segoe UI" w:hAnsi="Segoe UI" w:cs="Segoe UI"/>
-          <w:sz w:val="20"/>
-          <w:szCs w:val="20"/>
-        </w:rPr>
-        <w:t xml:space="preserve">nieruchomości odbywa się komunikacją </w:t>
-      </w:r>
-      <w:r>
-        <w:rPr>
-          <w:rFonts w:ascii="Segoe UI" w:hAnsi="Segoe UI" w:cs="Segoe UI"/>
-          <w:sz w:val="20"/>
-          <w:szCs w:val="20"/>
-        </w:rPr>
-        <w:t>miejską</w:t>
-      </w:r>
-      <w:r>
-        <w:rPr>
-          <w:rFonts w:ascii="Segoe UI" w:hAnsi="Segoe UI" w:cs="Segoe UI"/>
-          <w:sz w:val="20"/>
-          <w:szCs w:val="20"/>
-        </w:rPr>
-        <w:t xml:space="preserve">. </w:t>
-      </w:r>
-      <w:r>
-        <w:rPr>
-          <w:rFonts w:ascii="Segoe UI" w:hAnsi="Segoe UI" w:cs="Segoe UI"/>
-          <w:sz w:val="20"/>
-          <w:szCs w:val="20"/>
-        </w:rPr>
-        <w:t>Przystanki komunikacji publicznej w zasięgu nieruchomości</w:t>
-      </w:r>
-      <w:r>
-        <w:rPr>
-          <w:rFonts w:ascii="Segoe UI" w:hAnsi="Segoe UI" w:cs="Segoe UI"/>
-          <w:sz w:val="20"/>
-          <w:szCs w:val="20"/>
-        </w:rPr>
-        <w:t>.</w:t>
       </w:r>
     </w:p>
     <w:p>
@@ -9878,6 +9810,11 @@
       </w:r>
     </w:p>
     <w:p>
+      <w:r>
+        <w:t xml:space="preserve">{#ma_proza_standard}</w:t>
+      </w:r>
+    </w:p>
+    <w:p>
       <w:pPr>
         <w:pStyle w:val="Tekstpodstawowywcity"/>
         <w:spacing w:after="0" w:line="276" w:lineRule="auto"/>
@@ -9895,7 +9832,7 @@
           <w:sz w:val="20"/>
           <w:szCs w:val="20"/>
         </w:rPr>
-        <w:t xml:space="preserve">Stan techniczny lokalu przyjęto na podstawie oświadczenia zamawiającego oraz przeglądu dostępnej dokumentacji. Szczegółowy opis zostanie uzupełniony po oględzinach.</w:t>
+        <w:t xml:space="preserve">{proza_standard}</w:t>
       </w:r>
       <w:r>
         <w:rPr>
@@ -10300,6 +10237,11 @@
           <w:szCs w:val="20"/>
         </w:rPr>
         <w:t xml:space="preserve"/>
+      </w:r>
+    </w:p>
+    <w:p>
+      <w:r>
+        <w:t xml:space="preserve">{/ma_proza_standard}</w:t>
       </w:r>
     </w:p>
     <w:p>
@@ -10421,6 +10363,11 @@
       </w:pPr>
     </w:p>
     <w:p>
+      <w:r>
+        <w:t xml:space="preserve">{#ma_proza_opis_lokalu}</w:t>
+      </w:r>
+    </w:p>
+    <w:p>
       <w:pPr>
         <w:spacing w:line="276" w:lineRule="auto"/>
         <w:jc w:val="both"/>
@@ -10436,7 +10383,7 @@
           <w:sz w:val="20"/>
           <w:szCs w:val="20"/>
         </w:rPr>
-        <w:t xml:space="preserve">Lokal mieszkalny o powierzchni użytkowej {powierzchnia} m2. Szczegółowy opis układu funkcjonalnego zostanie uzupełniony po oględzinach.</w:t>
+        <w:t xml:space="preserve">{proza_opis_lokalu}</w:t>
       </w:r>
       <w:r>
         <w:rPr>
@@ -10488,6 +10435,11 @@
           <w:szCs w:val="20"/>
         </w:rPr>
         <w:t xml:space="preserve"/>
+      </w:r>
+    </w:p>
+    <w:p>
+      <w:r>
+        <w:t xml:space="preserve">{/ma_proza_opis_lokalu}</w:t>
       </w:r>
     </w:p>
     <w:p>
@@ -10617,7 +10569,7 @@
           <w:sz w:val="20"/>
           <w:szCs w:val="20"/>
         </w:rPr>
-        <w:t xml:space="preserve">Przedmiotowa nieruchomość lokalowa zlokalizowana jest pod adresem: {adres}. Opis zagospodarowania terenu zostanie uzupełniony po oględzinach.</w:t>
+        <w:t xml:space="preserve">Przedmiotowa nieruchomość lokalowa zlokalizowana jest pod adresem: {adres}. {proza_zagospodarowanie}</w:t>
       </w:r>
       <w:r>
         <w:rPr>
@@ -13519,6 +13471,11 @@
       </w:pPr>
     </w:p>
     <w:p>
+      <w:r>
+        <w:t xml:space="preserve">{#ma_proza_analiza_rynku}</w:t>
+      </w:r>
+    </w:p>
+    <w:p>
       <w:pPr>
         <w:pStyle w:val="Akapitzlist"/>
         <w:spacing w:line="276" w:lineRule="auto"/>
@@ -13536,7 +13493,7 @@
           <w:sz w:val="20"/>
           <w:szCs w:val="20"/>
         </w:rPr>
-        <w:t xml:space="preserve">Dla określenia wartości rynkowej prawa własności wycenianej nieruchomości lokalowej o funkcji mieszkalnej, przeprowadzono analizę rynku lokalnego ze szczególnym uwzględnieniem lokalizacji nieruchomości stanowiącej przedmiot wyceny. </w:t>
+        <w:t xml:space="preserve">{proza_analiza_rynku}</w:t>
       </w:r>
       <w:r>
         <w:rPr>
@@ -13577,6 +13534,11 @@
           <w:szCs w:val="20"/>
         </w:rPr>
         <w:t xml:space="preserve"/>
+      </w:r>
+    </w:p>
+    <w:p>
+      <w:r>
+        <w:t xml:space="preserve">{/ma_proza_analiza_rynku}</w:t>
       </w:r>
     </w:p>
     <w:p>
@@ -13596,942 +13558,44 @@
     </w:p>
     <w:p>
       <w:pPr>
-        <w:pStyle w:val="Akapitzlist"/>
-        <w:spacing w:line="276" w:lineRule="auto"/>
-        <w:ind w:left="0"/>
-        <w:jc w:val="both"/>
-        <w:rPr>
-          <w:rFonts w:ascii="Segoe UI" w:hAnsi="Segoe UI" w:cs="Segoe UI"/>
-          <w:bCs/>
-          <w:sz w:val="20"/>
-          <w:szCs w:val="20"/>
-          <w:u w:val="single"/>
-        </w:rPr>
-      </w:pPr>
-      <w:r>
-        <w:rPr>
-          <w:rFonts w:ascii="Segoe UI" w:hAnsi="Segoe UI" w:cs="Segoe UI"/>
-          <w:bCs/>
-          <w:sz w:val="20"/>
-          <w:szCs w:val="20"/>
-          <w:u w:val="single"/>
-        </w:rPr>
-        <w:t>Cechy analizowanego rynku:</w:t>
-      </w:r>
-    </w:p>
-    <w:p>
-      <w:pPr>
-        <w:pStyle w:val="Akapitzlist"/>
-        <w:numPr>
-          <w:ilvl w:val="0"/>
-          <w:numId w:val="7"/>
-        </w:numPr>
         <w:spacing w:line="276" w:lineRule="auto"/>
         <w:jc w:val="both"/>
         <w:rPr>
           <w:rFonts w:ascii="Segoe UI" w:hAnsi="Segoe UI" w:cs="Segoe UI"/>
-          <w:sz w:val="20"/>
-          <w:szCs w:val="20"/>
-        </w:rPr>
-      </w:pPr>
-      <w:r>
-        <w:rPr>
-          <w:rFonts w:ascii="Segoe UI" w:hAnsi="Segoe UI" w:cs="Segoe UI"/>
-          <w:sz w:val="20"/>
-          <w:szCs w:val="20"/>
-        </w:rPr>
-        <w:t>zakres przedmiotowy – rynek wtórny nieruchomości lokalowych o funkcji mieszkalnej</w:t>
-      </w:r>
-      <w:r>
-        <w:rPr>
-          <w:rFonts w:ascii="Segoe UI" w:hAnsi="Segoe UI" w:cs="Segoe UI"/>
-          <w:sz w:val="20"/>
-          <w:szCs w:val="20"/>
-        </w:rPr>
-        <w:t>,</w:t>
-      </w:r>
-      <w:r>
-        <w:rPr>
-          <w:rFonts w:ascii="Segoe UI" w:hAnsi="Segoe UI" w:cs="Segoe UI"/>
-          <w:sz w:val="20"/>
-          <w:szCs w:val="20"/>
-        </w:rPr>
-        <w:t xml:space="preserve"> położone w budynkach wybudowanych po 2000 r.,</w:t>
-      </w:r>
-    </w:p>
-    <w:p>
-      <w:pPr>
-        <w:pStyle w:val="Akapitzlist"/>
-        <w:numPr>
-          <w:ilvl w:val="0"/>
-          <w:numId w:val="7"/>
-        </w:numPr>
-        <w:spacing w:line="276" w:lineRule="auto"/>
-        <w:jc w:val="both"/>
-        <w:rPr>
-          <w:rFonts w:ascii="Segoe UI" w:hAnsi="Segoe UI" w:cs="Segoe UI"/>
-          <w:sz w:val="20"/>
-          <w:szCs w:val="20"/>
-        </w:rPr>
-      </w:pPr>
-      <w:r>
-        <w:rPr>
-          <w:rFonts w:ascii="Segoe UI" w:hAnsi="Segoe UI" w:cs="Segoe UI"/>
-          <w:sz w:val="20"/>
-          <w:szCs w:val="20"/>
-        </w:rPr>
-        <w:t xml:space="preserve">obszar badania – rejon lokalizacji wycenianej nieruchomości</w:t>
-      </w:r>
-      <w:r>
-        <w:rPr>
-          <w:rFonts w:ascii="Segoe UI" w:hAnsi="Segoe UI" w:cs="Segoe UI"/>
-          <w:sz w:val="20"/>
-          <w:szCs w:val="20"/>
-        </w:rPr>
+          <w:bCs/>
+          <w:sz w:val="20"/>
+          <w:szCs w:val="20"/>
+        </w:rPr>
+      </w:pPr>
+      <w:bookmarkStart w:id="53" w:name="_Hlk188264593"/>
+      <w:r>
+        <w:rPr>
+          <w:rFonts w:ascii="Segoe UI" w:hAnsi="Segoe UI" w:cs="Segoe UI"/>
+          <w:bCs/>
+          <w:sz w:val="20"/>
+          <w:szCs w:val="20"/>
+        </w:rPr>
+        <w:t xml:space="preserve">Przyjęto współczynnik zmiany cen na poziomie jedności i cen ze względu na upływ czasu nie korygowano.</w:t>
+      </w:r>
+      <w:bookmarkStart w:id="54" w:name="_Hlk204162314"/>
+      <w:r>
+        <w:rPr>
+          <w:rFonts w:ascii="Segoe UI" w:hAnsi="Segoe UI" w:cs="Segoe UI"/>
+          <w:bCs/>
+          <w:sz w:val="20"/>
+          <w:szCs w:val="20"/>
+        </w:rPr>
+        <w:t xml:space="preserve"/>
+      </w:r>
+      <w:r>
+        <w:rPr>
+          <w:rFonts w:ascii="Segoe UI" w:hAnsi="Segoe UI" w:cs="Segoe UI"/>
+          <w:bCs/>
+          <w:sz w:val="20"/>
+          <w:szCs w:val="20"/>
+        </w:rPr>
+        <w:br/>
         <w:t/>
-      </w:r>
-      <w:r>
-        <w:rPr>
-          <w:rFonts w:ascii="Segoe UI" w:hAnsi="Segoe UI" w:cs="Segoe UI"/>
-          <w:sz w:val="20"/>
-          <w:szCs w:val="20"/>
-        </w:rPr>
-        <w:t/>
-      </w:r>
-      <w:r>
-        <w:rPr>
-          <w:rFonts w:ascii="Segoe UI" w:hAnsi="Segoe UI" w:cs="Segoe UI"/>
-          <w:sz w:val="20"/>
-          <w:szCs w:val="20"/>
-        </w:rPr>
-        <w:t/>
-      </w:r>
-      <w:r>
-        <w:rPr>
-          <w:rFonts w:ascii="Segoe UI" w:hAnsi="Segoe UI" w:cs="Segoe UI"/>
-          <w:sz w:val="20"/>
-          <w:szCs w:val="20"/>
-        </w:rPr>
-        <w:t xml:space="preserve"/>
-      </w:r>
-    </w:p>
-    <w:p>
-      <w:pPr>
-        <w:pStyle w:val="Akapitzlist"/>
-        <w:numPr>
-          <w:ilvl w:val="0"/>
-          <w:numId w:val="7"/>
-        </w:numPr>
-        <w:spacing w:line="276" w:lineRule="auto"/>
-        <w:jc w:val="both"/>
-        <w:rPr>
-          <w:rFonts w:ascii="Segoe UI" w:hAnsi="Segoe UI" w:cs="Segoe UI"/>
-          <w:sz w:val="20"/>
-          <w:szCs w:val="20"/>
-        </w:rPr>
-      </w:pPr>
-      <w:r>
-        <w:rPr>
-          <w:rFonts w:ascii="Segoe UI" w:hAnsi="Segoe UI" w:cs="Segoe UI"/>
-          <w:sz w:val="20"/>
-          <w:szCs w:val="20"/>
-        </w:rPr>
-        <w:t xml:space="preserve">powierzchnia użytkowa – </w:t>
-      </w:r>
-      <w:r>
-        <w:rPr>
-          <w:rFonts w:ascii="Segoe UI" w:hAnsi="Segoe UI" w:cs="Segoe UI"/>
-          <w:sz w:val="20"/>
-          <w:szCs w:val="20"/>
-        </w:rPr>
-        <w:t xml:space="preserve">od 50 </w:t>
-      </w:r>
-      <w:r>
-        <w:rPr>
-          <w:rFonts w:ascii="Segoe UI" w:hAnsi="Segoe UI" w:cs="Segoe UI"/>
-          <w:sz w:val="20"/>
-          <w:szCs w:val="20"/>
-        </w:rPr>
-        <w:t>m</w:t>
-      </w:r>
-      <w:r>
-        <w:rPr>
-          <w:rFonts w:ascii="Segoe UI" w:hAnsi="Segoe UI" w:cs="Segoe UI"/>
-          <w:sz w:val="20"/>
-          <w:szCs w:val="20"/>
-          <w:vertAlign w:val="superscript"/>
-        </w:rPr>
-        <w:t>2</w:t>
-      </w:r>
-      <w:r>
-        <w:rPr>
-          <w:rFonts w:ascii="Segoe UI" w:hAnsi="Segoe UI" w:cs="Segoe UI"/>
-          <w:sz w:val="20"/>
-          <w:szCs w:val="20"/>
-        </w:rPr>
-        <w:t xml:space="preserve"> </w:t>
-      </w:r>
-      <w:r>
-        <w:rPr>
-          <w:rFonts w:ascii="Segoe UI" w:hAnsi="Segoe UI" w:cs="Segoe UI"/>
-          <w:sz w:val="20"/>
-          <w:szCs w:val="20"/>
-        </w:rPr>
-        <w:t xml:space="preserve">do </w:t>
-      </w:r>
-      <w:r>
-        <w:rPr>
-          <w:rFonts w:ascii="Segoe UI" w:hAnsi="Segoe UI" w:cs="Segoe UI"/>
-          <w:sz w:val="20"/>
-          <w:szCs w:val="20"/>
-        </w:rPr>
-        <w:t>9</w:t>
-      </w:r>
-      <w:r>
-        <w:rPr>
-          <w:rFonts w:ascii="Segoe UI" w:hAnsi="Segoe UI" w:cs="Segoe UI"/>
-          <w:sz w:val="20"/>
-          <w:szCs w:val="20"/>
-        </w:rPr>
-        <w:t>0</w:t>
-      </w:r>
-      <w:r>
-        <w:rPr>
-          <w:rFonts w:ascii="Segoe UI" w:hAnsi="Segoe UI" w:cs="Segoe UI"/>
-          <w:sz w:val="20"/>
-          <w:szCs w:val="20"/>
-        </w:rPr>
-        <w:t xml:space="preserve"> m</w:t>
-      </w:r>
-      <w:r>
-        <w:rPr>
-          <w:rFonts w:ascii="Segoe UI" w:hAnsi="Segoe UI" w:cs="Segoe UI"/>
-          <w:sz w:val="20"/>
-          <w:szCs w:val="20"/>
-          <w:vertAlign w:val="superscript"/>
-        </w:rPr>
-        <w:t>2</w:t>
-      </w:r>
-      <w:r>
-        <w:rPr>
-          <w:rFonts w:ascii="Segoe UI" w:hAnsi="Segoe UI" w:cs="Segoe UI"/>
-          <w:sz w:val="20"/>
-          <w:szCs w:val="20"/>
-        </w:rPr>
-        <w:t>,</w:t>
-      </w:r>
-    </w:p>
-    <w:p>
-      <w:pPr>
-        <w:pStyle w:val="Akapitzlist"/>
-        <w:numPr>
-          <w:ilvl w:val="0"/>
-          <w:numId w:val="7"/>
-        </w:numPr>
-        <w:spacing w:line="276" w:lineRule="auto"/>
-        <w:jc w:val="both"/>
-        <w:rPr>
-          <w:rFonts w:ascii="Segoe UI" w:hAnsi="Segoe UI" w:cs="Segoe UI"/>
-          <w:sz w:val="20"/>
-          <w:szCs w:val="20"/>
-        </w:rPr>
-      </w:pPr>
-      <w:r>
-        <w:rPr>
-          <w:rFonts w:ascii="Segoe UI" w:hAnsi="Segoe UI" w:cs="Segoe UI"/>
-          <w:sz w:val="20"/>
-          <w:szCs w:val="20"/>
-        </w:rPr>
-        <w:t xml:space="preserve">zakres czasowy badania – 2 lata wstecz od daty wyceny. </w:t>
-      </w:r>
-    </w:p>
-    <w:p>
-      <w:pPr>
-        <w:pStyle w:val="Akapitzlist"/>
-        <w:spacing w:line="276" w:lineRule="auto"/>
-        <w:ind w:left="774"/>
-        <w:jc w:val="both"/>
-        <w:rPr>
-          <w:rFonts w:ascii="Segoe UI" w:hAnsi="Segoe UI" w:cs="Segoe UI"/>
-          <w:sz w:val="20"/>
-          <w:szCs w:val="20"/>
-          <w:highlight w:val="yellow"/>
-        </w:rPr>
-      </w:pPr>
-    </w:p>
-    <w:p>
-      <w:pPr>
-        <w:tabs>
-          <w:tab w:val="left" w:pos="563"/>
-        </w:tabs>
-        <w:spacing w:line="276" w:lineRule="auto"/>
-        <w:jc w:val="both"/>
-        <w:rPr>
-          <w:rFonts w:ascii="Segoe UI" w:hAnsi="Segoe UI" w:cs="Segoe UI"/>
-          <w:sz w:val="20"/>
-          <w:szCs w:val="20"/>
-        </w:rPr>
-      </w:pPr>
-      <w:r>
-        <w:rPr>
-          <w:rFonts w:ascii="Segoe UI" w:hAnsi="Segoe UI" w:cs="Segoe UI"/>
-          <w:sz w:val="20"/>
-          <w:szCs w:val="20"/>
-        </w:rPr>
-        <w:t xml:space="preserve">W okresie monitorowania rynku lokalnego odnotowano transakcje na badanym terenie, w których wystąpiła sprzedaż nieruchomości lokalowych o funkcji mieszkalnej. Ceny transakcyjne w analizowanym segmencie wykazują zróżnicowanie zależne od standardu wykończenia, położenia oraz powierzchni lokali.</w:t>
-      </w:r>
-      <w:r>
-        <w:rPr>
-          <w:rFonts w:ascii="Segoe UI" w:hAnsi="Segoe UI" w:cs="Segoe UI"/>
-          <w:sz w:val="20"/>
-          <w:szCs w:val="20"/>
-        </w:rPr>
-        <w:t xml:space="preserve"/>
-      </w:r>
-      <w:r>
-        <w:rPr>
-          <w:rFonts w:ascii="Segoe UI" w:hAnsi="Segoe UI" w:cs="Segoe UI"/>
-          <w:sz w:val="20"/>
-          <w:szCs w:val="20"/>
-        </w:rPr>
-        <w:t/>
-      </w:r>
-      <w:r>
-        <w:rPr>
-          <w:rFonts w:ascii="Segoe UI" w:hAnsi="Segoe UI" w:cs="Segoe UI"/>
-          <w:sz w:val="20"/>
-          <w:szCs w:val="20"/>
-        </w:rPr>
-        <w:t xml:space="preserve"/>
-      </w:r>
-      <w:r>
-        <w:rPr>
-          <w:rFonts w:ascii="Segoe UI" w:hAnsi="Segoe UI" w:cs="Segoe UI"/>
-          <w:sz w:val="20"/>
-          <w:szCs w:val="20"/>
-        </w:rPr>
-        <w:t/>
-      </w:r>
-      <w:r>
-        <w:rPr>
-          <w:rFonts w:ascii="Segoe UI" w:eastAsia="Arial" w:hAnsi="Segoe UI" w:cs="Segoe UI"/>
-          <w:sz w:val="20"/>
-          <w:szCs w:val="20"/>
-        </w:rPr>
-        <w:t xml:space="preserve"/>
-      </w:r>
-      <w:r>
-        <w:rPr>
-          <w:rFonts w:ascii="Segoe UI" w:hAnsi="Segoe UI" w:cs="Segoe UI"/>
-          <w:sz w:val="20"/>
-          <w:szCs w:val="20"/>
-        </w:rPr>
-        <w:t xml:space="preserve"/>
-      </w:r>
-      <w:r>
-        <w:rPr>
-          <w:rFonts w:ascii="Segoe UI" w:hAnsi="Segoe UI" w:cs="Segoe UI"/>
-          <w:sz w:val="20"/>
-          <w:szCs w:val="20"/>
-        </w:rPr>
-        <w:t/>
-      </w:r>
-      <w:r>
-        <w:rPr>
-          <w:rFonts w:ascii="Segoe UI" w:hAnsi="Segoe UI" w:cs="Segoe UI"/>
-          <w:sz w:val="20"/>
-          <w:szCs w:val="20"/>
-        </w:rPr>
-        <w:t xml:space="preserve"/>
-      </w:r>
-      <w:r>
-        <w:rPr>
-          <w:rFonts w:ascii="Segoe UI" w:hAnsi="Segoe UI" w:cs="Segoe UI"/>
-          <w:sz w:val="20"/>
-          <w:szCs w:val="20"/>
-          <w:vertAlign w:val="superscript"/>
-        </w:rPr>
-        <w:t/>
-      </w:r>
-      <w:r>
-        <w:rPr>
-          <w:rFonts w:ascii="Segoe UI" w:hAnsi="Segoe UI" w:cs="Segoe UI"/>
-          <w:sz w:val="20"/>
-          <w:szCs w:val="20"/>
-        </w:rPr>
-        <w:t xml:space="preserve"/>
-      </w:r>
-      <w:r>
-        <w:rPr>
-          <w:rFonts w:ascii="Segoe UI" w:hAnsi="Segoe UI" w:cs="Segoe UI"/>
-          <w:sz w:val="20"/>
-          <w:szCs w:val="20"/>
-        </w:rPr>
-        <w:t/>
-      </w:r>
-      <w:r>
-        <w:rPr>
-          <w:rFonts w:ascii="Segoe UI" w:hAnsi="Segoe UI" w:cs="Segoe UI"/>
-          <w:sz w:val="20"/>
-          <w:szCs w:val="20"/>
-        </w:rPr>
-        <w:t xml:space="preserve"/>
-      </w:r>
-      <w:r>
-        <w:rPr>
-          <w:rFonts w:ascii="Segoe UI" w:hAnsi="Segoe UI" w:cs="Segoe UI"/>
-          <w:sz w:val="20"/>
-          <w:szCs w:val="20"/>
-          <w:vertAlign w:val="superscript"/>
-        </w:rPr>
-        <w:t/>
-      </w:r>
-      <w:r>
-        <w:rPr>
-          <w:rFonts w:ascii="Segoe UI" w:hAnsi="Segoe UI" w:cs="Segoe UI"/>
-          <w:sz w:val="20"/>
-          <w:szCs w:val="20"/>
-        </w:rPr>
-        <w:t xml:space="preserve"/>
-      </w:r>
-      <w:r>
-        <w:rPr>
-          <w:rFonts w:ascii="Segoe UI" w:hAnsi="Segoe UI" w:cs="Segoe UI"/>
-          <w:sz w:val="20"/>
-          <w:szCs w:val="20"/>
-        </w:rPr>
-        <w:t/>
-      </w:r>
-      <w:r>
-        <w:rPr>
-          <w:rFonts w:ascii="Segoe UI" w:hAnsi="Segoe UI" w:cs="Segoe UI"/>
-          <w:sz w:val="20"/>
-          <w:szCs w:val="20"/>
-        </w:rPr>
-        <w:t xml:space="preserve"/>
-      </w:r>
-      <w:r>
-        <w:rPr>
-          <w:rFonts w:ascii="Segoe UI" w:hAnsi="Segoe UI" w:cs="Segoe UI"/>
-          <w:sz w:val="20"/>
-          <w:szCs w:val="20"/>
-        </w:rPr>
-        <w:t/>
-      </w:r>
-      <w:r>
-        <w:rPr>
-          <w:rFonts w:ascii="Segoe UI" w:hAnsi="Segoe UI" w:cs="Segoe UI"/>
-          <w:sz w:val="20"/>
-          <w:szCs w:val="20"/>
-        </w:rPr>
-        <w:t xml:space="preserve"/>
-      </w:r>
-      <w:r>
-        <w:rPr>
-          <w:rFonts w:ascii="Segoe UI" w:hAnsi="Segoe UI" w:cs="Segoe UI"/>
-          <w:sz w:val="20"/>
-          <w:szCs w:val="20"/>
-          <w:vertAlign w:val="superscript"/>
-        </w:rPr>
-        <w:t/>
-      </w:r>
-      <w:r>
-        <w:rPr>
-          <w:rFonts w:ascii="Segoe UI" w:hAnsi="Segoe UI" w:cs="Segoe UI"/>
-          <w:sz w:val="20"/>
-          <w:szCs w:val="20"/>
-        </w:rPr>
-        <w:t xml:space="preserve"/>
-      </w:r>
-      <w:r>
-        <w:rPr>
-          <w:rFonts w:ascii="Segoe UI" w:hAnsi="Segoe UI" w:cs="Segoe UI"/>
-          <w:sz w:val="20"/>
-          <w:szCs w:val="20"/>
-        </w:rPr>
-        <w:t/>
-      </w:r>
-      <w:r>
-        <w:rPr>
-          <w:rFonts w:ascii="Segoe UI" w:hAnsi="Segoe UI" w:cs="Segoe UI"/>
-          <w:sz w:val="20"/>
-          <w:szCs w:val="20"/>
-        </w:rPr>
-        <w:t xml:space="preserve"/>
-      </w:r>
-      <w:r>
-        <w:rPr>
-          <w:rFonts w:ascii="Segoe UI" w:hAnsi="Segoe UI" w:cs="Segoe UI"/>
-          <w:sz w:val="20"/>
-          <w:szCs w:val="20"/>
-          <w:vertAlign w:val="superscript"/>
-        </w:rPr>
-        <w:t/>
-      </w:r>
-      <w:r>
-        <w:rPr>
-          <w:rFonts w:ascii="Segoe UI" w:hAnsi="Segoe UI" w:cs="Segoe UI"/>
-          <w:sz w:val="20"/>
-          <w:szCs w:val="20"/>
-        </w:rPr>
-        <w:t xml:space="preserve"/>
-      </w:r>
-      <w:r>
-        <w:rPr>
-          <w:rFonts w:ascii="Segoe UI" w:hAnsi="Segoe UI" w:cs="Segoe UI"/>
-          <w:sz w:val="20"/>
-          <w:szCs w:val="20"/>
-        </w:rPr>
-        <w:t/>
-      </w:r>
-      <w:r>
-        <w:rPr>
-          <w:rFonts w:ascii="Segoe UI" w:hAnsi="Segoe UI" w:cs="Segoe UI"/>
-          <w:sz w:val="20"/>
-          <w:szCs w:val="20"/>
-        </w:rPr>
-        <w:t xml:space="preserve"/>
-      </w:r>
-      <w:r>
-        <w:rPr>
-          <w:rFonts w:ascii="Segoe UI" w:hAnsi="Segoe UI" w:cs="Segoe UI"/>
-          <w:sz w:val="20"/>
-          <w:szCs w:val="20"/>
-        </w:rPr>
-        <w:t xml:space="preserve"/>
-      </w:r>
-      <w:r>
-        <w:rPr>
-          <w:rFonts w:ascii="Segoe UI" w:hAnsi="Segoe UI" w:cs="Segoe UI"/>
-          <w:sz w:val="20"/>
-          <w:szCs w:val="20"/>
-        </w:rPr>
-        <w:t/>
-      </w:r>
-      <w:r>
-        <w:rPr>
-          <w:rFonts w:ascii="Segoe UI" w:hAnsi="Segoe UI" w:cs="Segoe UI"/>
-          <w:sz w:val="20"/>
-          <w:szCs w:val="20"/>
-        </w:rPr>
-        <w:t xml:space="preserve"/>
-      </w:r>
-      <w:r>
-        <w:rPr>
-          <w:rFonts w:ascii="Segoe UI" w:hAnsi="Segoe UI" w:cs="Segoe UI"/>
-          <w:sz w:val="20"/>
-          <w:szCs w:val="20"/>
-        </w:rPr>
-        <w:t/>
-      </w:r>
-      <w:r>
-        <w:rPr>
-          <w:rFonts w:ascii="Segoe UI" w:hAnsi="Segoe UI" w:cs="Segoe UI"/>
-          <w:sz w:val="20"/>
-          <w:szCs w:val="20"/>
-        </w:rPr>
-        <w:t xml:space="preserve"/>
-      </w:r>
-    </w:p>
-    <w:p>
-      <w:pPr>
-        <w:tabs>
-          <w:tab w:val="left" w:pos="563"/>
-        </w:tabs>
-        <w:spacing w:line="276" w:lineRule="auto"/>
-        <w:jc w:val="both"/>
-        <w:rPr>
-          <w:rFonts w:ascii="Segoe UI" w:hAnsi="Segoe UI" w:cs="Segoe UI"/>
-          <w:sz w:val="20"/>
-          <w:szCs w:val="20"/>
-        </w:rPr>
-      </w:pPr>
-    </w:p>
-    <w:p>
-      <w:pPr>
-        <w:spacing w:line="276" w:lineRule="auto"/>
-        <w:jc w:val="both"/>
-        <w:rPr>
-          <w:rFonts w:ascii="Segoe UI" w:hAnsi="Segoe UI" w:cs="Segoe UI"/>
-          <w:sz w:val="20"/>
-          <w:szCs w:val="20"/>
-        </w:rPr>
-      </w:pPr>
-      <w:r>
-        <w:rPr>
-          <w:rFonts w:ascii="Segoe UI" w:hAnsi="Segoe UI" w:cs="Segoe UI"/>
-          <w:sz w:val="20"/>
-          <w:szCs w:val="20"/>
-        </w:rPr>
-        <w:t xml:space="preserve">W toku analizy odrzucono nieruchomości lokalowe </w:t>
-      </w:r>
-      <w:r>
-        <w:rPr>
-          <w:rFonts w:ascii="Segoe UI" w:hAnsi="Segoe UI" w:cs="Segoe UI"/>
-          <w:sz w:val="20"/>
-          <w:szCs w:val="20"/>
-        </w:rPr>
-        <w:t xml:space="preserve">o powierzchni użytkowej poniżej 60 </w:t>
-      </w:r>
-      <w:r>
-        <w:rPr>
-          <w:rFonts w:ascii="Segoe UI" w:hAnsi="Segoe UI" w:cs="Segoe UI"/>
-          <w:sz w:val="20"/>
-          <w:szCs w:val="20"/>
-        </w:rPr>
-        <w:t>m</w:t>
-      </w:r>
-      <w:r>
-        <w:rPr>
-          <w:rFonts w:ascii="Segoe UI" w:hAnsi="Segoe UI" w:cs="Segoe UI"/>
-          <w:sz w:val="20"/>
-          <w:szCs w:val="20"/>
-          <w:vertAlign w:val="superscript"/>
-        </w:rPr>
-        <w:t>2</w:t>
-      </w:r>
-      <w:r>
-        <w:rPr>
-          <w:rFonts w:ascii="Segoe UI" w:hAnsi="Segoe UI" w:cs="Segoe UI"/>
-          <w:sz w:val="20"/>
-          <w:szCs w:val="20"/>
-        </w:rPr>
-        <w:t xml:space="preserve"> </w:t>
-      </w:r>
-      <w:r>
-        <w:rPr>
-          <w:rFonts w:ascii="Segoe UI" w:hAnsi="Segoe UI" w:cs="Segoe UI"/>
-          <w:sz w:val="20"/>
-          <w:szCs w:val="20"/>
-        </w:rPr>
-        <w:t>oraz odbiegające</w:t>
-      </w:r>
-      <w:r>
-        <w:rPr>
-          <w:rFonts w:ascii="Segoe UI" w:hAnsi="Segoe UI" w:cs="Segoe UI"/>
-          <w:sz w:val="20"/>
-          <w:szCs w:val="20"/>
-        </w:rPr>
-        <w:t xml:space="preserve"> </w:t>
-      </w:r>
-      <w:r>
-        <w:rPr>
-          <w:rFonts w:ascii="Segoe UI" w:hAnsi="Segoe UI" w:cs="Segoe UI"/>
-          <w:sz w:val="20"/>
-          <w:szCs w:val="20"/>
-        </w:rPr>
-        <w:t>ceną od średniej ceny transakcyjnej. Powyższe transakcje nie wykazywały cech podobieństwa do przedmiotowej nieruchomości.</w:t>
-      </w:r>
-    </w:p>
-    <w:p>
-      <w:pPr>
-        <w:spacing w:line="276" w:lineRule="auto"/>
-        <w:ind w:right="380"/>
-        <w:jc w:val="both"/>
-        <w:rPr>
-          <w:rFonts w:ascii="Segoe UI" w:hAnsi="Segoe UI" w:cs="Segoe UI"/>
-          <w:sz w:val="20"/>
-          <w:szCs w:val="20"/>
-        </w:rPr>
-      </w:pPr>
-    </w:p>
-    <w:p>
-      <w:pPr>
-        <w:tabs>
-          <w:tab w:val="left" w:pos="563"/>
-        </w:tabs>
-        <w:spacing w:line="276" w:lineRule="auto"/>
-        <w:jc w:val="both"/>
-        <w:rPr>
-          <w:rFonts w:ascii="Segoe UI" w:hAnsi="Segoe UI" w:cs="Segoe UI"/>
-          <w:sz w:val="20"/>
-          <w:szCs w:val="20"/>
-        </w:rPr>
-      </w:pPr>
-      <w:r>
-        <w:rPr>
-          <w:rFonts w:ascii="Segoe UI" w:hAnsi="Segoe UI" w:cs="Segoe UI"/>
-          <w:sz w:val="20"/>
-          <w:szCs w:val="20"/>
-        </w:rPr>
-        <w:t xml:space="preserve">W próbie znalazły się nieruchomości lokalowe o funkcji mieszkalnej, położone w budynkach mieszkalnych o powierzchni użytkowej od 61,35 m2 do 76,41 m2. Jednostkowe ceny transakcyjne lokali mieszkalnych znajdowały się w przedziale od {cena_min} zł do {cena_max} zł za 1 m2 powierzchni użytkowej lokalu. Średnia cena została ustalona na poziomie {cena_sr} zł za 1 m2.</w:t>
-      </w:r>
-      <w:r>
-        <w:rPr>
-          <w:rFonts w:ascii="Segoe UI" w:eastAsia="Arial" w:hAnsi="Segoe UI" w:cs="Segoe UI"/>
-          <w:sz w:val="20"/>
-          <w:szCs w:val="20"/>
-        </w:rPr>
-        <w:t xml:space="preserve"/>
-      </w:r>
-      <w:r>
-        <w:rPr>
-          <w:rFonts w:ascii="Segoe UI" w:hAnsi="Segoe UI" w:cs="Segoe UI"/>
-          <w:sz w:val="20"/>
-          <w:szCs w:val="20"/>
-        </w:rPr>
-        <w:t xml:space="preserve"/>
-      </w:r>
-      <w:r>
-        <w:rPr>
-          <w:rFonts w:ascii="Segoe UI" w:hAnsi="Segoe UI" w:cs="Segoe UI"/>
-          <w:sz w:val="20"/>
-          <w:szCs w:val="20"/>
-        </w:rPr>
-        <w:t/>
-      </w:r>
-      <w:r>
-        <w:rPr>
-          <w:rFonts w:ascii="Segoe UI" w:hAnsi="Segoe UI" w:cs="Segoe UI"/>
-          <w:sz w:val="20"/>
-          <w:szCs w:val="20"/>
-        </w:rPr>
-        <w:t xml:space="preserve"/>
-      </w:r>
-      <w:r>
-        <w:rPr>
-          <w:rFonts w:ascii="Segoe UI" w:hAnsi="Segoe UI" w:cs="Segoe UI"/>
-          <w:sz w:val="20"/>
-          <w:szCs w:val="20"/>
-          <w:vertAlign w:val="superscript"/>
-        </w:rPr>
-        <w:t/>
-      </w:r>
-      <w:r>
-        <w:rPr>
-          <w:rFonts w:ascii="Segoe UI" w:hAnsi="Segoe UI" w:cs="Segoe UI"/>
-          <w:sz w:val="20"/>
-          <w:szCs w:val="20"/>
-        </w:rPr>
-        <w:t xml:space="preserve"/>
-      </w:r>
-      <w:r>
-        <w:rPr>
-          <w:rFonts w:ascii="Segoe UI" w:hAnsi="Segoe UI" w:cs="Segoe UI"/>
-          <w:sz w:val="20"/>
-          <w:szCs w:val="20"/>
-        </w:rPr>
-        <w:t/>
-      </w:r>
-      <w:r>
-        <w:rPr>
-          <w:rFonts w:ascii="Segoe UI" w:hAnsi="Segoe UI" w:cs="Segoe UI"/>
-          <w:sz w:val="20"/>
-          <w:szCs w:val="20"/>
-        </w:rPr>
-        <w:t xml:space="preserve"/>
-      </w:r>
-      <w:r>
-        <w:rPr>
-          <w:rFonts w:ascii="Segoe UI" w:hAnsi="Segoe UI" w:cs="Segoe UI"/>
-          <w:sz w:val="20"/>
-          <w:szCs w:val="20"/>
-          <w:vertAlign w:val="superscript"/>
-        </w:rPr>
-        <w:t/>
-      </w:r>
-      <w:r>
-        <w:rPr>
-          <w:rFonts w:ascii="Segoe UI" w:hAnsi="Segoe UI" w:cs="Segoe UI"/>
-          <w:sz w:val="20"/>
-          <w:szCs w:val="20"/>
-        </w:rPr>
-        <w:t xml:space="preserve"/>
-      </w:r>
-      <w:r>
-        <w:rPr>
-          <w:rFonts w:ascii="Segoe UI" w:hAnsi="Segoe UI" w:cs="Segoe UI"/>
-          <w:sz w:val="20"/>
-          <w:szCs w:val="20"/>
-        </w:rPr>
-        <w:t/>
-      </w:r>
-      <w:r>
-        <w:rPr>
-          <w:rFonts w:ascii="Segoe UI" w:hAnsi="Segoe UI" w:cs="Segoe UI"/>
-          <w:sz w:val="20"/>
-          <w:szCs w:val="20"/>
-        </w:rPr>
-        <w:t xml:space="preserve"/>
-      </w:r>
-      <w:r>
-        <w:rPr>
-          <w:rFonts w:ascii="Segoe UI" w:hAnsi="Segoe UI" w:cs="Segoe UI"/>
-          <w:sz w:val="20"/>
-          <w:szCs w:val="20"/>
-        </w:rPr>
-        <w:t xml:space="preserve"/>
-      </w:r>
-      <w:r>
-        <w:rPr>
-          <w:rFonts w:ascii="Segoe UI" w:hAnsi="Segoe UI" w:cs="Segoe UI"/>
-          <w:sz w:val="20"/>
-          <w:szCs w:val="20"/>
-        </w:rPr>
-        <w:t/>
-      </w:r>
-      <w:r>
-        <w:rPr>
-          <w:rFonts w:ascii="Segoe UI" w:hAnsi="Segoe UI" w:cs="Segoe UI"/>
-          <w:sz w:val="20"/>
-          <w:szCs w:val="20"/>
-        </w:rPr>
-        <w:t xml:space="preserve"/>
-      </w:r>
-      <w:r>
-        <w:rPr>
-          <w:rFonts w:ascii="Segoe UI" w:hAnsi="Segoe UI" w:cs="Segoe UI"/>
-          <w:sz w:val="20"/>
-          <w:szCs w:val="20"/>
-          <w:vertAlign w:val="superscript"/>
-        </w:rPr>
-        <w:t/>
-      </w:r>
-      <w:r>
-        <w:rPr>
-          <w:rFonts w:ascii="Segoe UI" w:hAnsi="Segoe UI" w:cs="Segoe UI"/>
-          <w:sz w:val="20"/>
-          <w:szCs w:val="20"/>
-        </w:rPr>
-        <w:t xml:space="preserve"/>
-      </w:r>
-      <w:r>
-        <w:rPr>
-          <w:rFonts w:ascii="Segoe UI" w:hAnsi="Segoe UI" w:cs="Segoe UI"/>
-          <w:sz w:val="20"/>
-          <w:szCs w:val="20"/>
-        </w:rPr>
-        <w:t/>
-      </w:r>
-      <w:r>
-        <w:rPr>
-          <w:rFonts w:ascii="Segoe UI" w:hAnsi="Segoe UI" w:cs="Segoe UI"/>
-          <w:sz w:val="20"/>
-          <w:szCs w:val="20"/>
-        </w:rPr>
-        <w:t xml:space="preserve"/>
-      </w:r>
-      <w:r>
-        <w:rPr>
-          <w:rFonts w:ascii="Segoe UI" w:hAnsi="Segoe UI" w:cs="Segoe UI"/>
-          <w:sz w:val="20"/>
-          <w:szCs w:val="20"/>
-          <w:vertAlign w:val="superscript"/>
-        </w:rPr>
-        <w:t/>
-      </w:r>
-      <w:r>
-        <w:rPr>
-          <w:rFonts w:ascii="Segoe UI" w:hAnsi="Segoe UI" w:cs="Segoe UI"/>
-          <w:sz w:val="20"/>
-          <w:szCs w:val="20"/>
-        </w:rPr>
-        <w:t xml:space="preserve"/>
-      </w:r>
-      <w:r>
-        <w:rPr>
-          <w:rFonts w:ascii="Segoe UI" w:hAnsi="Segoe UI" w:cs="Segoe UI"/>
-          <w:sz w:val="20"/>
-          <w:szCs w:val="20"/>
-        </w:rPr>
-        <w:t/>
-      </w:r>
-      <w:r>
-        <w:rPr>
-          <w:rFonts w:ascii="Segoe UI" w:hAnsi="Segoe UI" w:cs="Segoe UI"/>
-          <w:sz w:val="20"/>
-          <w:szCs w:val="20"/>
-        </w:rPr>
-        <w:t xml:space="preserve"/>
-      </w:r>
-      <w:r>
-        <w:rPr>
-          <w:rFonts w:ascii="Segoe UI" w:hAnsi="Segoe UI" w:cs="Segoe UI"/>
-          <w:sz w:val="20"/>
-          <w:szCs w:val="20"/>
-        </w:rPr>
-        <w:t/>
-      </w:r>
-      <w:r>
-        <w:rPr>
-          <w:rFonts w:ascii="Segoe UI" w:hAnsi="Segoe UI" w:cs="Segoe UI"/>
-          <w:sz w:val="20"/>
-          <w:szCs w:val="20"/>
-        </w:rPr>
-        <w:t xml:space="preserve"/>
-      </w:r>
-      <w:r>
-        <w:rPr>
-          <w:rFonts w:ascii="Segoe UI" w:hAnsi="Segoe UI" w:cs="Segoe UI"/>
-          <w:sz w:val="20"/>
-          <w:szCs w:val="20"/>
-        </w:rPr>
-        <w:t/>
-      </w:r>
-      <w:r>
-        <w:rPr>
-          <w:rFonts w:ascii="Segoe UI" w:hAnsi="Segoe UI" w:cs="Segoe UI"/>
-          <w:sz w:val="20"/>
-          <w:szCs w:val="20"/>
-        </w:rPr>
-        <w:t xml:space="preserve"/>
-      </w:r>
-    </w:p>
-    <w:p>
-      <w:pPr>
-        <w:tabs>
-          <w:tab w:val="left" w:pos="563"/>
-        </w:tabs>
-        <w:spacing w:line="276" w:lineRule="auto"/>
-        <w:jc w:val="both"/>
-        <w:rPr>
-          <w:rFonts w:ascii="Segoe UI" w:hAnsi="Segoe UI" w:cs="Segoe UI"/>
-          <w:sz w:val="20"/>
-          <w:szCs w:val="20"/>
-          <w:highlight w:val="yellow"/>
-        </w:rPr>
-      </w:pPr>
-    </w:p>
-    <w:p>
-      <w:pPr>
-        <w:spacing w:line="276" w:lineRule="auto"/>
-        <w:jc w:val="both"/>
-        <w:rPr>
-          <w:rFonts w:ascii="Segoe UI" w:hAnsi="Segoe UI" w:cs="Segoe UI"/>
-          <w:bCs/>
-          <w:sz w:val="20"/>
-          <w:szCs w:val="20"/>
-        </w:rPr>
-      </w:pPr>
-      <w:bookmarkStart w:id="53" w:name="_Hlk188264593"/>
-      <w:r>
-        <w:rPr>
-          <w:rFonts w:ascii="Segoe UI" w:hAnsi="Segoe UI" w:cs="Segoe UI"/>
-          <w:bCs/>
-          <w:sz w:val="20"/>
-          <w:szCs w:val="20"/>
-        </w:rPr>
-        <w:t xml:space="preserve">W </w:t>
-      </w:r>
-      <w:bookmarkStart w:id="54" w:name="_Hlk204162314"/>
-      <w:r>
-        <w:rPr>
-          <w:rFonts w:ascii="Segoe UI" w:hAnsi="Segoe UI" w:cs="Segoe UI"/>
-          <w:bCs/>
-          <w:sz w:val="20"/>
-          <w:szCs w:val="20"/>
-        </w:rPr>
-        <w:t xml:space="preserve">badanym okresie zauważalne są wahania rynku, jednakże nie są to wahania znaczne wskazujące konkretnie na wzrost lub spadek cen. Z uwagi na brak oparcia w aktualnych realiach rynkowych, nie jest możliwym stwierdzenie, czy rynek odpowiada na aktualną sytuację wzrostem czy stagnacją cen. </w:t>
-      </w:r>
-      <w:r>
-        <w:rPr>
-          <w:rFonts w:ascii="Segoe UI" w:hAnsi="Segoe UI" w:cs="Segoe UI"/>
-          <w:bCs/>
-          <w:sz w:val="20"/>
-          <w:szCs w:val="20"/>
-        </w:rPr>
-        <w:br/>
-        <w:t>W świetle owego scenariusza, przyjęto współczynnik zmiany cen na poziomie jedności i cen ze względu na upływ czasu nie korygowano.</w:t>
       </w:r>
       <w:bookmarkEnd w:id="54"/>
     </w:p>
@@ -14600,139 +13664,6 @@
           <w:szCs w:val="20"/>
         </w:rPr>
         <w:t>.</w:t>
-      </w:r>
-    </w:p>
-    <w:p>
-      <w:pPr>
-        <w:spacing w:line="276" w:lineRule="auto"/>
-        <w:jc w:val="both"/>
-        <w:rPr>
-          <w:rFonts w:ascii="Segoe UI" w:hAnsi="Segoe UI" w:cs="Segoe UI"/>
-          <w:sz w:val="20"/>
-          <w:szCs w:val="20"/>
-        </w:rPr>
-      </w:pPr>
-    </w:p>
-    <w:p>
-      <w:pPr>
-        <w:spacing w:line="276" w:lineRule="auto"/>
-        <w:jc w:val="both"/>
-        <w:rPr>
-          <w:rFonts w:ascii="Segoe UI" w:hAnsi="Segoe UI" w:cs="Segoe UI"/>
-          <w:sz w:val="20"/>
-          <w:szCs w:val="20"/>
-        </w:rPr>
-      </w:pPr>
-      <w:r>
-        <w:rPr>
-          <w:rFonts w:ascii="Segoe UI" w:hAnsi="Segoe UI" w:cs="Segoe UI"/>
-          <w:sz w:val="20"/>
-          <w:szCs w:val="20"/>
-        </w:rPr>
-        <w:t>W toku analizy wszystkich zebranych transakcji zbadano zależność pomiędzy ceną transakcyjną (zł/m</w:t>
-      </w:r>
-      <w:r>
-        <w:rPr>
-          <w:rFonts w:ascii="Segoe UI" w:hAnsi="Segoe UI" w:cs="Segoe UI"/>
-          <w:sz w:val="20"/>
-          <w:szCs w:val="20"/>
-          <w:vertAlign w:val="superscript"/>
-        </w:rPr>
-        <w:t>2</w:t>
-      </w:r>
-      <w:r>
-        <w:rPr>
-          <w:rFonts w:ascii="Segoe UI" w:hAnsi="Segoe UI" w:cs="Segoe UI"/>
-          <w:sz w:val="20"/>
-          <w:szCs w:val="20"/>
-        </w:rPr>
-        <w:t>) a powierzchnią użytkową lokalu (m</w:t>
-      </w:r>
-      <w:r>
-        <w:rPr>
-          <w:rFonts w:ascii="Segoe UI" w:hAnsi="Segoe UI" w:cs="Segoe UI"/>
-          <w:sz w:val="20"/>
-          <w:szCs w:val="20"/>
-          <w:vertAlign w:val="superscript"/>
-        </w:rPr>
-        <w:t>2</w:t>
-      </w:r>
-      <w:r>
-        <w:rPr>
-          <w:rFonts w:ascii="Segoe UI" w:hAnsi="Segoe UI" w:cs="Segoe UI"/>
-          <w:sz w:val="20"/>
-          <w:szCs w:val="20"/>
-        </w:rPr>
-        <w:t xml:space="preserve">). Zależność ta jest odwrotnie proporcjonalna, co oznacza, że wraz ze wzrostem powierzchni użytkowej lokalu, jednostkowa cena transakcyjna spada. </w:t>
-      </w:r>
-    </w:p>
-    <w:p>
-      <w:pPr>
-        <w:spacing w:line="276" w:lineRule="auto"/>
-        <w:jc w:val="both"/>
-        <w:rPr>
-          <w:rFonts w:ascii="Segoe UI" w:hAnsi="Segoe UI" w:cs="Segoe UI"/>
-          <w:sz w:val="20"/>
-          <w:szCs w:val="20"/>
-        </w:rPr>
-      </w:pPr>
-      <w:r>
-        <w:rPr>
-          <w:rFonts w:ascii="Segoe UI" w:hAnsi="Segoe UI" w:cs="Segoe UI"/>
-          <w:sz w:val="20"/>
-          <w:szCs w:val="20"/>
-        </w:rPr>
-        <w:lastRenderedPageBreak/>
-        <w:t>W toku analizy wszystkich zebranych transakcji zbadano zależność pomiędzy ceną transakcyjną (zł/m</w:t>
-      </w:r>
-      <w:r>
-        <w:rPr>
-          <w:rFonts w:ascii="Segoe UI" w:hAnsi="Segoe UI" w:cs="Segoe UI"/>
-          <w:sz w:val="20"/>
-          <w:szCs w:val="20"/>
-          <w:vertAlign w:val="superscript"/>
-        </w:rPr>
-        <w:t>2</w:t>
-      </w:r>
-      <w:r>
-        <w:rPr>
-          <w:rFonts w:ascii="Segoe UI" w:hAnsi="Segoe UI" w:cs="Segoe UI"/>
-          <w:sz w:val="20"/>
-          <w:szCs w:val="20"/>
-        </w:rPr>
-        <w:t xml:space="preserve">) a położeniem lokalu na piętrze. Zależność ta jest </w:t>
-      </w:r>
-      <w:r>
-        <w:rPr>
-          <w:rFonts w:ascii="Segoe UI" w:hAnsi="Segoe UI" w:cs="Segoe UI"/>
-          <w:sz w:val="20"/>
-          <w:szCs w:val="20"/>
-        </w:rPr>
-        <w:t>wprost</w:t>
-      </w:r>
-      <w:r>
-        <w:rPr>
-          <w:rFonts w:ascii="Segoe UI" w:hAnsi="Segoe UI" w:cs="Segoe UI"/>
-          <w:sz w:val="20"/>
-          <w:szCs w:val="20"/>
-        </w:rPr>
-        <w:t xml:space="preserve"> proporcjonalna, co oznacza, że lokale mieszkalne położone na wyższych piętrach wykazują </w:t>
-      </w:r>
-      <w:r>
-        <w:rPr>
-          <w:rFonts w:ascii="Segoe UI" w:hAnsi="Segoe UI" w:cs="Segoe UI"/>
-          <w:sz w:val="20"/>
-          <w:szCs w:val="20"/>
-        </w:rPr>
-        <w:t>wyższe</w:t>
-      </w:r>
-      <w:r>
-        <w:rPr>
-          <w:rFonts w:ascii="Segoe UI" w:hAnsi="Segoe UI" w:cs="Segoe UI"/>
-          <w:sz w:val="20"/>
-          <w:szCs w:val="20"/>
-        </w:rPr>
-        <w:t xml:space="preserve"> jednostkowe ceny transakcyjne.</w:t>
       </w:r>
     </w:p>
     <w:p>
@@ -19585,6 +18516,11 @@
       </w:pPr>
     </w:p>
     <w:p>
+      <w:r>
+        <w:t xml:space="preserve">{#ma_proza_uzasadnienie}</w:t>
+      </w:r>
+    </w:p>
+    <w:p>
       <w:pPr>
         <w:spacing w:line="276" w:lineRule="auto"/>
         <w:jc w:val="both"/>
@@ -19602,7 +18538,7 @@
           <w:sz w:val="20"/>
           <w:szCs w:val="20"/>
         </w:rPr>
-        <w:t xml:space="preserve">Wyceniana nieruchomość mieści się w zbiorze zebranych transakcji, co jest adekwatne w stosunku do sytuacji na lokalnym rynku nieruchomości. Ponadto, dokonano analizy rynku ofertowego lokali mieszkalnych, położonych w rejonie wycenianej nieruchomości. Jednostkowe ceny transakcyjne w analizowanym zbiorze znajdowały się w przedziale od {cena_min} zł/m2 do {cena_max} zł/m2. Należy podkreślić, iż ceny ofertowe podlegają negocjacjom cenowym. Reasumując, wynik uznaje się za bliski cenie możliwej do osiągnięcia w obrocie nieruchomościami na rynku lokalnym, potwierdzony i uzasadniony.</w:t>
+        <w:t xml:space="preserve">{proza_uzasadnienie}</w:t>
       </w:r>
       <w:r>
         <w:rPr>
@@ -19743,6 +18679,11 @@
           <w:szCs w:val="20"/>
         </w:rPr>
         <w:t/>
+      </w:r>
+    </w:p>
+    <w:p>
+      <w:r>
+        <w:t xml:space="preserve">{/ma_proza_uzasadnienie}</w:t>
       </w:r>
     </w:p>
     <w:bookmarkEnd w:id="85"/>

</xml_diff>

<commit_message>
fix(web): drop two claims the app never performs from §7, widen F-12
An independent review found in §7 the same class the prose stage removed from
§13 — one section earlier, so the template audit did not cover it (§7 is a
list of SOURCES, not descriptive prose).

The location map was credited to the city's own GIS while the caption the
generator inserts two pages later says Geoportal.gov.pl: a contradiction a
reader catches by comparing two pages of one operat. The offer-market
analysis bullet is gone — this application never looks at asking prices.

Forbidden literals are now written WITHOUT inflectional endings. The previous
list spelled the genitive from §13 and the nominative went on shipping in §7.
Polish declension is a hole in any guard that spells a whole phrase out. Five
more deleted sentences joined the list: the review restored them in a mutant
template and F-12 caught one of five.

Template regenerated through build_template.py (wiki repo abc49c9), never by
hand.
</commit_message>
<xml_diff>
--- a/apps/web/templates/operat-szablon.docx
+++ b/apps/web/templates/operat-szablon.docx
@@ -7878,7 +7878,7 @@
           <w:sz w:val="20"/>
           <w:szCs w:val="20"/>
         </w:rPr>
-        <w:t xml:space="preserve">Mapa ogólnej lokalizacji nieruchomości </w:t>
+        <w:t xml:space="preserve">Mapa ogólnej lokalizacji nieruchomości (źródło: Geoportal.gov.pl),</w:t>
       </w:r>
       <w:r>
         <w:rPr>
@@ -7888,7 +7888,7 @@
           <w:sz w:val="20"/>
           <w:szCs w:val="20"/>
         </w:rPr>
-        <w:t xml:space="preserve">(źródło: System Informacji Przestrzennej </w:t>
+        <w:t xml:space="preserve"/>
       </w:r>
       <w:r>
         <w:rPr>
@@ -7898,7 +7898,7 @@
           <w:sz w:val="20"/>
           <w:szCs w:val="20"/>
         </w:rPr>
-        <w:t>miasta</w:t>
+        <w:t/>
       </w:r>
       <w:r>
         <w:rPr>
@@ -7908,7 +7908,7 @@
           <w:sz w:val="20"/>
           <w:szCs w:val="20"/>
         </w:rPr>
-        <w:t xml:space="preserve"> Poznania</w:t>
+        <w:t xml:space="preserve"/>
       </w:r>
       <w:r>
         <w:rPr>
@@ -7918,7 +7918,7 @@
           <w:sz w:val="20"/>
           <w:szCs w:val="20"/>
         </w:rPr>
-        <w:t>),</w:t>
+        <w:t/>
       </w:r>
     </w:p>
     <w:p>
@@ -8126,33 +8126,6 @@
           <w:szCs w:val="20"/>
         </w:rPr>
         <w:t>,</w:t>
-      </w:r>
-    </w:p>
-    <w:p>
-      <w:pPr>
-        <w:pStyle w:val="Akapitzlist"/>
-        <w:numPr>
-          <w:ilvl w:val="0"/>
-          <w:numId w:val="4"/>
-        </w:numPr>
-        <w:suppressAutoHyphens w:val="0"/>
-        <w:spacing w:line="276" w:lineRule="auto"/>
-        <w:ind w:left="714" w:hanging="357"/>
-        <w:contextualSpacing/>
-        <w:jc w:val="both"/>
-        <w:rPr>
-          <w:rFonts w:ascii="Segoe UI" w:hAnsi="Segoe UI" w:cs="Segoe UI"/>
-          <w:sz w:val="20"/>
-          <w:szCs w:val="20"/>
-        </w:rPr>
-      </w:pPr>
-      <w:r>
-        <w:rPr>
-          <w:rFonts w:ascii="Segoe UI" w:hAnsi="Segoe UI" w:cs="Segoe UI"/>
-          <w:sz w:val="20"/>
-          <w:szCs w:val="20"/>
-        </w:rPr>
-        <w:t>Analiza rynku ofertowego w celu potwierdzenia uzyskanego wyniku oraz badania relacji popytu i podaży na rynku lokalnym,</w:t>
       </w:r>
     </w:p>
     <w:p>

</xml_diff>

<commit_message>
fix(operat): table 1 column widths swapped; template sha pin updated
</commit_message>
<xml_diff>
--- a/apps/web/templates/operat-szablon.docx
+++ b/apps/web/templates/operat-szablon.docx
@@ -14694,8 +14694,8 @@
       </w:tblPr>
       <w:tblGrid>
         <w:gridCol w:w="1271"/>
+        <w:gridCol w:w="2628"/>
         <w:gridCol w:w="1276"/>
-        <w:gridCol w:w="2628"/>
         <w:gridCol w:w="1695"/>
         <w:gridCol w:w="1992"/>
       </w:tblGrid>
@@ -14735,7 +14735,7 @@
         </w:tc>
         <w:tc>
           <w:tcPr>
-            <w:tcW w:w="1276" w:type="dxa"/>
+            <w:tcW w:w="2628" w:type="dxa"/>
             <w:vAlign w:val="center"/>
             <w:hideMark/>
           </w:tcPr>
@@ -14765,7 +14765,7 @@
         </w:tc>
         <w:tc>
           <w:tcPr>
-            <w:tcW w:w="2628" w:type="dxa"/>
+            <w:tcW w:w="1276" w:type="dxa"/>
             <w:vAlign w:val="center"/>
             <w:hideMark/>
           </w:tcPr>
@@ -14969,7 +14969,7 @@
         </w:tc>
         <w:tc>
           <w:tcPr>
-            <w:tcW w:w="1276" w:type="dxa"/>
+            <w:tcW w:w="2628" w:type="dxa"/>
             <w:noWrap/>
             <w:hideMark/>
           </w:tcPr>
@@ -14999,7 +14999,7 @@
         </w:tc>
         <w:tc>
           <w:tcPr>
-            <w:tcW w:w="2628" w:type="dxa"/>
+            <w:tcW w:w="1276" w:type="dxa"/>
             <w:noWrap/>
             <w:vAlign w:val="bottom"/>
             <w:hideMark/>

</xml_diff>

<commit_message>
fix(web): swap Table 1 column widths — a street name needs the wide cell (Slice 3d, T5)
The patch script renamed the headers but left the widths where they were, so "Miasto"
inherited Obreb's 4,6 cm and "Ulica" inherited Odleglosc's 2,3 cm — exactly backwards.
"Andrzeja i Wladyslawa Niegolewskich" would have wrapped onto four lines while "Poznan"
idled in a cell twice as wide. Widths now follow the text; the table's total width is
unchanged (8862 twips).

Verified end to end, not in the template XML: rendered a DOCX with the five longest real
names from the export plus a row outside Poznan, converted it through the worker's
LibreOffice, and read the PDF — headers correct, the longest names wrap onto two lines,
the dash row reads cleanly.

TEMPLATE_SHA256 updated in the same commit (F-12); the script stays idempotent.
</commit_message>
<xml_diff>
--- a/apps/web/templates/operat-szablon.docx
+++ b/apps/web/templates/operat-szablon.docx
@@ -14694,8 +14694,8 @@
       </w:tblPr>
       <w:tblGrid>
         <w:gridCol w:w="1271"/>
+        <w:gridCol w:w="1276"/>
         <w:gridCol w:w="2628"/>
-        <w:gridCol w:w="1276"/>
         <w:gridCol w:w="1695"/>
         <w:gridCol w:w="1992"/>
       </w:tblGrid>
@@ -14735,7 +14735,7 @@
         </w:tc>
         <w:tc>
           <w:tcPr>
-            <w:tcW w:w="2628" w:type="dxa"/>
+            <w:tcW w:w="1276" w:type="dxa"/>
             <w:vAlign w:val="center"/>
             <w:hideMark/>
           </w:tcPr>
@@ -14765,7 +14765,7 @@
         </w:tc>
         <w:tc>
           <w:tcPr>
-            <w:tcW w:w="1276" w:type="dxa"/>
+            <w:tcW w:w="2628" w:type="dxa"/>
             <w:vAlign w:val="center"/>
             <w:hideMark/>
           </w:tcPr>
@@ -14969,7 +14969,7 @@
         </w:tc>
         <w:tc>
           <w:tcPr>
-            <w:tcW w:w="2628" w:type="dxa"/>
+            <w:tcW w:w="1276" w:type="dxa"/>
             <w:noWrap/>
             <w:hideMark/>
           </w:tcPr>
@@ -14999,7 +14999,7 @@
         </w:tc>
         <w:tc>
           <w:tcPr>
-            <w:tcW w:w="1276" w:type="dxa"/>
+            <w:tcW w:w="2628" w:type="dxa"/>
             <w:noWrap/>
             <w:vAlign w:val="bottom"/>
             <w:hideMark/>

</xml_diff>

<commit_message>
fix(operat): szablon układa zdjęcia oględzin w dwie kolumny
</commit_message>
<xml_diff>
--- a/apps/web/templates/operat-szablon.docx
+++ b/apps/web/templates/operat-szablon.docx
@@ -9316,19 +9316,18 @@
       </w:r>
     </w:p>
     <w:p>
+      <w:pPr>
+        <w:jc w:val="center"/>
+      </w:pPr>
       <w:r>
         <w:t xml:space="preserve">{#foto_otoczenie}</w:t>
       </w:r>
-    </w:p>
-    <w:p>
-      <w:pPr>
-        <w:jc w:val="center"/>
-      </w:pPr>
       <w:r>
         <w:t xml:space="preserve">{%img}</w:t>
       </w:r>
-    </w:p>
-    <w:p>
+      <w:r>
+        <w:t xml:space="preserve"> </w:t>
+      </w:r>
       <w:r>
         <w:t xml:space="preserve">{/foto_otoczenie}</w:t>
       </w:r>
@@ -10244,19 +10243,18 @@
       </w:r>
     </w:p>
     <w:p>
+      <w:pPr>
+        <w:jc w:val="center"/>
+      </w:pPr>
       <w:r>
         <w:t xml:space="preserve">{#foto_budynek}</w:t>
       </w:r>
-    </w:p>
-    <w:p>
-      <w:pPr>
-        <w:jc w:val="center"/>
-      </w:pPr>
       <w:r>
         <w:t xml:space="preserve">{%img}</w:t>
       </w:r>
-    </w:p>
-    <w:p>
+      <w:r>
+        <w:t xml:space="preserve"> </w:t>
+      </w:r>
       <w:r>
         <w:t xml:space="preserve">{/foto_budynek}</w:t>
       </w:r>
@@ -10429,19 +10427,18 @@
       </w:r>
     </w:p>
     <w:p>
+      <w:pPr>
+        <w:jc w:val="center"/>
+      </w:pPr>
       <w:r>
         <w:t xml:space="preserve">{#foto_wnetrza}</w:t>
       </w:r>
-    </w:p>
-    <w:p>
-      <w:pPr>
-        <w:jc w:val="center"/>
-      </w:pPr>
       <w:r>
         <w:t xml:space="preserve">{%img}</w:t>
       </w:r>
-    </w:p>
-    <w:p>
+      <w:r>
+        <w:t xml:space="preserve"> </w:t>
+      </w:r>
       <w:r>
         <w:t xml:space="preserve">{/foto_wnetrza}</w:t>
       </w:r>

</xml_diff>

<commit_message>
feat: Slice 3e — operat wg wzorca Anety: przedrostek ul. w Tabeli 1, zdjęcia oględzin 2 w rzędzie (#30)
* fix(operat): przedrostek ul. zostaje w Tabeli 1 — drukują go wszystkie 4 operaty wzorcowe

* fix(operat): zdjęcia oględzin o połowę mniejsze — dwa w rzędzie jak u Anety

* fix(operat): szablon układa zdjęcia oględzin w dwie kolumny

* docs(test): szerokość kolumny tekstu w komentarzu zmierzona, nie odziedziczona
</commit_message>
<xml_diff>
--- a/apps/web/templates/operat-szablon.docx
+++ b/apps/web/templates/operat-szablon.docx
@@ -9316,19 +9316,18 @@
       </w:r>
     </w:p>
     <w:p>
+      <w:pPr>
+        <w:jc w:val="center"/>
+      </w:pPr>
       <w:r>
         <w:t xml:space="preserve">{#foto_otoczenie}</w:t>
       </w:r>
-    </w:p>
-    <w:p>
-      <w:pPr>
-        <w:jc w:val="center"/>
-      </w:pPr>
       <w:r>
         <w:t xml:space="preserve">{%img}</w:t>
       </w:r>
-    </w:p>
-    <w:p>
+      <w:r>
+        <w:t xml:space="preserve"> </w:t>
+      </w:r>
       <w:r>
         <w:t xml:space="preserve">{/foto_otoczenie}</w:t>
       </w:r>
@@ -10244,19 +10243,18 @@
       </w:r>
     </w:p>
     <w:p>
+      <w:pPr>
+        <w:jc w:val="center"/>
+      </w:pPr>
       <w:r>
         <w:t xml:space="preserve">{#foto_budynek}</w:t>
       </w:r>
-    </w:p>
-    <w:p>
-      <w:pPr>
-        <w:jc w:val="center"/>
-      </w:pPr>
       <w:r>
         <w:t xml:space="preserve">{%img}</w:t>
       </w:r>
-    </w:p>
-    <w:p>
+      <w:r>
+        <w:t xml:space="preserve"> </w:t>
+      </w:r>
       <w:r>
         <w:t xml:space="preserve">{/foto_budynek}</w:t>
       </w:r>
@@ -10429,19 +10427,18 @@
       </w:r>
     </w:p>
     <w:p>
+      <w:pPr>
+        <w:jc w:val="center"/>
+      </w:pPr>
       <w:r>
         <w:t xml:space="preserve">{#foto_wnetrza}</w:t>
       </w:r>
-    </w:p>
-    <w:p>
-      <w:pPr>
-        <w:jc w:val="center"/>
-      </w:pPr>
       <w:r>
         <w:t xml:space="preserve">{%img}</w:t>
       </w:r>
-    </w:p>
-    <w:p>
+      <w:r>
+        <w:t xml:space="preserve"> </w:t>
+      </w:r>
       <w:r>
         <w:t xml:space="preserve">{/foto_wnetrza}</w:t>
       </w:r>

</xml_diff>

<commit_message>
feat(operat): template switches per property right (T-12, S4)
Regenerated by build_template.py stage 9d (wiki-repo) + the 3 idempotent patch
scripts. operat-sections.ts now exports OPERAT_SECTION_TEMPLATES and the
operatSections(model) resolver; SHA pin updated; new tags in REQUIRED_PLACEHOLDERS.
</commit_message>
<xml_diff>
--- a/apps/web/templates/operat-szablon.docx
+++ b/apps/web/templates/operat-szablon.docx
@@ -1010,7 +1010,7 @@
           <w:sz w:val="26"/>
           <w:szCs w:val="26"/>
         </w:rPr>
-        <w:t>otyczący określenia wartości rynkowej prawa własności</w:t>
+        <w:t xml:space="preserve">otyczący określenia wartości rynkowej{#prawo_wlasnosc} prawa własności{/prawo_wlasnosc}</w:t>
       </w:r>
     </w:p>
     <w:p>
@@ -1034,7 +1034,7 @@
           <w:sz w:val="26"/>
           <w:szCs w:val="26"/>
         </w:rPr>
-        <w:t xml:space="preserve">nieruchomości lokalowej o funkcji mieszkalnej</w:t>
+        <w:t xml:space="preserve">{#prawo_wlasnosc}nieruchomości lokalowej o funkcji mieszkalnej{/prawo_wlasnosc}{#prawo_spoldzielcze}{przedmiot_d}{/prawo_spoldzielcze}</w:t>
       </w:r>
       <w:r>
         <w:rPr>
@@ -1079,6 +1079,11 @@
           <w:szCs w:val="26"/>
         </w:rPr>
         <w:t/>
+      </w:r>
+    </w:p>
+    <w:p>
+      <w:r>
+        <w:t xml:space="preserve">{#prawo_wlasnosc}</w:t>
       </w:r>
     </w:p>
     <w:p>
@@ -1180,6 +1185,11 @@
       </w:r>
     </w:p>
     <w:p>
+      <w:r>
+        <w:t xml:space="preserve">{/prawo_wlasnosc}</w:t>
+      </w:r>
+    </w:p>
+    <w:p>
       <w:pPr>
         <w:pStyle w:val="Bezodstpw"/>
         <w:tabs>
@@ -1224,7 +1234,7 @@
           <w:sz w:val="26"/>
           <w:szCs w:val="26"/>
         </w:rPr>
-        <w:t xml:space="preserve">położonej pod adresem: {adres}</w:t>
+        <w:t xml:space="preserve">{#prawo_wlasnosc}położonej{/prawo_wlasnosc}{#prawo_spoldzielcze}położonego{/prawo_spoldzielcze} pod adresem: {adres}</w:t>
       </w:r>
       <w:r>
         <w:rPr>
@@ -2372,7 +2382,7 @@
             <w:sz w:val="20"/>
             <w:szCs w:val="20"/>
           </w:rPr>
-          <w:t>6. Daty istotne dla określenia wartości nieruchomości</w:t>
+          <w:t xml:space="preserve">6. Daty istotne dla określenia wartości {#prawo_wlasnosc}nieruchomości{/prawo_wlasnosc}{#prawo_spoldzielcze}rynkowej{/prawo_spoldzielcze}</w:t>
         </w:r>
         <w:r>
           <w:rPr>
@@ -2463,7 +2473,7 @@
             <w:sz w:val="20"/>
             <w:szCs w:val="20"/>
           </w:rPr>
-          <w:t>7. Źródła danych o nieruchomości</w:t>
+          <w:t xml:space="preserve">7. Źródła danych o {#prawo_wlasnosc}nieruchomości{/prawo_wlasnosc}{#prawo_spoldzielcze}przedmiocie wyceny{/prawo_spoldzielcze}</w:t>
         </w:r>
         <w:r>
           <w:rPr>
@@ -2554,7 +2564,7 @@
             <w:sz w:val="20"/>
             <w:szCs w:val="20"/>
           </w:rPr>
-          <w:t>8. Opis stanu nieruchomości</w:t>
+          <w:t xml:space="preserve">8. Opis stanu {#prawo_wlasnosc}nieruchomości{/prawo_wlasnosc}{#prawo_spoldzielcze}przedmiotu wyceny{/prawo_spoldzielcze}</w:t>
         </w:r>
         <w:r>
           <w:rPr>
@@ -2918,7 +2928,7 @@
             <w:sz w:val="20"/>
             <w:szCs w:val="20"/>
           </w:rPr>
-          <w:t>12. Określenie wartości rynkowej prawa własności nieruchomości lokalowej, wg stanu</w:t>
+          <w:t xml:space="preserve">12. Określenie wartości rynkowej {przedmiot_d}, wg stanu</w:t>
         </w:r>
         <w:r>
           <w:rPr>
@@ -3660,7 +3670,7 @@
           <w:sz w:val="20"/>
           <w:szCs w:val="20"/>
         </w:rPr>
-        <w:t xml:space="preserve">Wyciąg z operatu szacunkowego nieruchomości lokalowej obejmującej lokal mieszkalny wraz z udziałem w nieruchomości wspólnej, którą stanowi prawo własności gruntu oraz części budynku i urządzeń, które nie służą wyłącznie do użytku właścicieli poszczególnych lokali w udziale ujawnionym w księdze wieczystej, położonej pod adresem: {adres}. </w:t>
+        <w:t xml:space="preserve">Wyciąg z operatu szacunkowego {#prawo_wlasnosc}nieruchomości lokalowej obejmującej lokal mieszkalny wraz z udziałem w nieruchomości wspólnej, którą stanowi prawo własności gruntu oraz części budynku i urządzeń, które nie służą wyłącznie do użytku właścicieli poszczególnych lokali w udziale ujawnionym w księdze wieczystej, położonej{/prawo_wlasnosc}{#prawo_spoldzielcze}dotyczącego określenia wartości rynkowej {przedmiot_d}, położonego{/prawo_spoldzielcze} pod adresem: {adres}. </w:t>
       </w:r>
       <w:r>
         <w:rPr>
@@ -3974,7 +3984,7 @@
                 <w:sz w:val="18"/>
                 <w:szCs w:val="18"/>
               </w:rPr>
-              <w:t>Położenie nieruchomości</w:t>
+              <w:t xml:space="preserve">Położenie{#prawo_wlasnosc} nieruchomości{/prawo_wlasnosc}</w:t>
             </w:r>
           </w:p>
         </w:tc>
@@ -4100,7 +4110,7 @@
                 <w:sz w:val="18"/>
                 <w:szCs w:val="18"/>
               </w:rPr>
-              <w:t xml:space="preserve">Nieruchomość lokalowa obejmująca lokal mieszkalny.</w:t>
+              <w:t xml:space="preserve">{#prawo_wlasnosc}Nieruchomość lokalowa obejmująca lokal mieszkalny.{/prawo_wlasnosc}{#prawo_spoldzielcze}Przedmiot wyceny stanowi {przedmiot_m} o powierzchni użytkowej {powierzchnia} m2, położonego pod adresem: {adres}.{/prawo_spoldzielcze}</w:t>
             </w:r>
             <w:r>
               <w:rPr>
@@ -4227,7 +4237,7 @@
                 <w:szCs w:val="18"/>
                 <w:lang w:eastAsia="pl-PL"/>
               </w:rPr>
-              <w:t xml:space="preserve">Określenie wartości rynkowej prawa własności nieruchomości lokalowej wraz z udziałem w nieruchomości wspólnej, którą stanowi prawo własności gruntu oraz części budynku i urządzeń, które nie służą wyłącznie do użytku właścicieli poszczególnych lokali w udziale ujawnionym w księdze wieczystej, wg stanu aktualnego, położonej pod adresem: {adres}.</w:t>
+              <w:t xml:space="preserve">Określenie wartości rynkowej {przedmiot_d}{#prawo_wlasnosc} wraz z udziałem w nieruchomości wspólnej, którą stanowi prawo własności gruntu oraz części budynku i urządzeń, które nie służą wyłącznie do użytku właścicieli poszczególnych lokali w udziale ujawnionym w księdze wieczystej{/prawo_wlasnosc}, wg stanu aktualnego, {#prawo_wlasnosc}położonej{/prawo_wlasnosc}{#prawo_spoldzielcze}położonego{/prawo_spoldzielcze} pod adresem: {adres}.</w:t>
             </w:r>
             <w:r>
               <w:rPr>
@@ -4577,6 +4587,11 @@
             </w:r>
           </w:p>
           <w:p>
+            <w:r>
+              <w:t xml:space="preserve">{#prawo_wlasnosc}</w:t>
+            </w:r>
+          </w:p>
+          <w:p>
             <w:pPr>
               <w:jc w:val="center"/>
               <w:rPr>
@@ -4594,6 +4609,11 @@
                 <w:szCs w:val="18"/>
               </w:rPr>
               <w:t>nieruchomości</w:t>
+            </w:r>
+          </w:p>
+          <w:p>
+            <w:r>
+              <w:t xml:space="preserve">{/prawo_wlasnosc}</w:t>
             </w:r>
           </w:p>
         </w:tc>
@@ -4619,11 +4639,16 @@
                 <w:sz w:val="18"/>
                 <w:szCs w:val="18"/>
               </w:rPr>
-              <w:t xml:space="preserve">{nr_kw}</w:t>
+              <w:t xml:space="preserve">{#ma_kw}{nr_kw}{/ma_kw}{#kw_brak}{klauzula_brak_kw}{/kw_brak}</w:t>
             </w:r>
             <w:bookmarkStart w:id="4" w:name="_Hlk141810221"/>
           </w:p>
           <w:p>
+            <w:r>
+              <w:t xml:space="preserve">{#ma_kw}</w:t>
+            </w:r>
+          </w:p>
+          <w:p>
             <w:pPr>
               <w:rPr>
                 <w:rFonts w:ascii="Segoe UI" w:hAnsi="Segoe UI" w:cs="Segoe UI"/>
@@ -4648,6 +4673,11 @@
                 <w:szCs w:val="18"/>
               </w:rPr>
               <w:t>, V Wydział Ksiąg Wieczystych</w:t>
+            </w:r>
+          </w:p>
+          <w:p>
+            <w:r>
+              <w:t xml:space="preserve">{/ma_kw}</w:t>
             </w:r>
           </w:p>
         </w:tc>
@@ -4678,7 +4708,7 @@
                 <w:sz w:val="18"/>
                 <w:szCs w:val="18"/>
               </w:rPr>
-              <w:t>Własność</w:t>
+              <w:t xml:space="preserve">{#prawo_wlasnosc}Własność</w:t>
             </w:r>
           </w:p>
         </w:tc>
@@ -4707,7 +4737,7 @@
                 <w:sz w:val="18"/>
                 <w:szCs w:val="18"/>
               </w:rPr>
-              <w:t xml:space="preserve">{klient}</w:t>
+              <w:t xml:space="preserve">{klient}{/prawo_wlasnosc}</w:t>
             </w:r>
             <w:r>
               <w:rPr>
@@ -4747,7 +4777,7 @@
                 <w:sz w:val="18"/>
                 <w:szCs w:val="18"/>
               </w:rPr>
-              <w:t>Opis nieruchomości</w:t>
+              <w:t xml:space="preserve">{#prawo_wlasnosc}Opis nieruchomości{/prawo_wlasnosc}{#prawo_spoldzielcze}Opis lokalu mieszkalnego{/prawo_spoldzielcze}</w:t>
             </w:r>
           </w:p>
         </w:tc>
@@ -4927,6 +4957,34 @@
                 <w:szCs w:val="18"/>
               </w:rPr>
               <w:t xml:space="preserve"/>
+            </w:r>
+          </w:p>
+          <w:p>
+            <w:r>
+              <w:t xml:space="preserve">{#ma_piwnice}</w:t>
+            </w:r>
+          </w:p>
+          <w:p>
+            <w:pPr>
+              <w:jc w:val="both"/>
+              <w:rPr>
+                <w:rFonts w:ascii="Segoe UI" w:hAnsi="Segoe UI" w:cs="Segoe UI"/>
+                <w:sz w:val="18"/>
+                <w:szCs w:val="18"/>
+              </w:rPr>
+            </w:pPr>
+            <w:r>
+              <w:rPr>
+                <w:rFonts w:ascii="Segoe UI" w:hAnsi="Segoe UI" w:cs="Segoe UI"/>
+                <w:sz w:val="18"/>
+                <w:szCs w:val="18"/>
+              </w:rPr>
+              <w:t xml:space="preserve">{klauzula_piwnicy}</w:t>
+            </w:r>
+          </w:p>
+          <w:p>
+            <w:r>
+              <w:t xml:space="preserve">{/ma_piwnice}</w:t>
             </w:r>
           </w:p>
         </w:tc>
@@ -4981,7 +5039,7 @@
                 <w:sz w:val="18"/>
                 <w:szCs w:val="18"/>
               </w:rPr>
-              <w:t xml:space="preserve">Określenie wartości rynkowej prawa własności nieruchomości lokalowej o funkcji mieszkalnej, wg stanu aktualnego dla potrzeb {cel}.</w:t>
+              <w:t xml:space="preserve">Określenie wartości rynkowej {przedmiot_d}{#prawo_wlasnosc} o funkcji mieszkalnej{/prawo_wlasnosc}, wg stanu aktualnego dla potrzeb {cel}.</w:t>
             </w:r>
             <w:r>
               <w:rPr>
@@ -5061,7 +5119,7 @@
                 <w:sz w:val="18"/>
                 <w:szCs w:val="18"/>
               </w:rPr>
-              <w:t>Określona wartość rynkowa nieruchomości</w:t>
+              <w:t xml:space="preserve">Określona wartość rynkowa{#prawo_wlasnosc} nieruchomości{/prawo_wlasnosc}</w:t>
             </w:r>
           </w:p>
         </w:tc>
@@ -5086,7 +5144,7 @@
                 <w:sz w:val="18"/>
                 <w:szCs w:val="18"/>
               </w:rPr>
-              <w:t xml:space="preserve">Wartość rynkowa prawa własności nieruchomości lokalowej</w:t>
+              <w:t xml:space="preserve">Wartość rynkowa {przedmiot_d}</w:t>
             </w:r>
             <w:r>
               <w:rPr>
@@ -5119,6 +5177,11 @@
                 <w:szCs w:val="18"/>
               </w:rPr>
               <w:t/>
+            </w:r>
+          </w:p>
+          <w:p>
+            <w:r>
+              <w:t xml:space="preserve">{#prawo_wlasnosc}</w:t>
             </w:r>
           </w:p>
           <w:p>
@@ -5179,6 +5242,11 @@
                 <w:lang w:eastAsia="pl-PL"/>
               </w:rPr>
               <w:t/>
+            </w:r>
+          </w:p>
+          <w:p>
+            <w:r>
+              <w:t xml:space="preserve">{/prawo_wlasnosc}</w:t>
             </w:r>
           </w:p>
           <w:p>
@@ -5216,7 +5284,7 @@
                 <w:sz w:val="18"/>
                 <w:szCs w:val="18"/>
               </w:rPr>
-              <w:t xml:space="preserve">położonej pod adresem: {adres}</w:t>
+              <w:t xml:space="preserve">{#prawo_wlasnosc}położonej{/prawo_wlasnosc}{#prawo_spoldzielcze}położonego{/prawo_spoldzielcze} pod adresem: {adres}</w:t>
             </w:r>
             <w:r>
               <w:rPr>
@@ -5376,7 +5444,7 @@
                 <w:sz w:val="18"/>
                 <w:szCs w:val="18"/>
               </w:rPr>
-              <w:t>Data, na którą określono wartość rynkową nieruchomości:</w:t>
+              <w:t xml:space="preserve">Data, na którą określono wartość rynkową{#prawo_wlasnosc} nieruchomości{/prawo_wlasnosc}:</w:t>
             </w:r>
           </w:p>
           <w:p>
@@ -5420,7 +5488,7 @@
                 <w:sz w:val="18"/>
                 <w:szCs w:val="18"/>
               </w:rPr>
-              <w:t>Data dokonania oględzin nieruchomości:</w:t>
+              <w:t xml:space="preserve">Data dokonania oględzin{#prawo_wlasnosc} nieruchomości{/prawo_wlasnosc}:</w:t>
             </w:r>
           </w:p>
         </w:tc>
@@ -5844,7 +5912,7 @@
           <w:sz w:val="20"/>
           <w:szCs w:val="20"/>
         </w:rPr>
-        <w:t xml:space="preserve">Przedmiot wyceny stanowi prawo własności nieruchomości lokalowej wraz z udziałem w nieruchomości wspólnej, którą stanowi prawo własności gruntu oraz części budynku i urządzeń, które nie służą wyłącznie do użytku właścicieli poszczególnych lokali w udziale ujawnionym w księdze wieczystej, położonej pod adresem: {adres}. </w:t>
+        <w:t xml:space="preserve">Przedmiot wyceny stanowi {przedmiot_m}{#prawo_spoldzielcze} o powierzchni użytkowej {powierzchnia} m2{/prawo_spoldzielcze}{#prawo_wlasnosc} wraz z udziałem w nieruchomości wspólnej, którą stanowi prawo własności gruntu oraz części budynku i urządzeń, które nie służą wyłącznie do użytku właścicieli poszczególnych lokali w udziale ujawnionym w księdze wieczystej{/prawo_wlasnosc}, {#prawo_wlasnosc}położonej{/prawo_wlasnosc}{#prawo_spoldzielcze}położonego{/prawo_spoldzielcze} pod adresem: {adres}. </w:t>
       </w:r>
       <w:r>
         <w:rPr>
@@ -6094,71 +6162,71 @@
           <w:sz w:val="20"/>
           <w:szCs w:val="20"/>
         </w:rPr>
-        <w:t>Dla nieruchomości lokalowej</w:t>
-      </w:r>
-      <w:r>
-        <w:rPr>
-          <w:rFonts w:ascii="Segoe UI" w:hAnsi="Segoe UI" w:cs="Segoe UI"/>
-          <w:sz w:val="20"/>
-          <w:szCs w:val="20"/>
-        </w:rPr>
-        <w:t xml:space="preserve"> o funkcji mieszkalnej </w:t>
-      </w:r>
-      <w:r>
-        <w:rPr>
-          <w:rFonts w:ascii="Segoe UI" w:hAnsi="Segoe UI" w:cs="Segoe UI"/>
-          <w:sz w:val="20"/>
-          <w:szCs w:val="20"/>
-        </w:rPr>
-        <w:t>Sąd Rejonowy Poznań – Stare Miasto w Poznaniu</w:t>
-      </w:r>
-      <w:r>
-        <w:rPr>
-          <w:rFonts w:ascii="Segoe UI" w:hAnsi="Segoe UI" w:cs="Segoe UI"/>
-          <w:sz w:val="20"/>
-          <w:szCs w:val="20"/>
-        </w:rPr>
-        <w:t xml:space="preserve"> </w:t>
-      </w:r>
-      <w:r>
-        <w:rPr>
-          <w:rFonts w:ascii="Segoe UI" w:hAnsi="Segoe UI" w:cs="Segoe UI"/>
-          <w:sz w:val="20"/>
-          <w:szCs w:val="20"/>
-        </w:rPr>
-        <w:t xml:space="preserve">prowadzi </w:t>
-      </w:r>
-      <w:r>
-        <w:rPr>
-          <w:rFonts w:ascii="Segoe UI" w:hAnsi="Segoe UI" w:cs="Segoe UI"/>
-          <w:sz w:val="20"/>
-          <w:szCs w:val="20"/>
-        </w:rPr>
-        <w:t>k</w:t>
-      </w:r>
-      <w:r>
-        <w:rPr>
-          <w:rFonts w:ascii="Segoe UI" w:hAnsi="Segoe UI" w:cs="Segoe UI"/>
-          <w:sz w:val="20"/>
-          <w:szCs w:val="20"/>
-        </w:rPr>
-        <w:t xml:space="preserve">sięgę </w:t>
-      </w:r>
-      <w:r>
-        <w:rPr>
-          <w:rFonts w:ascii="Segoe UI" w:hAnsi="Segoe UI" w:cs="Segoe UI"/>
-          <w:sz w:val="20"/>
-          <w:szCs w:val="20"/>
-        </w:rPr>
-        <w:t>w</w:t>
-      </w:r>
-      <w:r>
-        <w:rPr>
-          <w:rFonts w:ascii="Segoe UI" w:hAnsi="Segoe UI" w:cs="Segoe UI"/>
-          <w:sz w:val="20"/>
-          <w:szCs w:val="20"/>
-        </w:rPr>
-        <w:t xml:space="preserve">ieczystą nr </w:t>
+        <w:t xml:space="preserve">{#ma_kw}Dla {#prawo_wlasnosc}nieruchomości lokalowej o funkcji mieszkalnej{/prawo_wlasnosc}{#prawo_spoldzielcze}lokalu mieszkalnego{/prawo_spoldzielcze} Sąd Rejonowy Poznań – Stare Miasto w Poznaniu prowadzi księgę wieczystą nr {nr_kw}.{/ma_kw}{#kw_brak}{klauzula_brak_kw}{/kw_brak}</w:t>
+      </w:r>
+      <w:r>
+        <w:rPr>
+          <w:rFonts w:ascii="Segoe UI" w:hAnsi="Segoe UI" w:cs="Segoe UI"/>
+          <w:sz w:val="20"/>
+          <w:szCs w:val="20"/>
+        </w:rPr>
+        <w:t xml:space="preserve"/>
+      </w:r>
+      <w:r>
+        <w:rPr>
+          <w:rFonts w:ascii="Segoe UI" w:hAnsi="Segoe UI" w:cs="Segoe UI"/>
+          <w:sz w:val="20"/>
+          <w:szCs w:val="20"/>
+        </w:rPr>
+        <w:t/>
+      </w:r>
+      <w:r>
+        <w:rPr>
+          <w:rFonts w:ascii="Segoe UI" w:hAnsi="Segoe UI" w:cs="Segoe UI"/>
+          <w:sz w:val="20"/>
+          <w:szCs w:val="20"/>
+        </w:rPr>
+        <w:t xml:space="preserve"/>
+      </w:r>
+      <w:r>
+        <w:rPr>
+          <w:rFonts w:ascii="Segoe UI" w:hAnsi="Segoe UI" w:cs="Segoe UI"/>
+          <w:sz w:val="20"/>
+          <w:szCs w:val="20"/>
+        </w:rPr>
+        <w:t xml:space="preserve"/>
+      </w:r>
+      <w:r>
+        <w:rPr>
+          <w:rFonts w:ascii="Segoe UI" w:hAnsi="Segoe UI" w:cs="Segoe UI"/>
+          <w:sz w:val="20"/>
+          <w:szCs w:val="20"/>
+        </w:rPr>
+        <w:t/>
+      </w:r>
+      <w:r>
+        <w:rPr>
+          <w:rFonts w:ascii="Segoe UI" w:hAnsi="Segoe UI" w:cs="Segoe UI"/>
+          <w:sz w:val="20"/>
+          <w:szCs w:val="20"/>
+        </w:rPr>
+        <w:t xml:space="preserve"/>
+      </w:r>
+      <w:r>
+        <w:rPr>
+          <w:rFonts w:ascii="Segoe UI" w:hAnsi="Segoe UI" w:cs="Segoe UI"/>
+          <w:sz w:val="20"/>
+          <w:szCs w:val="20"/>
+        </w:rPr>
+        <w:t/>
+      </w:r>
+      <w:r>
+        <w:rPr>
+          <w:rFonts w:ascii="Segoe UI" w:hAnsi="Segoe UI" w:cs="Segoe UI"/>
+          <w:sz w:val="20"/>
+          <w:szCs w:val="20"/>
+        </w:rPr>
+        <w:t xml:space="preserve"/>
       </w:r>
       <w:r>
         <w:rPr>
@@ -6169,7 +6237,7 @@
           <w:sz w:val="20"/>
           <w:szCs w:val="20"/>
         </w:rPr>
-        <w:t xml:space="preserve">{nr_kw}</w:t>
+        <w:t xml:space="preserve"/>
       </w:r>
       <w:r>
         <w:rPr>
@@ -6178,7 +6246,12 @@
           <w:sz w:val="20"/>
           <w:szCs w:val="20"/>
         </w:rPr>
-        <w:t>.</w:t>
+        <w:t/>
+      </w:r>
+    </w:p>
+    <w:p>
+      <w:r>
+        <w:t xml:space="preserve">{#prawo_wlasnosc}</w:t>
       </w:r>
     </w:p>
     <w:p>
@@ -6261,6 +6334,11 @@
           <w:sz w:val="20"/>
         </w:rPr>
         <w:t/>
+      </w:r>
+    </w:p>
+    <w:p>
+      <w:r>
+        <w:t xml:space="preserve">{/prawo_wlasnosc}</w:t>
       </w:r>
     </w:p>
     <w:p>
@@ -6413,7 +6491,7 @@
           <w:sz w:val="20"/>
           <w:szCs w:val="20"/>
         </w:rPr>
-        <w:t xml:space="preserve">Zakres wyceny obejmuje określenie wartości rynkowej prawa własności nieruchomości lokalowej wraz z udziałem w nieruchomości wspólnej, którą stanowi prawo własności gruntu oraz części budynku i urządzeń, które nie służą wyłącznie do użytku właścicieli poszczególnych lokali w udziale ujawnionym w księdze wieczystej, wg stanu aktualnego, położonej pod adresem: {adres}.</w:t>
+        <w:t xml:space="preserve">Zakres wyceny obejmuje określenie wartości rynkowej {przedmiot_d}{#prawo_wlasnosc} wraz z udziałem w nieruchomości wspólnej, którą stanowi prawo własności gruntu oraz części budynku i urządzeń, które nie służą wyłącznie do użytku właścicieli poszczególnych lokali w udziale ujawnionym w księdze wieczystej{/prawo_wlasnosc}, wg stanu aktualnego, {#prawo_wlasnosc}położonej{/prawo_wlasnosc}{#prawo_spoldzielcze}położonego{/prawo_spoldzielcze} pod adresem: {adres}.</w:t>
       </w:r>
       <w:r>
         <w:rPr>
@@ -6666,7 +6744,7 @@
           <w:sz w:val="20"/>
           <w:szCs w:val="20"/>
         </w:rPr>
-        <w:t xml:space="preserve">Celem wyceny jest określenie wartości rynkowej prawa własności nieruchomości lokalowej o funkcji mieszkalnej, wg stanu aktualnego dla potrzeb {cel}.</w:t>
+        <w:t xml:space="preserve">Celem wyceny jest określenie wartości rynkowej {przedmiot_d}{#prawo_wlasnosc} o funkcji mieszkalnej{/prawo_wlasnosc}, wg stanu aktualnego dla potrzeb {cel}.</w:t>
       </w:r>
       <w:r>
         <w:rPr>
@@ -7154,39 +7232,39 @@
           <w:sz w:val="20"/>
           <w:szCs w:val="20"/>
         </w:rPr>
-        <w:t>Ustawa z dnia 24 czerwca 1994r. o własności lokali (Dz. U. 202</w:t>
-      </w:r>
-      <w:r>
-        <w:rPr>
-          <w:rFonts w:ascii="Segoe UI" w:hAnsi="Segoe UI" w:cs="Segoe UI"/>
-          <w:sz w:val="20"/>
-          <w:szCs w:val="20"/>
-        </w:rPr>
-        <w:t>6</w:t>
-      </w:r>
-      <w:r>
-        <w:rPr>
-          <w:rFonts w:ascii="Segoe UI" w:hAnsi="Segoe UI" w:cs="Segoe UI"/>
-          <w:sz w:val="20"/>
-          <w:szCs w:val="20"/>
-        </w:rPr>
-        <w:t xml:space="preserve">r., poz. </w:t>
-      </w:r>
-      <w:r>
-        <w:rPr>
-          <w:rFonts w:ascii="Segoe UI" w:hAnsi="Segoe UI" w:cs="Segoe UI"/>
-          <w:sz w:val="20"/>
-          <w:szCs w:val="20"/>
-        </w:rPr>
-        <w:t>39</w:t>
-      </w:r>
-      <w:r>
-        <w:rPr>
-          <w:rFonts w:ascii="Segoe UI" w:hAnsi="Segoe UI" w:cs="Segoe UI"/>
-          <w:sz w:val="20"/>
-          <w:szCs w:val="20"/>
-        </w:rPr>
-        <w:t>),</w:t>
+        <w:t xml:space="preserve">{podstawa_prawa},</w:t>
+      </w:r>
+      <w:r>
+        <w:rPr>
+          <w:rFonts w:ascii="Segoe UI" w:hAnsi="Segoe UI" w:cs="Segoe UI"/>
+          <w:sz w:val="20"/>
+          <w:szCs w:val="20"/>
+        </w:rPr>
+        <w:t/>
+      </w:r>
+      <w:r>
+        <w:rPr>
+          <w:rFonts w:ascii="Segoe UI" w:hAnsi="Segoe UI" w:cs="Segoe UI"/>
+          <w:sz w:val="20"/>
+          <w:szCs w:val="20"/>
+        </w:rPr>
+        <w:t xml:space="preserve"/>
+      </w:r>
+      <w:r>
+        <w:rPr>
+          <w:rFonts w:ascii="Segoe UI" w:hAnsi="Segoe UI" w:cs="Segoe UI"/>
+          <w:sz w:val="20"/>
+          <w:szCs w:val="20"/>
+        </w:rPr>
+        <w:t/>
+      </w:r>
+      <w:r>
+        <w:rPr>
+          <w:rFonts w:ascii="Segoe UI" w:hAnsi="Segoe UI" w:cs="Segoe UI"/>
+          <w:sz w:val="20"/>
+          <w:szCs w:val="20"/>
+        </w:rPr>
+        <w:t/>
       </w:r>
     </w:p>
     <w:bookmarkEnd w:id="9"/>
@@ -7271,7 +7349,7 @@
           <w:sz w:val="22"/>
           <w:szCs w:val="22"/>
         </w:rPr>
-        <w:t xml:space="preserve">6. </w:t>
+        <w:t xml:space="preserve">6. Daty istotne dla określenia wartości {#prawo_wlasnosc}nieruchomości{/prawo_wlasnosc}{#prawo_spoldzielcze}rynkowej{/prawo_spoldzielcze}</w:t>
       </w:r>
       <w:r>
         <w:rPr>
@@ -7280,7 +7358,7 @@
           <w:sz w:val="22"/>
           <w:szCs w:val="22"/>
         </w:rPr>
-        <w:t>Daty istotne dla określeni</w:t>
+        <w:t/>
       </w:r>
       <w:r>
         <w:rPr>
@@ -7289,7 +7367,7 @@
           <w:sz w:val="22"/>
           <w:szCs w:val="22"/>
         </w:rPr>
-        <w:t>a</w:t>
+        <w:t/>
       </w:r>
       <w:r>
         <w:rPr>
@@ -7298,7 +7376,7 @@
           <w:sz w:val="22"/>
           <w:szCs w:val="22"/>
         </w:rPr>
-        <w:t xml:space="preserve"> wartości nieruchomości</w:t>
+        <w:t xml:space="preserve"/>
       </w:r>
       <w:bookmarkEnd w:id="11"/>
     </w:p>
@@ -7440,7 +7518,7 @@
           <w:sz w:val="20"/>
           <w:szCs w:val="20"/>
         </w:rPr>
-        <w:t>nieruchomości</w:t>
+        <w:t>{#prawo_wlasnosc}nieruchomości{/prawo_wlasnosc}</w:t>
       </w:r>
       <w:r>
         <w:rPr>
@@ -7502,7 +7580,7 @@
           <w:sz w:val="20"/>
           <w:szCs w:val="20"/>
         </w:rPr>
-        <w:t>Data dokonania oględzin nieruchomości</w:t>
+        <w:t xml:space="preserve">Data dokonania oględzin{#prawo_wlasnosc} nieruchomości{/prawo_wlasnosc}</w:t>
       </w:r>
       <w:r>
         <w:rPr>
@@ -7672,7 +7750,7 @@
           <w:sz w:val="22"/>
           <w:szCs w:val="22"/>
         </w:rPr>
-        <w:t>Źródła danych o nieruchomości</w:t>
+        <w:t xml:space="preserve">Źródła danych o {#prawo_wlasnosc}nieruchomości{/prawo_wlasnosc}{#prawo_spoldzielcze}przedmiocie wyceny{/prawo_spoldzielcze}</w:t>
       </w:r>
       <w:bookmarkEnd w:id="13"/>
     </w:p>
@@ -7723,6 +7801,11 @@
       </w:r>
     </w:p>
     <w:p>
+      <w:r>
+        <w:t xml:space="preserve">{#prawo_wlasnosc}</w:t>
+      </w:r>
+    </w:p>
+    <w:p>
       <w:pPr>
         <w:pStyle w:val="Akapitzlist"/>
         <w:numPr>
@@ -7850,6 +7933,11 @@
           <w:szCs w:val="20"/>
         </w:rPr>
         <w:t/>
+      </w:r>
+    </w:p>
+    <w:p>
+      <w:r>
+        <w:t xml:space="preserve">{/prawo_wlasnosc}</w:t>
       </w:r>
     </w:p>
     <w:p>
@@ -7922,6 +8010,11 @@
       </w:r>
     </w:p>
     <w:p>
+      <w:r>
+        <w:t xml:space="preserve">{#prawo_wlasnosc}</w:t>
+      </w:r>
+    </w:p>
+    <w:p>
       <w:pPr>
         <w:pStyle w:val="Akapitzlist"/>
         <w:numPr>
@@ -7951,6 +8044,11 @@
       </w:r>
     </w:p>
     <w:p>
+      <w:r>
+        <w:t xml:space="preserve">{/prawo_wlasnosc}</w:t>
+      </w:r>
+    </w:p>
+    <w:p>
       <w:pPr>
         <w:pStyle w:val="Akapitzlist"/>
         <w:numPr>
@@ -8029,103 +8127,103 @@
           <w:sz w:val="20"/>
           <w:szCs w:val="20"/>
         </w:rPr>
-        <w:t>A</w:t>
-      </w:r>
-      <w:r>
-        <w:rPr>
-          <w:rFonts w:ascii="Segoe UI" w:hAnsi="Segoe UI" w:cs="Segoe UI"/>
-          <w:sz w:val="20"/>
-          <w:szCs w:val="20"/>
-        </w:rPr>
-        <w:t xml:space="preserve">naliza zbioru danych rejestru cen i wartości prowadzonego </w:t>
-      </w:r>
-      <w:r>
-        <w:rPr>
-          <w:rFonts w:ascii="Segoe UI" w:hAnsi="Segoe UI" w:cs="Segoe UI"/>
-          <w:sz w:val="20"/>
-          <w:szCs w:val="20"/>
-        </w:rPr>
-        <w:t>na podstawie własnej bazy</w:t>
-      </w:r>
-      <w:r>
-        <w:rPr>
-          <w:rFonts w:ascii="Segoe UI" w:hAnsi="Segoe UI" w:cs="Segoe UI"/>
-          <w:sz w:val="20"/>
-          <w:szCs w:val="20"/>
-        </w:rPr>
-        <w:t xml:space="preserve"> danych rzeczoznawców majątkowych, informacje o ruchu cen na lokalnym rynku nieruchomości będące w Bazie Danych Rzeczoznawcy Majątkowego</w:t>
-      </w:r>
-      <w:r>
-        <w:rPr>
-          <w:rFonts w:ascii="Segoe UI" w:hAnsi="Segoe UI" w:cs="Segoe UI"/>
-          <w:sz w:val="20"/>
-          <w:szCs w:val="20"/>
-        </w:rPr>
-        <w:t xml:space="preserve"> oraz pozyskane</w:t>
-      </w:r>
-      <w:r>
-        <w:rPr>
-          <w:rFonts w:ascii="Segoe UI" w:hAnsi="Segoe UI" w:cs="Segoe UI"/>
-          <w:sz w:val="20"/>
-          <w:szCs w:val="20"/>
-        </w:rPr>
-        <w:t xml:space="preserve"> </w:t>
-      </w:r>
-      <w:r>
-        <w:rPr>
-          <w:rFonts w:ascii="Segoe UI" w:hAnsi="Segoe UI" w:cs="Segoe UI"/>
-          <w:sz w:val="20"/>
-          <w:szCs w:val="20"/>
-        </w:rPr>
-        <w:t>z</w:t>
-      </w:r>
-      <w:r>
-        <w:rPr>
-          <w:rFonts w:ascii="Segoe UI" w:hAnsi="Segoe UI" w:cs="Segoe UI"/>
-          <w:sz w:val="20"/>
-          <w:szCs w:val="20"/>
-        </w:rPr>
-        <w:t xml:space="preserve"> </w:t>
-      </w:r>
-      <w:r>
-        <w:rPr>
-          <w:rFonts w:ascii="Segoe UI" w:hAnsi="Segoe UI" w:cs="Segoe UI"/>
-          <w:sz w:val="20"/>
-          <w:szCs w:val="20"/>
-        </w:rPr>
-        <w:t xml:space="preserve">Zarządu </w:t>
-      </w:r>
-      <w:r>
-        <w:rPr>
-          <w:rFonts w:ascii="Segoe UI" w:hAnsi="Segoe UI" w:cs="Segoe UI"/>
-          <w:sz w:val="20"/>
-          <w:szCs w:val="20"/>
-        </w:rPr>
-        <w:t>Geodezji</w:t>
-      </w:r>
-      <w:r>
-        <w:rPr>
-          <w:rFonts w:ascii="Segoe UI" w:hAnsi="Segoe UI" w:cs="Segoe UI"/>
-          <w:sz w:val="20"/>
-          <w:szCs w:val="20"/>
-        </w:rPr>
-        <w:t xml:space="preserve"> </w:t>
-      </w:r>
-      <w:r>
-        <w:rPr>
-          <w:rFonts w:ascii="Segoe UI" w:hAnsi="Segoe UI" w:cs="Segoe UI"/>
-          <w:sz w:val="20"/>
-          <w:szCs w:val="20"/>
-        </w:rPr>
-        <w:t>i Katastru Miejskiego GEOPOZ w Poznaniu</w:t>
-      </w:r>
-      <w:r>
-        <w:rPr>
-          <w:rFonts w:ascii="Segoe UI" w:hAnsi="Segoe UI" w:cs="Segoe UI"/>
-          <w:sz w:val="20"/>
-          <w:szCs w:val="20"/>
-        </w:rPr>
-        <w:t>,</w:t>
+        <w:t xml:space="preserve">Analiza zbioru danych rejestru cen i wartości prowadzonego na podstawie własnej bazy danych rzeczoznawców majątkowych, informacje o ruchu cen na lokalnym rynku nieruchomości będące w Bazie Danych Rzeczoznawcy Majątkowego {#prawo_wlasnosc}oraz pozyskane z Zarządu Geodezji i Katastru Miejskiego GEOPOZ w Poznaniu{/prawo_wlasnosc}{#prawo_spoldzielcze}oraz pozyskane ze spółdzielni mieszkaniowej{/prawo_spoldzielcze},</w:t>
+      </w:r>
+      <w:r>
+        <w:rPr>
+          <w:rFonts w:ascii="Segoe UI" w:hAnsi="Segoe UI" w:cs="Segoe UI"/>
+          <w:sz w:val="20"/>
+          <w:szCs w:val="20"/>
+        </w:rPr>
+        <w:t xml:space="preserve"/>
+      </w:r>
+      <w:r>
+        <w:rPr>
+          <w:rFonts w:ascii="Segoe UI" w:hAnsi="Segoe UI" w:cs="Segoe UI"/>
+          <w:sz w:val="20"/>
+          <w:szCs w:val="20"/>
+        </w:rPr>
+        <w:t/>
+      </w:r>
+      <w:r>
+        <w:rPr>
+          <w:rFonts w:ascii="Segoe UI" w:hAnsi="Segoe UI" w:cs="Segoe UI"/>
+          <w:sz w:val="20"/>
+          <w:szCs w:val="20"/>
+        </w:rPr>
+        <w:t xml:space="preserve"/>
+      </w:r>
+      <w:r>
+        <w:rPr>
+          <w:rFonts w:ascii="Segoe UI" w:hAnsi="Segoe UI" w:cs="Segoe UI"/>
+          <w:sz w:val="20"/>
+          <w:szCs w:val="20"/>
+        </w:rPr>
+        <w:t xml:space="preserve"/>
+      </w:r>
+      <w:r>
+        <w:rPr>
+          <w:rFonts w:ascii="Segoe UI" w:hAnsi="Segoe UI" w:cs="Segoe UI"/>
+          <w:sz w:val="20"/>
+          <w:szCs w:val="20"/>
+        </w:rPr>
+        <w:t xml:space="preserve"/>
+      </w:r>
+      <w:r>
+        <w:rPr>
+          <w:rFonts w:ascii="Segoe UI" w:hAnsi="Segoe UI" w:cs="Segoe UI"/>
+          <w:sz w:val="20"/>
+          <w:szCs w:val="20"/>
+        </w:rPr>
+        <w:t/>
+      </w:r>
+      <w:r>
+        <w:rPr>
+          <w:rFonts w:ascii="Segoe UI" w:hAnsi="Segoe UI" w:cs="Segoe UI"/>
+          <w:sz w:val="20"/>
+          <w:szCs w:val="20"/>
+        </w:rPr>
+        <w:t xml:space="preserve"/>
+      </w:r>
+      <w:r>
+        <w:rPr>
+          <w:rFonts w:ascii="Segoe UI" w:hAnsi="Segoe UI" w:cs="Segoe UI"/>
+          <w:sz w:val="20"/>
+          <w:szCs w:val="20"/>
+        </w:rPr>
+        <w:t xml:space="preserve"/>
+      </w:r>
+      <w:r>
+        <w:rPr>
+          <w:rFonts w:ascii="Segoe UI" w:hAnsi="Segoe UI" w:cs="Segoe UI"/>
+          <w:sz w:val="20"/>
+          <w:szCs w:val="20"/>
+        </w:rPr>
+        <w:t/>
+      </w:r>
+      <w:r>
+        <w:rPr>
+          <w:rFonts w:ascii="Segoe UI" w:hAnsi="Segoe UI" w:cs="Segoe UI"/>
+          <w:sz w:val="20"/>
+          <w:szCs w:val="20"/>
+        </w:rPr>
+        <w:t xml:space="preserve"/>
+      </w:r>
+      <w:r>
+        <w:rPr>
+          <w:rFonts w:ascii="Segoe UI" w:hAnsi="Segoe UI" w:cs="Segoe UI"/>
+          <w:sz w:val="20"/>
+          <w:szCs w:val="20"/>
+        </w:rPr>
+        <w:t/>
+      </w:r>
+      <w:r>
+        <w:rPr>
+          <w:rFonts w:ascii="Segoe UI" w:hAnsi="Segoe UI" w:cs="Segoe UI"/>
+          <w:sz w:val="20"/>
+          <w:szCs w:val="20"/>
+        </w:rPr>
+        <w:t/>
       </w:r>
     </w:p>
     <w:p>
@@ -8202,7 +8300,7 @@
           <w:sz w:val="22"/>
           <w:szCs w:val="22"/>
         </w:rPr>
-        <w:t>Opis stanu nieruchomości</w:t>
+        <w:t xml:space="preserve">Opis stanu {#prawo_wlasnosc}nieruchomości{/prawo_wlasnosc}{#prawo_spoldzielcze}przedmiotu wyceny{/prawo_spoldzielcze}</w:t>
       </w:r>
       <w:bookmarkEnd w:id="15"/>
     </w:p>
@@ -9492,7 +9590,7 @@
     </w:p>
     <w:p>
       <w:r>
-        <w:t xml:space="preserve">Oznaczenie księgi wieczystej: {nr_kw}. {#kw_stub_odpis}Pełna treść odpisu KW pozostaje w dokumentacji źródłowej rzeczoznawcy.{/kw_stub_odpis}</w:t>
+        <w:t xml:space="preserve">{#ma_kw}Oznaczenie księgi wieczystej: {nr_kw}. {#kw_stub_odpis}Pełna treść odpisu KW pozostaje w dokumentacji źródłowej rzeczoznawcy.{/kw_stub_odpis}{/ma_kw}{#kw_brak}{klauzula_brak_kw}{/kw_brak}</w:t>
       </w:r>
     </w:p>
     <w:p>
@@ -9502,7 +9600,7 @@
     </w:p>
     <w:p>
       <w:r>
-        <w:t xml:space="preserve">{#kw_standard}Księga wieczysta lokalu: {kw_lokalu}. Księga wieczysta gruntu: {kw_gruntu}.{/kw_standard}</w:t>
+        <w:t xml:space="preserve">{#kw_standard}Księga wieczysta lokalu: {kw_lokalu}.{#prawo_wlasnosc} Księga wieczysta gruntu: {kw_gruntu}.{/prawo_wlasnosc}{/kw_standard}</w:t>
       </w:r>
     </w:p>
     <w:p>
@@ -9552,7 +9650,17 @@
     </w:p>
     <w:p>
       <w:r>
+        <w:t xml:space="preserve">{#prawo_wlasnosc}</w:t>
+      </w:r>
+    </w:p>
+    <w:p>
+      <w:r>
         <w:t xml:space="preserve">Udział w nieruchomości wspólnej: {udzial_kw}.</w:t>
+      </w:r>
+    </w:p>
+    <w:p>
+      <w:r>
+        <w:t xml:space="preserve">{/prawo_wlasnosc}</w:t>
       </w:r>
     </w:p>
     <w:p>
@@ -9706,7 +9814,7 @@
           <w:sz w:val="20"/>
           <w:szCs w:val="20"/>
         </w:rPr>
-        <w:t xml:space="preserve">Budynek mieszkalny wielorodzinny, w którym znajduje się przedmiotowa nieruchomość lokalowa, zlokalizowany jest pod adresem: {adres}.</w:t>
+        <w:t xml:space="preserve">Budynek mieszkalny wielorodzinny, w którym znajduje się {#prawo_wlasnosc}przedmiotowa nieruchomość lokalowa{/prawo_wlasnosc}{#prawo_spoldzielcze}przedmiotowy lokal mieszkalny{/prawo_spoldzielcze}, zlokalizowany jest pod adresem: {adres}.</w:t>
       </w:r>
       <w:r>
         <w:rPr>
@@ -10472,6 +10580,26 @@
       </w:r>
     </w:p>
     <w:p>
+      <w:r>
+        <w:t xml:space="preserve">{#ma_piwnice}</w:t>
+      </w:r>
+    </w:p>
+    <w:p>
+      <w:r>
+        <w:rPr>
+          <w:rFonts w:ascii="Segoe UI" w:hAnsi="Segoe UI" w:cs="Segoe UI"/>
+          <w:sz w:val="20"/>
+          <w:szCs w:val="20"/>
+        </w:rPr>
+        <w:t xml:space="preserve">{klauzula_piwnicy}</w:t>
+      </w:r>
+    </w:p>
+    <w:p>
+      <w:r>
+        <w:t xml:space="preserve">{/ma_piwnice}</w:t>
+      </w:r>
+    </w:p>
+    <w:p>
       <w:pPr>
         <w:pStyle w:val="Akapitzlist"/>
         <w:spacing w:line="276" w:lineRule="auto"/>
@@ -10539,7 +10667,7 @@
           <w:sz w:val="20"/>
           <w:szCs w:val="20"/>
         </w:rPr>
-        <w:t xml:space="preserve">Przedmiotowa nieruchomość lokalowa zlokalizowana jest pod adresem: {adres}. {proza_zagospodarowanie}</w:t>
+        <w:t xml:space="preserve">{#prawo_wlasnosc}Przedmiotowa nieruchomość lokalowa zlokalizowana jest{/prawo_wlasnosc}{#prawo_spoldzielcze}Przedmiotowy lokal mieszkalny zlokalizowany jest{/prawo_spoldzielcze} pod adresem: {adres}. {proza_zagospodarowanie}</w:t>
       </w:r>
       <w:r>
         <w:rPr>
@@ -12276,7 +12404,7 @@
           <w:szCs w:val="20"/>
           <w:u w:val="single"/>
         </w:rPr>
-        <w:t xml:space="preserve">Dla określenia wartości rynkowej prawa własności nieruchomości lokalowej o funkcji mieszkalnej, zastosowano podejście porównawcze, metodę </w:t>
+        <w:t xml:space="preserve">Dla określenia wartości rynkowej {przedmiot_d}{#prawo_wlasnosc} o funkcji mieszkalnej{/prawo_wlasnosc}, zastosowano podejście porównawcze, metodę </w:t>
       </w:r>
       <w:r>
         <w:rPr>
@@ -13268,6 +13396,11 @@
       </w:r>
     </w:p>
     <w:p>
+      <w:r>
+        <w:t xml:space="preserve">{#prawo_wlasnosc}</w:t>
+      </w:r>
+    </w:p>
+    <w:p>
       <w:pPr>
         <w:numPr>
           <w:ilvl w:val="0"/>
@@ -13289,6 +13422,11 @@
           <w:szCs w:val="20"/>
         </w:rPr>
         <w:t>Do porównań przyjęto nieruchomości będące przedmiotem prawa własności.</w:t>
+      </w:r>
+    </w:p>
+    <w:p>
+      <w:r>
+        <w:t xml:space="preserve">{/prawo_wlasnosc}</w:t>
       </w:r>
     </w:p>
     <w:p>
@@ -13708,7 +13846,7 @@
           <w:sz w:val="22"/>
           <w:szCs w:val="22"/>
         </w:rPr>
-        <w:t>prawa własności nieruchomości lokalowej</w:t>
+        <w:t xml:space="preserve">{przedmiot_d}</w:t>
       </w:r>
       <w:bookmarkEnd w:id="62"/>
       <w:r>
@@ -13797,7 +13935,7 @@
           <w:sz w:val="20"/>
           <w:szCs w:val="20"/>
         </w:rPr>
-        <w:t xml:space="preserve">Na podstawie analizy transakcji lokali o funkcji mieszkalnej będących przedmiotem prawa własności, wskazano najważniejsze czynniki, które kształtują ich wartość. Cechy różniące występujące w zebranej próbie, a mogące mieć wpływ na ich cenę, to: {cechy_lista}.</w:t>
+        <w:t xml:space="preserve">Na podstawie analizy transakcji {#prawo_wlasnosc}lokali o funkcji mieszkalnej będących przedmiotem prawa własności{/prawo_wlasnosc}{#prawo_spoldzielcze}lokali mieszkalnych{/prawo_spoldzielcze}, wskazano najważniejsze czynniki, które kształtują ich wartość. Cechy różniące występujące w zebranej próbie, a mogące mieć wpływ na ich cenę, to: {cechy_lista}.</w:t>
       </w:r>
       <w:r>
         <w:rPr>
@@ -16982,7 +17120,7 @@
           <w:sz w:val="22"/>
           <w:szCs w:val="22"/>
         </w:rPr>
-        <w:t>prawa własności nieruchomości lokalowej</w:t>
+        <w:t xml:space="preserve">{przedmiot_d}</w:t>
       </w:r>
     </w:p>
     <w:p>
@@ -17409,7 +17547,7 @@
           <w:sz w:val="18"/>
           <w:szCs w:val="18"/>
         </w:rPr>
-        <w:t>prawa własności nieruchomości lokalowej o funkcji mieszkalnej</w:t>
+        <w:t xml:space="preserve">{przedmiot_d}{#prawo_wlasnosc} o funkcji mieszkalnej{/prawo_wlasnosc}</w:t>
       </w:r>
     </w:p>
     <w:tbl>
@@ -17820,7 +17958,7 @@
                 <w:sz w:val="18"/>
                 <w:szCs w:val="18"/>
               </w:rPr>
-              <w:t>prawa własności nieruchomości lokalowej</w:t>
+              <w:t xml:space="preserve">{przedmiot_d}</w:t>
             </w:r>
             <w:r>
               <w:rPr>
@@ -17921,7 +18059,7 @@
                 <w:sz w:val="18"/>
                 <w:szCs w:val="18"/>
               </w:rPr>
-              <w:t xml:space="preserve">prawa własności nieruchomości lokalowej </w:t>
+              <w:t xml:space="preserve">{przedmiot_d} </w:t>
             </w:r>
             <w:r>
               <w:rPr>
@@ -18372,7 +18510,7 @@
           <w:szCs w:val="20"/>
         </w:rPr>
         <w:lastRenderedPageBreak/>
-        <w:t xml:space="preserve">W procesie wyceny określono wartość rynkową prawa własności nieruchomości lokalowej wraz z udziałem w nieruchomości wspólnej, którą stanowi prawo własności gruntu oraz części budynku i urządzeń, które nie służą wyłącznie do użytku właścicieli poszczególnych lokali w udziale ujawnionym w księdze wieczystej, wg stanu aktualnego, położonej pod adresem: {adres}.</w:t>
+        <w:t xml:space="preserve">W procesie wyceny określono wartość rynkową {przedmiot_d}{#prawo_wlasnosc} wraz z udziałem w nieruchomości wspólnej, którą stanowi prawo własności gruntu oraz części budynku i urządzeń, które nie służą wyłącznie do użytku właścicieli poszczególnych lokali w udziale ujawnionym w księdze wieczystej{/prawo_wlasnosc}, wg stanu aktualnego, {#prawo_wlasnosc}położonej{/prawo_wlasnosc}{#prawo_spoldzielcze}położonego{/prawo_spoldzielcze} pod adresem: {adres}.</w:t>
       </w:r>
       <w:r>
         <w:rPr>

</xml_diff>